<commit_message>
refactor(actividad-4): separar entornos de trabajo en Typst (PDF) y Quarto (Word)
</commit_message>
<xml_diff>
--- a/Entregables/Actividad 4/2_Word_Quarto/Actividad 4 - Investigacion Modernizacion Nacion Neuquen.docx
+++ b/Entregables/Actividad 4/2_Word_Quarto/Actividad 4 - Investigacion Modernizacion Nacion Neuquen.docx
@@ -5,7 +5,6 @@
     <w:p>
       <w:pPr>
         <w:pStyle w:val="Figure"/>
-        <w:jc w:val="center"/>
       </w:pPr>
       <w:r>
         <w:drawing>
@@ -17,7 +16,7 @@
               <a:graphicData uri="http://schemas.openxmlformats.org/drawingml/2006/picture">
                 <pic:pic>
                   <pic:nvPicPr>
-                    <pic:cNvPr descr="../../Logotipo%20de%20curzas/CURZAS.png" id="23" name="Picture"/>
+                    <pic:cNvPr descr="../../../Logotipo%20de%20curzas/CURZAS.png" id="23" name="Picture"/>
                     <pic:cNvPicPr>
                       <a:picLocks noChangeArrowheads="1" noChangeAspect="1"/>
                     </pic:cNvPicPr>
@@ -365,16 +364,9 @@
       </w:tr>
     </w:tbl>
     <w:p>
-      <w:pPr>
-        <w:sectPr>
-          <w:headerReference w:type="default" r:id="rId1"/>
-          <w:footerReference w:type="default" r:id="rId2"/>
-          <w:type w:val="nextPage"/>
-          <w:pgSz w:w="12240" w:h="15840"/>
-          <w:pgMar w:top="1440" w:right="1440" w:bottom="1440" w:left="1440" w:header="720" w:footer="720"/>
-        </w:sectPr>
-      </w:pPr>
-      <w:r/>
+      <w:r>
+        <w:br w:type="page"/>
+      </w:r>
     </w:p>
     <w:bookmarkStart w:id="27" w:name="índice-general"/>
     <w:p>
@@ -1843,20 +1835,6 @@
         <w:tblW w:type="pct" w:w="5000"/>
         <w:tblLayout w:type="fixed"/>
         <w:tblLook w:firstRow="1" w:lastRow="0" w:firstColumn="0" w:lastColumn="0" w:noHBand="0" w:noVBand="0" w:val="0020"/>
-        <w:tblBorders>
-          <w:top w:val="single" w:sz="12" w:space="0" w:color="153E5C"/>
-          <w:left w:val="none"/>
-          <w:bottom w:val="single" w:sz="12" w:space="0" w:color="153E5C"/>
-          <w:right w:val="none"/>
-          <w:insideH w:val="single" w:sz="4" w:space="0" w:color="E2E8F0"/>
-          <w:insideV w:val="none"/>
-        </w:tblBorders>
-        <w:tblCellMar>
-          <w:top w:w="120" w:type="dxa"/>
-          <w:left w:w="140" w:type="dxa"/>
-          <w:bottom w:w="120" w:type="dxa"/>
-          <w:right w:w="140" w:type="dxa"/>
-        </w:tblCellMar>
       </w:tblPr>
       <w:tblGrid>
         <w:gridCol w:w="2640"/>
@@ -1866,589 +1844,355 @@
       <w:tr>
         <w:trPr>
           <w:tblHeader w:val="on"/>
-          <w:cantSplit/>
-          <w:tblHeader/>
         </w:trPr>
         <w:tc>
-          <w:tcPr>
-            <w:tcW w:w="2400" w:type="dxa"/>
-            <w:shd w:val="clear" w:color="auto" w:fill="153E5C"/>
-          </w:tcPr>
-          <w:p>
-            <w:pPr>
-              <w:pStyle w:val="Compact"/>
-              <w:jc w:val="center"/>
-            </w:pPr>
-            <w:r>
-              <w:rPr>
-                <w:rFonts w:ascii="Arial" w:hAnsi="Arial"/>
-                <w:b/>
-                <w:color w:val="FFFFFF"/>
-                <w:sz w:val="19"/>
-              </w:rPr>
-              <w:t xml:space="preserve">Dimensión de Análisis</w:t>
-            </w:r>
-          </w:p>
-        </w:tc>
-        <w:tc>
-          <w:tcPr>
-            <w:tcW w:w="3480" w:type="dxa"/>
-            <w:shd w:val="clear" w:color="auto" w:fill="153E5C"/>
-          </w:tcPr>
+          <w:tcPr/>
           <w:p>
             <w:pPr>
               <w:pStyle w:val="Compact"/>
               <w:jc w:val="left"/>
             </w:pPr>
             <w:r>
-              <w:rPr>
-                <w:rFonts w:ascii="Arial" w:hAnsi="Arial"/>
-                <w:b/>
-                <w:color w:val="FFFFFF"/>
-                <w:sz w:val="19"/>
-              </w:rPr>
-              <w:t xml:space="preserve">Nivel Nacional (INAP · Nación)</w:t>
+              <w:t xml:space="preserve">Dimensión de Análisis</w:t>
             </w:r>
           </w:p>
         </w:tc>
         <w:tc>
-          <w:tcPr>
-            <w:tcW w:w="3480" w:type="dxa"/>
-            <w:shd w:val="clear" w:color="auto" w:fill="153E5C"/>
-          </w:tcPr>
+          <w:tcPr/>
           <w:p>
             <w:pPr>
               <w:pStyle w:val="Compact"/>
               <w:jc w:val="left"/>
             </w:pPr>
             <w:r>
-              <w:rPr>
-                <w:rFonts w:ascii="Arial" w:hAnsi="Arial"/>
-                <w:b/>
-                <w:color w:val="FFFFFF"/>
-                <w:sz w:val="19"/>
-              </w:rPr>
+              <w:t xml:space="preserve">Nivel Nacional (INAP · Nación)</w:t>
+            </w:r>
+          </w:p>
+        </w:tc>
+        <w:tc>
+          <w:tcPr/>
+          <w:p>
+            <w:pPr>
+              <w:pStyle w:val="Compact"/>
+              <w:jc w:val="left"/>
+            </w:pPr>
+            <w:r>
               <w:t xml:space="preserve">Jurisdicción Local (Neuquén Capital)</w:t>
             </w:r>
           </w:p>
         </w:tc>
       </w:tr>
       <w:tr>
-        <w:trPr>
-          <w:cantSplit/>
-        </w:trPr>
         <w:tc>
-          <w:tcPr>
-            <w:tcW w:w="2400" w:type="dxa"/>
-          </w:tcPr>
+          <w:tcPr/>
           <w:p>
             <w:pPr>
               <w:pStyle w:val="Compact"/>
-              <w:spacing w:line="276" w:lineRule="auto" w:after="40" w:before="40"/>
               <w:jc w:val="left"/>
             </w:pPr>
             <w:r>
               <w:rPr>
-                <w:rFonts w:ascii="Arial" w:hAnsi="Arial"/>
                 <w:b/>
                 <w:bCs/>
-                <w:color w:val="153E5C"/>
-                <w:sz w:val="18"/>
               </w:rPr>
               <w:t xml:space="preserve">Nivel de Gobierno y Misión</w:t>
             </w:r>
           </w:p>
         </w:tc>
         <w:tc>
-          <w:tcPr>
-            <w:tcW w:w="3480" w:type="dxa"/>
-          </w:tcPr>
+          <w:tcPr/>
           <w:p>
             <w:pPr>
               <w:pStyle w:val="Compact"/>
-              <w:spacing w:line="276" w:lineRule="auto" w:after="40" w:before="40"/>
               <w:jc w:val="left"/>
             </w:pPr>
             <w:r>
-              <w:rPr>
-                <w:rFonts w:ascii="Arial" w:hAnsi="Arial"/>
-                <w:color w:val="2D3748"/>
-                <w:sz w:val="17"/>
-              </w:rPr>
               <w:t xml:space="preserve">Nivel federal. Diseña lineamientos, marcos rectores, indicadores estadísticos e investigación de políticas públicas para la Administración Pública Nacional (APN).</w:t>
             </w:r>
           </w:p>
         </w:tc>
         <w:tc>
-          <w:tcPr>
-            <w:tcW w:w="3480" w:type="dxa"/>
-          </w:tcPr>
+          <w:tcPr/>
           <w:p>
             <w:pPr>
               <w:pStyle w:val="Compact"/>
-              <w:spacing w:line="276" w:lineRule="auto" w:after="40" w:before="40"/>
               <w:jc w:val="left"/>
             </w:pPr>
             <w:r>
-              <w:rPr>
-                <w:rFonts w:ascii="Arial" w:hAnsi="Arial"/>
-                <w:color w:val="2D3748"/>
-                <w:sz w:val="17"/>
-              </w:rPr>
               <w:t xml:space="preserve">Nivel municipal / subnacional. Ejecución directa, prestación de servicios de cercanía, infraestructura urbana y resolución de problemas cotidianos de la ciudadanía.</w:t>
             </w:r>
           </w:p>
         </w:tc>
       </w:tr>
       <w:tr>
-        <w:trPr>
-          <w:cantSplit/>
-        </w:trPr>
         <w:tc>
-          <w:tcPr>
-            <w:tcW w:w="2400" w:type="dxa"/>
-            <w:shd w:val="clear" w:color="auto" w:fill="F8FAFC"/>
-          </w:tcPr>
+          <w:tcPr/>
           <w:p>
             <w:pPr>
               <w:pStyle w:val="Compact"/>
-              <w:spacing w:line="276" w:lineRule="auto" w:after="40" w:before="40"/>
               <w:jc w:val="left"/>
             </w:pPr>
             <w:r>
               <w:rPr>
-                <w:rFonts w:ascii="Arial" w:hAnsi="Arial"/>
                 <w:b/>
                 <w:bCs/>
-                <w:color w:val="153E5C"/>
-                <w:sz w:val="18"/>
               </w:rPr>
               <w:t xml:space="preserve">Enfoque del Portal Web</w:t>
             </w:r>
           </w:p>
         </w:tc>
         <w:tc>
-          <w:tcPr>
-            <w:tcW w:w="3480" w:type="dxa"/>
-            <w:shd w:val="clear" w:color="auto" w:fill="F8FAFC"/>
-          </w:tcPr>
+          <w:tcPr/>
           <w:p>
             <w:pPr>
               <w:pStyle w:val="Compact"/>
-              <w:spacing w:line="276" w:lineRule="auto" w:after="40" w:before="40"/>
               <w:jc w:val="left"/>
             </w:pPr>
             <w:r>
-              <w:rPr>
-                <w:rFonts w:ascii="Arial" w:hAnsi="Arial"/>
-                <w:color w:val="2D3748"/>
-                <w:sz w:val="17"/>
-              </w:rPr>
               <w:t xml:space="preserve">Observatorio analítico y conceptual. Centrado en la generación de conocimiento, publicaciones académicas y propuestas de medición institucional.</w:t>
             </w:r>
           </w:p>
         </w:tc>
         <w:tc>
-          <w:tcPr>
-            <w:tcW w:w="3480" w:type="dxa"/>
-            <w:shd w:val="clear" w:color="auto" w:fill="F8FAFC"/>
-          </w:tcPr>
+          <w:tcPr/>
           <w:p>
             <w:pPr>
               <w:pStyle w:val="Compact"/>
-              <w:spacing w:line="276" w:lineRule="auto" w:after="40" w:before="40"/>
               <w:jc w:val="left"/>
             </w:pPr>
             <w:r>
-              <w:rPr>
-                <w:rFonts w:ascii="Arial" w:hAnsi="Arial"/>
-                <w:color w:val="2D3748"/>
-                <w:sz w:val="17"/>
-              </w:rPr>
               <w:t xml:space="preserve">Portal operativo y transaccional. Centrado en la ventanilla única virtual (</w:t>
             </w:r>
             <w:r>
               <w:rPr>
                 <w:rStyle w:val="VerbatimChar"/>
-                <w:rFonts w:ascii="Arial" w:hAnsi="Arial"/>
-                <w:color w:val="2D3748"/>
-                <w:sz w:val="17"/>
               </w:rPr>
               <w:t xml:space="preserve">WebLogin</w:t>
             </w:r>
             <w:r>
-              <w:rPr>
-                <w:rFonts w:ascii="Arial" w:hAnsi="Arial"/>
-                <w:color w:val="2D3748"/>
-                <w:sz w:val="17"/>
-              </w:rPr>
               <w:t xml:space="preserve">), turnero digital y mapa de servicios en territorio.</w:t>
             </w:r>
           </w:p>
         </w:tc>
       </w:tr>
       <w:tr>
-        <w:trPr>
-          <w:cantSplit/>
-        </w:trPr>
         <w:tc>
-          <w:tcPr>
-            <w:tcW w:w="2400" w:type="dxa"/>
-          </w:tcPr>
+          <w:tcPr/>
           <w:p>
             <w:pPr>
               <w:pStyle w:val="Compact"/>
-              <w:spacing w:line="276" w:lineRule="auto" w:after="40" w:before="40"/>
               <w:jc w:val="left"/>
             </w:pPr>
             <w:r>
               <w:rPr>
-                <w:rFonts w:ascii="Arial" w:hAnsi="Arial"/>
                 <w:b/>
                 <w:bCs/>
-                <w:color w:val="153E5C"/>
-                <w:sz w:val="18"/>
               </w:rPr>
               <w:t xml:space="preserve">Gobierno Digital e Interoperabilidad</w:t>
             </w:r>
           </w:p>
         </w:tc>
         <w:tc>
-          <w:tcPr>
-            <w:tcW w:w="3480" w:type="dxa"/>
-          </w:tcPr>
+          <w:tcPr/>
           <w:p>
             <w:pPr>
               <w:pStyle w:val="Compact"/>
-              <w:spacing w:line="276" w:lineRule="auto" w:after="40" w:before="40"/>
               <w:jc w:val="left"/>
             </w:pPr>
             <w:r>
-              <w:rPr>
-                <w:rFonts w:ascii="Arial" w:hAnsi="Arial"/>
-                <w:color w:val="2D3748"/>
-                <w:sz w:val="17"/>
-              </w:rPr>
               <w:t xml:space="preserve">Impulsa la interoperabilidad federal, estándares de intercambio de datos, firma digital y plataformas transversales como TAD y Mi Argentina.</w:t>
             </w:r>
           </w:p>
         </w:tc>
         <w:tc>
-          <w:tcPr>
-            <w:tcW w:w="3480" w:type="dxa"/>
-          </w:tcPr>
+          <w:tcPr/>
           <w:p>
             <w:pPr>
               <w:pStyle w:val="Compact"/>
-              <w:spacing w:line="276" w:lineRule="auto" w:after="40" w:before="40"/>
               <w:jc w:val="left"/>
             </w:pPr>
             <w:r>
-              <w:rPr>
-                <w:rFonts w:ascii="Arial" w:hAnsi="Arial"/>
-                <w:color w:val="2D3748"/>
-                <w:sz w:val="17"/>
-              </w:rPr>
               <w:t xml:space="preserve">Implementa plataformas de gestión local interoperadas internamente: Catastro SITUN, Tribunal de Faltas, Cobranzas y Trámites Web.</w:t>
             </w:r>
           </w:p>
         </w:tc>
       </w:tr>
       <w:tr>
-        <w:trPr>
-          <w:cantSplit/>
-        </w:trPr>
         <w:tc>
-          <w:tcPr>
-            <w:tcW w:w="2400" w:type="dxa"/>
-            <w:shd w:val="clear" w:color="auto" w:fill="F8FAFC"/>
-          </w:tcPr>
+          <w:tcPr/>
           <w:p>
             <w:pPr>
               <w:pStyle w:val="Compact"/>
-              <w:spacing w:line="276" w:lineRule="auto" w:after="40" w:before="40"/>
               <w:jc w:val="left"/>
             </w:pPr>
             <w:r>
               <w:rPr>
-                <w:rFonts w:ascii="Arial" w:hAnsi="Arial"/>
                 <w:b/>
                 <w:bCs/>
-                <w:color w:val="153E5C"/>
-                <w:sz w:val="18"/>
               </w:rPr>
               <w:t xml:space="preserve">País Digital vs. Smart City</w:t>
             </w:r>
           </w:p>
         </w:tc>
         <w:tc>
-          <w:tcPr>
-            <w:tcW w:w="3480" w:type="dxa"/>
-            <w:shd w:val="clear" w:color="auto" w:fill="F8FAFC"/>
-          </w:tcPr>
+          <w:tcPr/>
           <w:p>
             <w:pPr>
               <w:pStyle w:val="Compact"/>
-              <w:spacing w:line="276" w:lineRule="auto" w:after="40" w:before="40"/>
               <w:jc w:val="left"/>
             </w:pPr>
             <w:r>
-              <w:rPr>
-                <w:rFonts w:ascii="Arial" w:hAnsi="Arial"/>
-                <w:color w:val="2D3748"/>
-                <w:sz w:val="17"/>
-              </w:rPr>
               <w:t xml:space="preserve">Aborda la brecha digital macro: conectividad geográfica federal, tendido troncal, puntos Wi-Fi nacionales y métricas de computadoras por habitante.</w:t>
             </w:r>
           </w:p>
         </w:tc>
         <w:tc>
-          <w:tcPr>
-            <w:tcW w:w="3480" w:type="dxa"/>
-            <w:shd w:val="clear" w:color="auto" w:fill="F8FAFC"/>
-          </w:tcPr>
+          <w:tcPr/>
           <w:p>
             <w:pPr>
               <w:pStyle w:val="Compact"/>
-              <w:spacing w:line="276" w:lineRule="auto" w:after="40" w:before="40"/>
               <w:jc w:val="left"/>
             </w:pPr>
             <w:r>
+              <w:t xml:space="preserve">Aplica el concepto de</w:t>
+            </w:r>
+            <w:r>
+              <w:t xml:space="preserve"> </w:t>
+            </w:r>
+            <w:r>
               <w:rPr>
-                <w:rFonts w:ascii="Arial" w:hAnsi="Arial"/>
-                <w:color w:val="2D3748"/>
-                <w:sz w:val="17"/>
-              </w:rPr>
-              <w:t xml:space="preserve">Aplica el concepto de</w:t>
-            </w:r>
-            <w:r>
-              <w:rPr>
-                <w:rFonts w:ascii="Arial" w:hAnsi="Arial"/>
-                <w:color w:val="2D3748"/>
-                <w:sz w:val="17"/>
-              </w:rPr>
-              <w:t xml:space="preserve"> </w:t>
-            </w:r>
-            <w:r>
-              <w:rPr>
-                <w:rFonts w:ascii="Arial" w:hAnsi="Arial"/>
                 <w:i/>
                 <w:iCs/>
-                <w:color w:val="2D3748"/>
-                <w:sz w:val="17"/>
               </w:rPr>
               <w:t xml:space="preserve">Ciudad Inteligente</w:t>
             </w:r>
             <w:r>
-              <w:rPr>
-                <w:rFonts w:ascii="Arial" w:hAnsi="Arial"/>
-                <w:color w:val="2D3748"/>
-                <w:sz w:val="17"/>
-              </w:rPr>
               <w:t xml:space="preserve">: cámaras en vivo, Zonas Wi-Fi municipales en espacios verdes, gestión de tráfico inteligente y Polo Tecnológico.</w:t>
             </w:r>
           </w:p>
         </w:tc>
       </w:tr>
       <w:tr>
-        <w:trPr>
-          <w:cantSplit/>
-        </w:trPr>
         <w:tc>
-          <w:tcPr>
-            <w:tcW w:w="2400" w:type="dxa"/>
-          </w:tcPr>
+          <w:tcPr/>
           <w:p>
             <w:pPr>
               <w:pStyle w:val="Compact"/>
-              <w:spacing w:line="276" w:lineRule="auto" w:after="40" w:before="40"/>
               <w:jc w:val="left"/>
             </w:pPr>
             <w:r>
               <w:rPr>
-                <w:rFonts w:ascii="Arial" w:hAnsi="Arial"/>
                 <w:b/>
                 <w:bCs/>
-                <w:color w:val="153E5C"/>
-                <w:sz w:val="18"/>
               </w:rPr>
               <w:t xml:space="preserve">Modernización Administrativa</w:t>
             </w:r>
           </w:p>
         </w:tc>
         <w:tc>
-          <w:tcPr>
-            <w:tcW w:w="3480" w:type="dxa"/>
-          </w:tcPr>
+          <w:tcPr/>
           <w:p>
             <w:pPr>
               <w:pStyle w:val="Compact"/>
-              <w:spacing w:line="276" w:lineRule="auto" w:after="40" w:before="40"/>
               <w:jc w:val="left"/>
             </w:pPr>
             <w:r>
-              <w:rPr>
-                <w:rFonts w:ascii="Arial" w:hAnsi="Arial"/>
-                <w:color w:val="2D3748"/>
-                <w:sz w:val="17"/>
-              </w:rPr>
               <w:t xml:space="preserve">Focalizado en el Sistema de Gestión Documental Electrónica (GDE), expediente electrónico de compras públicas y reducción de tiempos ministeriales.</w:t>
             </w:r>
           </w:p>
         </w:tc>
         <w:tc>
-          <w:tcPr>
-            <w:tcW w:w="3480" w:type="dxa"/>
-          </w:tcPr>
+          <w:tcPr/>
           <w:p>
             <w:pPr>
               <w:pStyle w:val="Compact"/>
-              <w:spacing w:line="276" w:lineRule="auto" w:after="40" w:before="40"/>
               <w:jc w:val="left"/>
             </w:pPr>
             <w:r>
-              <w:rPr>
-                <w:rFonts w:ascii="Arial" w:hAnsi="Arial"/>
-                <w:color w:val="2D3748"/>
-                <w:sz w:val="17"/>
-              </w:rPr>
               <w:t xml:space="preserve">Focalizado en la ventanilla única de trámites municipales, despapelización de licencias, agrimensura, habilitaciones comerciales y digesto digital.</w:t>
             </w:r>
           </w:p>
         </w:tc>
       </w:tr>
       <w:tr>
-        <w:trPr>
-          <w:cantSplit/>
-        </w:trPr>
         <w:tc>
-          <w:tcPr>
-            <w:tcW w:w="2400" w:type="dxa"/>
-            <w:shd w:val="clear" w:color="auto" w:fill="F8FAFC"/>
-          </w:tcPr>
+          <w:tcPr/>
           <w:p>
             <w:pPr>
               <w:pStyle w:val="Compact"/>
-              <w:spacing w:line="276" w:lineRule="auto" w:after="40" w:before="40"/>
               <w:jc w:val="left"/>
             </w:pPr>
             <w:r>
               <w:rPr>
-                <w:rFonts w:ascii="Arial" w:hAnsi="Arial"/>
                 <w:b/>
                 <w:bCs/>
-                <w:color w:val="153E5C"/>
-                <w:sz w:val="18"/>
               </w:rPr>
               <w:t xml:space="preserve">Gobierno Abierto y Participación</w:t>
             </w:r>
           </w:p>
         </w:tc>
         <w:tc>
-          <w:tcPr>
-            <w:tcW w:w="3480" w:type="dxa"/>
-            <w:shd w:val="clear" w:color="auto" w:fill="F8FAFC"/>
-          </w:tcPr>
+          <w:tcPr/>
           <w:p>
             <w:pPr>
               <w:pStyle w:val="Compact"/>
-              <w:spacing w:line="276" w:lineRule="auto" w:after="40" w:before="40"/>
               <w:jc w:val="left"/>
             </w:pPr>
             <w:r>
-              <w:rPr>
-                <w:rFonts w:ascii="Arial" w:hAnsi="Arial"/>
-                <w:color w:val="2D3748"/>
-                <w:sz w:val="17"/>
-              </w:rPr>
               <w:t xml:space="preserve">Alineado con compromisos internacionales: Alianza para el Gobierno Abierto (OGP), Carta Iberoamericana y estándares de transparencia de la OCDE.</w:t>
             </w:r>
           </w:p>
         </w:tc>
         <w:tc>
-          <w:tcPr>
-            <w:tcW w:w="3480" w:type="dxa"/>
-            <w:shd w:val="clear" w:color="auto" w:fill="F8FAFC"/>
-          </w:tcPr>
+          <w:tcPr/>
           <w:p>
             <w:pPr>
               <w:pStyle w:val="Compact"/>
-              <w:spacing w:line="276" w:lineRule="auto" w:after="40" w:before="40"/>
               <w:jc w:val="left"/>
             </w:pPr>
             <w:r>
-              <w:rPr>
-                <w:rFonts w:ascii="Arial" w:hAnsi="Arial"/>
-                <w:color w:val="2D3748"/>
-                <w:sz w:val="17"/>
-              </w:rPr>
               <w:t xml:space="preserve">Enfocado en la transparencia de proximidad: Boletín Oficial digital, portal tributario abierto, participación comunitaria en ferias y empleo local.</w:t>
             </w:r>
           </w:p>
         </w:tc>
       </w:tr>
       <w:tr>
-        <w:trPr>
-          <w:cantSplit/>
-        </w:trPr>
         <w:tc>
-          <w:tcPr>
-            <w:tcW w:w="2400" w:type="dxa"/>
-          </w:tcPr>
+          <w:tcPr/>
           <w:p>
             <w:pPr>
               <w:pStyle w:val="Compact"/>
-              <w:spacing w:line="276" w:lineRule="auto" w:after="40" w:before="40"/>
               <w:jc w:val="left"/>
             </w:pPr>
             <w:r>
               <w:rPr>
-                <w:rFonts w:ascii="Arial" w:hAnsi="Arial"/>
                 <w:b/>
                 <w:bCs/>
-                <w:color w:val="153E5C"/>
-                <w:sz w:val="18"/>
               </w:rPr>
               <w:t xml:space="preserve">Capacitación del Talento Humano</w:t>
             </w:r>
           </w:p>
         </w:tc>
         <w:tc>
-          <w:tcPr>
-            <w:tcW w:w="3480" w:type="dxa"/>
-          </w:tcPr>
+          <w:tcPr/>
           <w:p>
             <w:pPr>
               <w:pStyle w:val="Compact"/>
-              <w:spacing w:line="276" w:lineRule="auto" w:after="40" w:before="40"/>
               <w:jc w:val="left"/>
             </w:pPr>
             <w:r>
-              <w:rPr>
-                <w:rFonts w:ascii="Arial" w:hAnsi="Arial"/>
-                <w:color w:val="2D3748"/>
-                <w:sz w:val="17"/>
-              </w:rPr>
               <w:t xml:space="preserve">Formación masiva de funcionarios federales a través del INAP, carreras de administración pública y gestión por competencias.</w:t>
             </w:r>
           </w:p>
         </w:tc>
         <w:tc>
-          <w:tcPr>
-            <w:tcW w:w="3480" w:type="dxa"/>
-          </w:tcPr>
+          <w:tcPr/>
           <w:p>
             <w:pPr>
               <w:pStyle w:val="Compact"/>
-              <w:spacing w:line="276" w:lineRule="auto" w:after="40" w:before="40"/>
               <w:jc w:val="left"/>
             </w:pPr>
             <w:r>
-              <w:rPr>
-                <w:rFonts w:ascii="Arial" w:hAnsi="Arial"/>
-                <w:color w:val="2D3748"/>
-                <w:sz w:val="17"/>
-              </w:rPr>
               <w:t xml:space="preserve">Capacitación operativa de agentes municipales y formación directa a ciudadanos (cursos de seguridad vial, manipulación de alimentos).</w:t>
             </w:r>
           </w:p>
@@ -3065,7 +2809,7 @@
       </w:footnotePr>
       <w:pgMar w:bottom="1440" w:left="1440" w:right="1440" w:top="1440"/>
       <w:titlePg/>
-      <w:pgNumType w:start="1"/>
+      <w:pgNumType w:start="0"/>
     </w:sectPr>
   </w:body>
 </w:document>
@@ -3201,7 +2945,7 @@
             </w:rPr>
             <w:t xml:space="preserve"> de </w:t>
           </w:r>
-          <w:fldSimple w:instr="SECTIONPAGES">
+          <w:fldSimple w:instr="NUMPAGES">
             <w:r>
               <w:rPr>
                 <w:rFonts w:ascii="Arial" w:hAnsi="Arial"/>
@@ -3229,17 +2973,6 @@
 </w:ftr>
 </file>
 
-<file path=word/footer3.xml><?xml version="1.0" encoding="utf-8"?>
-<w:ftr xmlns:m="http://schemas.openxmlformats.org/officeDocument/2006/math" xmlns:mc="http://schemas.openxmlformats.org/markup-compatibility/2006" xmlns:mo="http://schemas.microsoft.com/office/mac/office/2008/main" xmlns:mv="urn:schemas-microsoft-com:mac:vml" xmlns:o="urn:schemas-microsoft-com:office:office" xmlns:r="http://schemas.openxmlformats.org/officeDocument/2006/relationships" xmlns:v="urn:schemas-microsoft-com:vml" xmlns:w10="urn:schemas-microsoft-com:office:word" xmlns:w14="http://schemas.microsoft.com/office/word/2010/wordml" xmlns:w="http://schemas.openxmlformats.org/wordprocessingml/2006/main" xmlns:wne="http://schemas.microsoft.com/office/word/2006/wordml" xmlns:wp14="http://schemas.microsoft.com/office/word/2010/wordprocessingDrawing" xmlns:wp="http://schemas.openxmlformats.org/drawingml/2006/wordprocessingDrawing" xmlns:wpc="http://schemas.microsoft.com/office/word/2010/wordprocessingCanvas" xmlns:wpg="http://schemas.microsoft.com/office/word/2010/wordprocessingGroup" xmlns:wpi="http://schemas.microsoft.com/office/word/2010/wordprocessingInk" xmlns:wps="http://schemas.microsoft.com/office/word/2010/wordprocessingShape" mc:Ignorable="w14 wp14">
-  <w:p>
-    <w:pPr>
-      <w:pStyle w:val="Footer"/>
-    </w:pPr>
-    <w:r/>
-  </w:p>
-</w:ftr>
-</file>
-
 <file path=word/footnotes.xml><?xml version="1.0" encoding="utf-8"?>
 <w:footnotes xmlns:w="http://schemas.openxmlformats.org/wordprocessingml/2006/main" xmlns:m="http://schemas.openxmlformats.org/officeDocument/2006/math" xmlns:r="http://schemas.openxmlformats.org/officeDocument/2006/relationships" xmlns:o="urn:schemas-microsoft-com:office:office" xmlns:v="urn:schemas-microsoft-com:vml" xmlns:w10="urn:schemas-microsoft-com:office:word" xmlns:a="http://schemas.openxmlformats.org/drawingml/2006/main" xmlns:pic="http://schemas.openxmlformats.org/drawingml/2006/picture" xmlns:wp="http://schemas.openxmlformats.org/drawingml/2006/wordprocessingDrawing">
   <w:footnote w:type="continuationSeparator" w:id="0">
@@ -3345,34 +3078,30 @@
       <w:pBdr>
         <w:bottom w:val="single" w:sz="4" w:space="4" w:color="CBD5E1"/>
       </w:pBdr>
-      <w:pBdr>
-        <w:bottom w:val="single" w:sz="4" w:space="4" w:color="CBD5E1"/>
-      </w:pBdr>
     </w:pPr>
+    <w:r/>
+    <w:r>
+      <w:rPr>
+        <w:rFonts w:ascii="Arial" w:hAnsi="Arial"/>
+        <w:b/>
+        <w:color w:val="718096"/>
+        <w:sz w:val="17"/>
+      </w:rPr>
+      <w:t xml:space="preserve">CURZAS · Universidad Nacional del Comahue    |    </w:t>
+    </w:r>
     <w:r>
       <w:rPr>
         <w:rFonts w:ascii="Arial" w:hAnsi="Arial"/>
         <w:color w:val="718096"/>
         <w:sz w:val="17"/>
       </w:rPr>
-      <w:t>CURZAS · Universidad Nacional del Comahue    |    Tecnología de la Información para la Gestión</w:t>
+      <w:t>Tecnología de la Información para la Gestión</w:t>
     </w:r>
   </w:p>
 </w:hdr>
 </file>
 
 <file path=word/header2.xml><?xml version="1.0" encoding="utf-8"?>
-<w:hdr xmlns:m="http://schemas.openxmlformats.org/officeDocument/2006/math" xmlns:mc="http://schemas.openxmlformats.org/markup-compatibility/2006" xmlns:mo="http://schemas.microsoft.com/office/mac/office/2008/main" xmlns:mv="urn:schemas-microsoft-com:mac:vml" xmlns:o="urn:schemas-microsoft-com:office:office" xmlns:r="http://schemas.openxmlformats.org/officeDocument/2006/relationships" xmlns:v="urn:schemas-microsoft-com:vml" xmlns:w10="urn:schemas-microsoft-com:office:word" xmlns:w14="http://schemas.microsoft.com/office/word/2010/wordml" xmlns:w="http://schemas.openxmlformats.org/wordprocessingml/2006/main" xmlns:wne="http://schemas.microsoft.com/office/word/2006/wordml" xmlns:wp14="http://schemas.microsoft.com/office/word/2010/wordprocessingDrawing" xmlns:wp="http://schemas.openxmlformats.org/drawingml/2006/wordprocessingDrawing" xmlns:wpc="http://schemas.microsoft.com/office/word/2010/wordprocessingCanvas" xmlns:wpg="http://schemas.microsoft.com/office/word/2010/wordprocessingGroup" xmlns:wpi="http://schemas.microsoft.com/office/word/2010/wordprocessingInk" xmlns:wps="http://schemas.microsoft.com/office/word/2010/wordprocessingShape" mc:Ignorable="w14 wp14">
-  <w:p>
-    <w:pPr>
-      <w:pStyle w:val="Header"/>
-    </w:pPr>
-    <w:r/>
-  </w:p>
-</w:hdr>
-</file>
-
-<file path=word/header3.xml><?xml version="1.0" encoding="utf-8"?>
 <w:hdr xmlns:m="http://schemas.openxmlformats.org/officeDocument/2006/math" xmlns:mc="http://schemas.openxmlformats.org/markup-compatibility/2006" xmlns:mo="http://schemas.microsoft.com/office/mac/office/2008/main" xmlns:mv="urn:schemas-microsoft-com:mac:vml" xmlns:o="urn:schemas-microsoft-com:office:office" xmlns:r="http://schemas.openxmlformats.org/officeDocument/2006/relationships" xmlns:v="urn:schemas-microsoft-com:vml" xmlns:w10="urn:schemas-microsoft-com:office:word" xmlns:w14="http://schemas.microsoft.com/office/word/2010/wordml" xmlns:w="http://schemas.openxmlformats.org/wordprocessingml/2006/main" xmlns:wne="http://schemas.microsoft.com/office/word/2006/wordml" xmlns:wp14="http://schemas.microsoft.com/office/word/2010/wordprocessingDrawing" xmlns:wp="http://schemas.openxmlformats.org/drawingml/2006/wordprocessingDrawing" xmlns:wpc="http://schemas.microsoft.com/office/word/2010/wordprocessingCanvas" xmlns:wpg="http://schemas.microsoft.com/office/word/2010/wordprocessingGroup" xmlns:wpi="http://schemas.microsoft.com/office/word/2010/wordprocessingInk" xmlns:wps="http://schemas.microsoft.com/office/word/2010/wordprocessingShape" mc:Ignorable="w14 wp14">
   <w:p>
     <w:pPr>

</xml_diff>

<commit_message>
feat: add research report on state modernization policies for INAP and Neuquén government
</commit_message>
<xml_diff>
--- a/Entregables/Actividad 4/2_Word_Quarto/Actividad 4 - Investigacion Modernizacion Nacion Neuquen.docx
+++ b/Entregables/Actividad 4/2_Word_Quarto/Actividad 4 - Investigacion Modernizacion Nacion Neuquen.docx
@@ -363,14 +363,10 @@
         </w:tc>
       </w:tr>
     </w:tbl>
-    <w:p xmlns:w="http://schemas.openxmlformats.org/wordprocessingml/2006/main">
-      <w:pPr>
-        <w:sectPr>
-          <w:type w:val="nextPage"/>
-          <w:titlePg/>
-          <w:pgNumType w:start="1"/>
-        </w:sectPr>
-      </w:pPr>
+    <w:p>
+      <w:r>
+        <w:br w:type="page"/>
+      </w:r>
     </w:p>
     <w:bookmarkStart w:id="27" w:name="índice-general"/>
     <w:p>

</xml_diff>

<commit_message>
feat: add Word and PDF documents for Activity 4 research and academic template
</commit_message>
<xml_diff>
--- a/Entregables/Actividad 4/2_Word_Quarto/Actividad 4 - Investigacion Modernizacion Nacion Neuquen.docx
+++ b/Entregables/Actividad 4/2_Word_Quarto/Actividad 4 - Investigacion Modernizacion Nacion Neuquen.docx
@@ -2945,16 +2945,94 @@
             </w:rPr>
             <w:t xml:space="preserve"> de </w:t>
           </w:r>
-          <w:fldSimple w:instr="NUMPAGES">
-            <w:r>
-              <w:rPr>
-                <w:rFonts w:ascii="Arial" w:hAnsi="Arial"/>
-                <w:color w:val="718096"/>
-                <w:sz w:val="17"/>
-              </w:rPr>
-              <w:t>8</w:t>
-            </w:r>
-          </w:fldSimple>
+          <w:r>
+            <w:rPr>
+              <w:rFonts w:ascii="Arial" w:hAnsi="Arial"/>
+              <w:color w:val="718096"/>
+              <w:sz w:val="17"/>
+            </w:rPr>
+            <w:fldChar w:fldCharType="begin"/>
+          </w:r>
+          <w:r>
+            <w:rPr>
+              <w:rFonts w:ascii="Arial" w:hAnsi="Arial"/>
+              <w:color w:val="718096"/>
+              <w:sz w:val="17"/>
+            </w:rPr>
+            <w:instrText xml:space="preserve"> = </w:instrText>
+          </w:r>
+          <w:r>
+            <w:rPr>
+              <w:rFonts w:ascii="Arial" w:hAnsi="Arial"/>
+              <w:color w:val="718096"/>
+              <w:sz w:val="17"/>
+            </w:rPr>
+            <w:fldChar w:fldCharType="begin"/>
+          </w:r>
+          <w:r>
+            <w:rPr>
+              <w:rFonts w:ascii="Arial" w:hAnsi="Arial"/>
+              <w:color w:val="718096"/>
+              <w:sz w:val="17"/>
+            </w:rPr>
+            <w:instrText xml:space="preserve">NUMPAGES</w:instrText>
+          </w:r>
+          <w:r>
+            <w:rPr>
+              <w:rFonts w:ascii="Arial" w:hAnsi="Arial"/>
+              <w:color w:val="718096"/>
+              <w:sz w:val="17"/>
+            </w:rPr>
+            <w:fldChar w:fldCharType="separate"/>
+          </w:r>
+          <w:r>
+            <w:rPr>
+              <w:rFonts w:ascii="Arial" w:hAnsi="Arial"/>
+              <w:color w:val="718096"/>
+              <w:sz w:val="17"/>
+            </w:rPr>
+            <w:t>9</w:t>
+          </w:r>
+          <w:r>
+            <w:rPr>
+              <w:rFonts w:ascii="Arial" w:hAnsi="Arial"/>
+              <w:color w:val="718096"/>
+              <w:sz w:val="17"/>
+            </w:rPr>
+            <w:fldChar w:fldCharType="end"/>
+          </w:r>
+          <w:r>
+            <w:rPr>
+              <w:rFonts w:ascii="Arial" w:hAnsi="Arial"/>
+              <w:color w:val="718096"/>
+              <w:sz w:val="17"/>
+            </w:rPr>
+            <w:instrText xml:space="preserve"> - 1 </w:instrText>
+          </w:r>
+          <w:r>
+            <w:rPr>
+              <w:rFonts w:ascii="Arial" w:hAnsi="Arial"/>
+              <w:color w:val="718096"/>
+              <w:sz w:val="17"/>
+            </w:rPr>
+            <w:fldChar w:fldCharType="separate"/>
+          </w:r>
+          <w:r>
+            <w:rPr>
+              <w:rFonts w:ascii="Arial" w:hAnsi="Arial"/>
+              <w:color w:val="718096"/>
+              <w:sz w:val="17"/>
+            </w:rPr>
+            <w:t>8</w:t>
+          </w:r>
+          <w:r>
+            <w:rPr>
+              <w:rFonts w:ascii="Arial" w:hAnsi="Arial"/>
+              <w:color w:val="718096"/>
+              <w:sz w:val="17"/>
+            </w:rPr>
+            <w:fldChar w:fldCharType="end"/>
+          </w:r>
         </w:p>
       </w:tc>
     </w:tr>

</xml_diff>

<commit_message>
fix(word): corregir glitch de pie de pagina '88' usando PAGEREF limpio
</commit_message>
<xml_diff>
--- a/Entregables/Actividad 4/2_Word_Quarto/Actividad 4 - Investigacion Modernizacion Nacion Neuquen.docx
+++ b/Entregables/Actividad 4/2_Word_Quarto/Actividad 4 - Investigacion Modernizacion Nacion Neuquen.docx
@@ -2511,7 +2511,7 @@
       </w:r>
     </w:p>
     <w:bookmarkEnd w:id="48"/>
-    <w:bookmarkStart w:id="51" w:name="Xec850b3d016b3f0d7255de5b4756a8e2ad7a98d"/>
+    <w:bookmarkStart w:id="52" w:name="Xec850b3d016b3f0d7255de5b4756a8e2ad7a98d"/>
     <w:p>
       <w:pPr>
         <w:pStyle w:val="Heading1"/>
@@ -2798,7 +2798,14 @@
         <w:t xml:space="preserve">. Publicaciones de la OCDE.</w:t>
       </w:r>
     </w:p>
-    <w:bookmarkEnd w:id="51"/>
+    <w:p>
+      <w:pPr>
+        <w:pStyle w:val="FirstParagraph"/>
+      </w:pPr>
+      <w:bookmarkStart w:id="51" w:name="FinDocumento"/>
+      <w:bookmarkEnd w:id="51"/>
+    </w:p>
+    <w:bookmarkEnd w:id="52"/>
     <w:sectPr>
       <w:headerReference r:id="rId9" w:type="default"/>
       <w:footerReference r:id="rId10" w:type="default"/>
@@ -2945,94 +2952,16 @@
             </w:rPr>
             <w:t xml:space="preserve"> de </w:t>
           </w:r>
-          <w:r>
-            <w:rPr>
-              <w:rFonts w:ascii="Arial" w:hAnsi="Arial"/>
-              <w:color w:val="718096"/>
-              <w:sz w:val="17"/>
-            </w:rPr>
-            <w:fldChar w:fldCharType="begin"/>
-          </w:r>
-          <w:r>
-            <w:rPr>
-              <w:rFonts w:ascii="Arial" w:hAnsi="Arial"/>
-              <w:color w:val="718096"/>
-              <w:sz w:val="17"/>
-            </w:rPr>
-            <w:instrText xml:space="preserve"> = </w:instrText>
-          </w:r>
-          <w:r>
-            <w:rPr>
-              <w:rFonts w:ascii="Arial" w:hAnsi="Arial"/>
-              <w:color w:val="718096"/>
-              <w:sz w:val="17"/>
-            </w:rPr>
-            <w:fldChar w:fldCharType="begin"/>
-          </w:r>
-          <w:r>
-            <w:rPr>
-              <w:rFonts w:ascii="Arial" w:hAnsi="Arial"/>
-              <w:color w:val="718096"/>
-              <w:sz w:val="17"/>
-            </w:rPr>
-            <w:instrText xml:space="preserve">NUMPAGES</w:instrText>
-          </w:r>
-          <w:r>
-            <w:rPr>
-              <w:rFonts w:ascii="Arial" w:hAnsi="Arial"/>
-              <w:color w:val="718096"/>
-              <w:sz w:val="17"/>
-            </w:rPr>
-            <w:fldChar w:fldCharType="separate"/>
-          </w:r>
-          <w:r>
-            <w:rPr>
-              <w:rFonts w:ascii="Arial" w:hAnsi="Arial"/>
-              <w:color w:val="718096"/>
-              <w:sz w:val="17"/>
-            </w:rPr>
-            <w:t>9</w:t>
-          </w:r>
-          <w:r>
-            <w:rPr>
-              <w:rFonts w:ascii="Arial" w:hAnsi="Arial"/>
-              <w:color w:val="718096"/>
-              <w:sz w:val="17"/>
-            </w:rPr>
-            <w:fldChar w:fldCharType="end"/>
-          </w:r>
-          <w:r>
-            <w:rPr>
-              <w:rFonts w:ascii="Arial" w:hAnsi="Arial"/>
-              <w:color w:val="718096"/>
-              <w:sz w:val="17"/>
-            </w:rPr>
-            <w:instrText xml:space="preserve"> - 1 </w:instrText>
-          </w:r>
-          <w:r>
-            <w:rPr>
-              <w:rFonts w:ascii="Arial" w:hAnsi="Arial"/>
-              <w:color w:val="718096"/>
-              <w:sz w:val="17"/>
-            </w:rPr>
-            <w:fldChar w:fldCharType="separate"/>
-          </w:r>
-          <w:r>
-            <w:rPr>
-              <w:rFonts w:ascii="Arial" w:hAnsi="Arial"/>
-              <w:color w:val="718096"/>
-              <w:sz w:val="17"/>
-            </w:rPr>
-            <w:t>8</w:t>
-          </w:r>
-          <w:r>
-            <w:rPr>
-              <w:rFonts w:ascii="Arial" w:hAnsi="Arial"/>
-              <w:color w:val="718096"/>
-              <w:sz w:val="17"/>
-            </w:rPr>
-            <w:fldChar w:fldCharType="end"/>
-          </w:r>
+          <w:fldSimple w:instr="PAGEREF FinDocumento \h">
+            <w:r>
+              <w:rPr>
+                <w:rFonts w:ascii="Arial" w:hAnsi="Arial"/>
+                <w:color w:val="718096"/>
+                <w:sz w:val="17"/>
+              </w:rPr>
+              <w:t>8</w:t>
+            </w:r>
+          </w:fldSimple>
         </w:p>
       </w:tc>
     </w:tr>

</xml_diff>

<commit_message>
feat: add scripts to automate document styling, table extraction, and OpenXML embedding for Quarto exports
</commit_message>
<xml_diff>
--- a/Entregables/Actividad 4/2_Word_Quarto/Actividad 4 - Investigacion Modernizacion Nacion Neuquen.docx
+++ b/Entregables/Actividad 4/2_Word_Quarto/Actividad 4 - Investigacion Modernizacion Nacion Neuquen.docx
@@ -73,92 +73,142 @@
         <w:t xml:space="preserve">Investigación y Estudio Comparativo: Nivel Nacional (INAP) y Jurisdicción Subnacional (Neuquén Capital) · Tema 2</w:t>
       </w:r>
     </w:p>
-    <w:tbl>
+    <w:tbl xmlns:w="http://schemas.openxmlformats.org/wordprocessingml/2006/main">
       <w:tblPr>
-        <w:tblStyle w:val="Table"/>
-        <w:tblLook w:firstRow="0" w:lastRow="0" w:firstColumn="0" w:lastColumn="0" w:noHBand="0" w:noVBand="0" w:val="0000"/>
+        <w:tblW w:w="5000" w:type="pct"/>
+        <w:tblLayout w:type="fixed"/>
         <w:tblBorders>
-          <w:top w:val="single" w:sz="4" w:space="0" w:color="0758E5"/>
-          <w:left w:val="single" w:sz="24" w:space="0" w:color="0758E5"/>
-          <w:bottom w:val="single" w:sz="4" w:space="0" w:color="0758E5"/>
-          <w:right w:val="single" w:sz="4" w:space="0" w:color="0758E5"/>
+          <w:top w:val="single" w:sz="4" w:space="0" w:color="E2E8F0"/>
+          <w:left w:val="single" w:sz="24" w:space="0" w:color="C1741F"/>
+          <w:bottom w:val="single" w:sz="4" w:space="0" w:color="E2E8F0"/>
+          <w:right w:val="single" w:sz="4" w:space="0" w:color="E2E8F0"/>
+          <w:insideH w:val="none"/>
+          <w:insideV w:val="none"/>
         </w:tblBorders>
         <w:tblCellMar>
-          <w:left w:w="144" w:type="dxa"/>
-          <w:right w:w="144" w:type="dxa"/>
+          <w:top w:w="140" w:type="dxa"/>
+          <w:left w:w="200" w:type="dxa"/>
+          <w:bottom w:w="140" w:type="dxa"/>
+          <w:right w:w="200" w:type="dxa"/>
         </w:tblCellMar>
-        <w:tblLook w:firstRow="0" w:lastRow="0" w:firstColumn="0" w:lastColumn="0" w:noHBand="0" w:noVBand="0" w:val="0000"/>
       </w:tblPr>
+      <w:tblGrid>
+        <w:gridCol w:w="9360"/>
+      </w:tblGrid>
       <w:tr>
         <w:trPr>
           <w:cantSplit/>
         </w:trPr>
         <w:tc>
           <w:tcPr>
-            <w:shd w:color="auto" w:fill="dae6fb" w:val="clear"/>
-            <w:tcMar>
-              <w:top w:w="92" w:type="dxa"/>
-              <w:bottom w:w="92" w:type="dxa"/>
-            </w:tcMar>
+            <w:tcW w:w="9360" w:type="dxa"/>
+            <w:shd w:val="clear" w:color="auto" w:fill="FDF8F3"/>
           </w:tcPr>
           <w:p>
             <w:pPr>
-              <w:pStyle w:val="BodyText"/>
-            </w:pPr>
-            <w:pPr>
-              <w:spacing w:before="0" w:after="0"/>
-              <w:textAlignment w:val="center"/>
+              <w:pStyle w:val="Compact"/>
+              <w:spacing w:before="40" w:after="80"/>
             </w:pPr>
             <w:r>
-              <w:drawing>
-                <wp:inline>
-                  <wp:extent cx="152400" cy="152400"/>
-                  <wp:effectExtent b="0" l="0" r="0" t="0"/>
-                  <wp:docPr descr="" title="" id="25" name="Picture"/>
-                  <a:graphic>
-                    <a:graphicData uri="http://schemas.openxmlformats.org/drawingml/2006/picture">
-                      <pic:pic>
-                        <pic:nvPicPr>
-                          <pic:cNvPr descr="C:\Users\Ramoncito\AppData\Local\Programs\Quarto\share\formats\docx\note.png" id="26" name="Picture"/>
-                          <pic:cNvPicPr>
-                            <a:picLocks noChangeArrowheads="1" noChangeAspect="1"/>
-                          </pic:cNvPicPr>
-                        </pic:nvPicPr>
-                        <pic:blipFill>
-                          <a:blip r:embed="rId24"/>
-                          <a:stretch>
-                            <a:fillRect/>
-                          </a:stretch>
-                        </pic:blipFill>
-                        <pic:spPr bwMode="auto">
-                          <a:xfrm>
-                            <a:off x="0" y="0"/>
-                            <a:ext cx="152400" cy="152400"/>
-                          </a:xfrm>
-                          <a:prstGeom prst="rect">
-                            <a:avLst/>
-                          </a:prstGeom>
-                          <a:noFill/>
-                          <a:ln w="9525">
-                            <a:noFill/>
-                            <a:headEnd/>
-                            <a:tailEnd/>
-                          </a:ln>
-                        </pic:spPr>
-                      </pic:pic>
-                    </a:graphicData>
-                  </a:graphic>
-                </wp:inline>
-              </w:drawing>
+              <w:rPr>
+                <w:rFonts w:ascii="Arial" w:hAnsi="Arial"/>
+                <w:b/>
+                <w:color w:val="C1741F"/>
+                <w:sz w:val="20"/>
+              </w:rPr>
+              <w:t>PROPÓSITO Y SÍNTESIS DE LA ACTIVIDAD</w:t>
             </w:r>
+          </w:p>
+          <w:p>
+            <w:pPr>
+              <w:pStyle w:val="Compact"/>
+              <w:spacing w:before="40" w:after="40" w:line="276" w:lineRule="auto"/>
+            </w:pPr>
             <w:r>
-              <w:t xml:space="preserve"> </w:t>
+              <w:rPr>
+                <w:rFonts w:ascii="Arial" w:hAnsi="Arial"/>
+                <w:color w:val="2D3748"/>
+                <w:sz w:val="19"/>
+              </w:rPr>
+              <w:t>Investigar, describir y analizar comparativamente las políticas públicas y plataformas digitales de modernización del Estado implementadas por el Gobierno Nacional a través del Observatorio de la Administración Pública del INAP y por la Secretaría de Modernización de la Ciudad de Neuquén. Se examinan las dimensiones de gobierno digital, inclusión tecnológica, simplificación administrativa y gobierno abierto, evaluando los desafíos de interoperabilidad federal, la reducción de brechas y la complementariedad multinivel.</w:t>
             </w:r>
+          </w:p>
+        </w:tc>
+      </w:tr>
+    </w:tbl>
+    <w:p xmlns:w="http://schemas.openxmlformats.org/wordprocessingml/2006/main">
+      <w:pPr>
+        <w:spacing w:before="140" w:after="100"/>
+        <w:pBdr>
+          <w:bottom w:val="single" w:sz="6" w:space="1" w:color="CBD5E1"/>
+        </w:pBdr>
+      </w:pPr>
+    </w:p>
+    <w:tbl xmlns:w="http://schemas.openxmlformats.org/wordprocessingml/2006/main">
+      <w:tblPr>
+        <w:tblW w:w="5000" w:type="pct"/>
+        <w:tblLayout w:type="fixed"/>
+        <w:tblBorders>
+          <w:top w:val="single" w:sz="6" w:space="0" w:color="0E6873"/>
+          <w:left w:val="single" w:sz="24" w:space="0" w:color="0E6873"/>
+          <w:bottom w:val="single" w:sz="6" w:space="0" w:color="0E6873"/>
+          <w:right w:val="single" w:sz="6" w:space="0" w:color="CBD5E1"/>
+          <w:insideH w:val="single" w:sz="4" w:space="0" w:color="E2E8F0"/>
+          <w:insideV w:val="none"/>
+        </w:tblBorders>
+        <w:tblCellMar>
+          <w:top w:w="120" w:type="dxa"/>
+          <w:left w:w="160" w:type="dxa"/>
+          <w:bottom w:w="120" w:type="dxa"/>
+          <w:right w:w="160" w:type="dxa"/>
+        </w:tblCellMar>
+      </w:tblPr>
+      <w:tblGrid>
+        <w:gridCol w:w="3200"/>
+        <w:gridCol w:w="6160"/>
+      </w:tblGrid>
+      <w:tr>
+        <w:trPr>
+          <w:cantSplit/>
+        </w:trPr>
+        <w:tc>
+          <w:tcPr>
+            <w:tcW w:w="3200" w:type="dxa"/>
+            <w:shd w:val="clear" w:color="auto" w:fill="F2F7F7"/>
+          </w:tcPr>
+          <w:p>
+            <w:pPr>
+              <w:pStyle w:val="Compact"/>
+              <w:spacing w:before="40" w:after="40"/>
+            </w:pPr>
             <w:r>
-              <w:t xml:space="preserve"> </w:t>
+              <w:rPr>
+                <w:rFonts w:ascii="Arial" w:hAnsi="Arial"/>
+                <w:b/>
+                <w:color w:val="0E6873"/>
+                <w:sz w:val="18"/>
+              </w:rPr>
+              <w:t>INSTITUCIÓN EDUCATIVA:</w:t>
             </w:r>
+          </w:p>
+        </w:tc>
+        <w:tc>
+          <w:tcPr>
+            <w:tcW w:w="6160" w:type="dxa"/>
+            <w:shd w:val="clear" w:color="auto" w:fill="F2F7F7"/>
+          </w:tcPr>
+          <w:p>
+            <w:pPr>
+              <w:pStyle w:val="Compact"/>
+              <w:spacing w:before="40" w:after="40"/>
+            </w:pPr>
             <w:r>
-              <w:t xml:space="preserve">PROPÓSITO Y SÍNTESIS DE LA ACTIVIDAD</w:t>
+              <w:rPr>
+                <w:rFonts w:ascii="Arial" w:hAnsi="Arial"/>
+                <w:color w:val="2D3748"/>
+                <w:sz w:val="18"/>
+              </w:rPr>
+              <w:t>CURZAS · Universidad Nacional del Comahue</w:t>
             </w:r>
           </w:p>
         </w:tc>
@@ -169,756 +219,42 @@
         </w:trPr>
         <w:tc>
           <w:tcPr>
-            <w:tcMar>
-              <w:top w:w="108" w:type="dxa"/>
-              <w:bottom w:w="108" w:type="dxa"/>
-            </w:tcMar>
+            <w:tcW w:w="3200" w:type="dxa"/>
+            <w:shd w:val="clear" w:color="auto" w:fill="F2F7F7"/>
           </w:tcPr>
           <w:p>
             <w:pPr>
-              <w:pStyle w:val="BodyText"/>
-            </w:pPr>
-            <w:pPr>
-              <w:spacing w:before="16" w:after="16"/>
-            </w:pPr>
-            <w:r>
-              <w:t xml:space="preserve">Investigar, describir y analizar comparativamente las políticas públicas y plataformas digitales de modernización del Estado implementadas por el Gobierno Nacional a través del Observatorio de la Administración Pública del INAP y por la Secretaría de Modernización de la Ciudad de Neuquén. Se examinan las dimensiones de gobierno digital, inclusión tecnológica, simplificación administrativa y gobierno abierto, evaluando los desafíos de interoperabilidad federal, la reducción de brechas y la complementariedad multinivel.</w:t>
-            </w:r>
-          </w:p>
-          <w:p/>
-        </w:tc>
-      </w:tr>
-    </w:tbl>
-    <w:p xmlns:w="http://schemas.openxmlformats.org/wordprocessingml/2006/main">
-      <w:pPr>
-        <w:spacing w:before="140" w:after="100"/>
-        <w:pBdr>
-          <w:bottom w:val="single" w:sz="6" w:space="1" w:color="CBD5E1"/>
-        </w:pBdr>
-      </w:pPr>
-    </w:p>
-    <w:tbl>
-      <w:tblPr>
-        <w:tblStyle w:val="Table"/>
-        <w:tblW w:type="pct" w:w="5000"/>
-        <w:tblLayout w:type="fixed"/>
-        <w:tblLook w:firstRow="0" w:lastRow="0" w:firstColumn="0" w:lastColumn="0" w:noHBand="0" w:noVBand="0" w:val="0000"/>
-      </w:tblPr>
-      <w:tblGrid>
-        <w:gridCol w:w="3960"/>
-        <w:gridCol w:w="3960"/>
-      </w:tblGrid>
-      <w:tr>
-        <w:tc>
-          <w:tcPr/>
-          <w:p>
-            <w:pPr>
               <w:pStyle w:val="Compact"/>
-              <w:jc w:val="left"/>
+              <w:spacing w:before="40" w:after="40"/>
             </w:pPr>
             <w:r>
               <w:rPr>
+                <w:rFonts w:ascii="Arial" w:hAnsi="Arial"/>
                 <w:b/>
-                <w:bCs/>
+                <w:color w:val="0E6873"/>
+                <w:sz w:val="18"/>
               </w:rPr>
-              <w:t xml:space="preserve">INSTITUCIÓN EDUCATIVA:</w:t>
+              <w:t>ESPACIO CURRICULAR:</w:t>
             </w:r>
           </w:p>
         </w:tc>
         <w:tc>
-          <w:tcPr/>
+          <w:tcPr>
+            <w:tcW w:w="6160" w:type="dxa"/>
+            <w:shd w:val="clear" w:color="auto" w:fill="F2F7F7"/>
+          </w:tcPr>
           <w:p>
             <w:pPr>
               <w:pStyle w:val="Compact"/>
-              <w:jc w:val="left"/>
-            </w:pPr>
-            <w:r>
-              <w:t xml:space="preserve">CURZAS · Universidad Nacional del Comahue</w:t>
-            </w:r>
-          </w:p>
-        </w:tc>
-      </w:tr>
-      <w:tr>
-        <w:tc>
-          <w:tcPr/>
-          <w:p>
-            <w:pPr>
-              <w:pStyle w:val="Compact"/>
-              <w:jc w:val="left"/>
+              <w:spacing w:before="40" w:after="40"/>
             </w:pPr>
             <w:r>
               <w:rPr>
-                <w:b/>
-                <w:bCs/>
+                <w:rFonts w:ascii="Arial" w:hAnsi="Arial"/>
+                <w:color w:val="2D3748"/>
+                <w:sz w:val="18"/>
               </w:rPr>
-              <w:t xml:space="preserve">ESPACIO CURRICULAR:</w:t>
-            </w:r>
-          </w:p>
-        </w:tc>
-        <w:tc>
-          <w:tcPr/>
-          <w:p>
-            <w:pPr>
-              <w:pStyle w:val="Compact"/>
-              <w:jc w:val="left"/>
-            </w:pPr>
-            <w:r>
-              <w:t xml:space="preserve">Tecnología de la Información para la Gestión (TIG)</w:t>
-            </w:r>
-          </w:p>
-        </w:tc>
-      </w:tr>
-      <w:tr>
-        <w:tc>
-          <w:tcPr/>
-          <w:p>
-            <w:pPr>
-              <w:pStyle w:val="Compact"/>
-              <w:jc w:val="left"/>
-            </w:pPr>
-            <w:r>
-              <w:rPr>
-                <w:b/>
-                <w:bCs/>
-              </w:rPr>
-              <w:t xml:space="preserve">ACTIVIDAD / TEMA:</w:t>
-            </w:r>
-          </w:p>
-        </w:tc>
-        <w:tc>
-          <w:tcPr/>
-          <w:p>
-            <w:pPr>
-              <w:pStyle w:val="Compact"/>
-              <w:jc w:val="left"/>
-            </w:pPr>
-            <w:r>
-              <w:t xml:space="preserve">Actividad Práctica 4 · Tema 2: Nación - Neuquén</w:t>
-            </w:r>
-          </w:p>
-        </w:tc>
-      </w:tr>
-      <w:tr>
-        <w:tc>
-          <w:tcPr/>
-          <w:p>
-            <w:pPr>
-              <w:pStyle w:val="Compact"/>
-              <w:jc w:val="left"/>
-            </w:pPr>
-            <w:r>
-              <w:rPr>
-                <w:b/>
-                <w:bCs/>
-              </w:rPr>
-              <w:t xml:space="preserve">ESTUDIANTE / AUTOR:</w:t>
-            </w:r>
-          </w:p>
-        </w:tc>
-        <w:tc>
-          <w:tcPr/>
-          <w:p>
-            <w:pPr>
-              <w:pStyle w:val="Compact"/>
-              <w:jc w:val="left"/>
-            </w:pPr>
-            <w:r>
-              <w:rPr>
-                <w:b/>
-                <w:bCs/>
-              </w:rPr>
-              <w:t xml:space="preserve">Hector Daniel Ayarachi Fuentes</w:t>
-            </w:r>
-          </w:p>
-        </w:tc>
-      </w:tr>
-      <w:tr>
-        <w:tc>
-          <w:tcPr/>
-          <w:p>
-            <w:pPr>
-              <w:pStyle w:val="Compact"/>
-              <w:jc w:val="left"/>
-            </w:pPr>
-            <w:r>
-              <w:rPr>
-                <w:b/>
-                <w:bCs/>
-              </w:rPr>
-              <w:t xml:space="preserve">FECHA DE PRESENTACIÓN:</w:t>
-            </w:r>
-          </w:p>
-        </w:tc>
-        <w:tc>
-          <w:tcPr/>
-          <w:p>
-            <w:pPr>
-              <w:pStyle w:val="Compact"/>
-              <w:jc w:val="left"/>
-            </w:pPr>
-            <w:r>
-              <w:t xml:space="preserve">2 de Septiembre de 2026</w:t>
-            </w:r>
-          </w:p>
-        </w:tc>
-      </w:tr>
-    </w:tbl>
-    <w:p>
-      <w:r>
-        <w:br w:type="page"/>
-      </w:r>
-    </w:p>
-    <w:bookmarkStart w:id="27" w:name="índice-general"/>
-    <w:p>
-      <w:pPr>
-        <w:pStyle w:val="Heading1"/>
-      </w:pPr>
-      <w:r>
-        <w:t xml:space="preserve">Índice General</w:t>
-      </w:r>
-    </w:p>
-    <w:p xmlns:w="http://schemas.openxmlformats.org/wordprocessingml/2006/main">
-      <w:pPr>
-        <w:tabs>
-          <w:tab w:val="right" w:leader="dot" w:pos="9360"/>
-        </w:tabs>
-        <w:spacing w:before="80" w:after="40"/>
-      </w:pPr>
-      <w:r>
-        <w:rPr>
-          <w:rFonts w:ascii="Arial" w:hAnsi="Arial"/>
-          <w:sz w:val="21"/>
-          <w:b/>
-          <w:color w:val="1A365D"/>
-        </w:rPr>
-        <w:t>1. Introducción y Enfoque Metodológico</w:t>
-      </w:r>
-      <w:r>
-        <w:tab/>
-      </w:r>
-      <w:r>
-        <w:rPr>
-          <w:rFonts w:ascii="Arial" w:hAnsi="Arial"/>
-          <w:sz w:val="21"/>
-          <w:color w:val="4A5568"/>
-        </w:rPr>
-        <w:t>2</w:t>
-      </w:r>
-    </w:p>
-    <w:p xmlns:w="http://schemas.openxmlformats.org/wordprocessingml/2006/main">
-      <w:pPr>
-        <w:tabs>
-          <w:tab w:val="right" w:leader="dot" w:pos="9360"/>
-        </w:tabs>
-        <w:spacing w:before="80" w:after="40"/>
-      </w:pPr>
-      <w:r>
-        <w:rPr>
-          <w:rFonts w:ascii="Arial" w:hAnsi="Arial"/>
-          <w:sz w:val="21"/>
-          <w:b/>
-          <w:color w:val="1A365D"/>
-        </w:rPr>
-        <w:t>2. Descripción Analítica de los Portales Base</w:t>
-      </w:r>
-      <w:r>
-        <w:tab/>
-      </w:r>
-      <w:r>
-        <w:rPr>
-          <w:rFonts w:ascii="Arial" w:hAnsi="Arial"/>
-          <w:sz w:val="21"/>
-          <w:color w:val="4A5568"/>
-        </w:rPr>
-        <w:t>2</w:t>
-      </w:r>
-    </w:p>
-    <w:p xmlns:w="http://schemas.openxmlformats.org/wordprocessingml/2006/main">
-      <w:pPr>
-        <w:ind w:left="280"/>
-        <w:tabs>
-          <w:tab w:val="right" w:leader="dot" w:pos="9360"/>
-        </w:tabs>
-        <w:spacing w:before="30" w:after="30"/>
-      </w:pPr>
-      <w:r>
-        <w:rPr>
-          <w:rFonts w:ascii="Arial" w:hAnsi="Arial"/>
-          <w:sz w:val="20"/>
-          <w:color w:val="0E6873"/>
-        </w:rPr>
-        <w:t>2.1. Portal Nacional: Observatorio de la Administración Pública (INAP)</w:t>
-      </w:r>
-      <w:r>
-        <w:tab/>
-      </w:r>
-      <w:r>
-        <w:rPr>
-          <w:rFonts w:ascii="Arial" w:hAnsi="Arial"/>
-          <w:sz w:val="20"/>
-          <w:color w:val="4A5568"/>
-        </w:rPr>
-        <w:t>3</w:t>
-      </w:r>
-    </w:p>
-    <w:p xmlns:w="http://schemas.openxmlformats.org/wordprocessingml/2006/main">
-      <w:pPr>
-        <w:ind w:left="560"/>
-        <w:tabs>
-          <w:tab w:val="right" w:leader="dot" w:pos="9360"/>
-        </w:tabs>
-        <w:spacing w:before="20" w:after="20"/>
-      </w:pPr>
-      <w:r>
-        <w:rPr>
-          <w:rFonts w:ascii="Arial" w:hAnsi="Arial"/>
-          <w:sz w:val="19"/>
-          <w:color w:val="2D3748"/>
-        </w:rPr>
-        <w:t>A. Gobierno Digital</w:t>
-      </w:r>
-      <w:r>
-        <w:tab/>
-      </w:r>
-      <w:r>
-        <w:rPr>
-          <w:rFonts w:ascii="Arial" w:hAnsi="Arial"/>
-          <w:sz w:val="19"/>
-          <w:color w:val="4A5568"/>
-        </w:rPr>
-        <w:t>3</w:t>
-      </w:r>
-    </w:p>
-    <w:p xmlns:w="http://schemas.openxmlformats.org/wordprocessingml/2006/main">
-      <w:pPr>
-        <w:ind w:left="560"/>
-        <w:tabs>
-          <w:tab w:val="right" w:leader="dot" w:pos="9360"/>
-        </w:tabs>
-        <w:spacing w:before="20" w:after="20"/>
-      </w:pPr>
-      <w:r>
-        <w:rPr>
-          <w:rFonts w:ascii="Arial" w:hAnsi="Arial"/>
-          <w:sz w:val="19"/>
-          <w:color w:val="2D3748"/>
-        </w:rPr>
-        <w:t>B. País Digital</w:t>
-      </w:r>
-      <w:r>
-        <w:tab/>
-      </w:r>
-      <w:r>
-        <w:rPr>
-          <w:rFonts w:ascii="Arial" w:hAnsi="Arial"/>
-          <w:sz w:val="19"/>
-          <w:color w:val="4A5568"/>
-        </w:rPr>
-        <w:t>3</w:t>
-      </w:r>
-    </w:p>
-    <w:p xmlns:w="http://schemas.openxmlformats.org/wordprocessingml/2006/main">
-      <w:pPr>
-        <w:ind w:left="560"/>
-        <w:tabs>
-          <w:tab w:val="right" w:leader="dot" w:pos="9360"/>
-        </w:tabs>
-        <w:spacing w:before="20" w:after="20"/>
-      </w:pPr>
-      <w:r>
-        <w:rPr>
-          <w:rFonts w:ascii="Arial" w:hAnsi="Arial"/>
-          <w:sz w:val="19"/>
-          <w:color w:val="2D3748"/>
-        </w:rPr>
-        <w:t>C. Gobierno Abierto</w:t>
-      </w:r>
-      <w:r>
-        <w:tab/>
-      </w:r>
-      <w:r>
-        <w:rPr>
-          <w:rFonts w:ascii="Arial" w:hAnsi="Arial"/>
-          <w:sz w:val="19"/>
-          <w:color w:val="4A5568"/>
-        </w:rPr>
-        <w:t>3</w:t>
-      </w:r>
-    </w:p>
-    <w:p xmlns:w="http://schemas.openxmlformats.org/wordprocessingml/2006/main">
-      <w:pPr>
-        <w:ind w:left="560"/>
-        <w:tabs>
-          <w:tab w:val="right" w:leader="dot" w:pos="9360"/>
-        </w:tabs>
-        <w:spacing w:before="20" w:after="20"/>
-      </w:pPr>
-      <w:r>
-        <w:rPr>
-          <w:rFonts w:ascii="Arial" w:hAnsi="Arial"/>
-          <w:sz w:val="19"/>
-          <w:color w:val="2D3748"/>
-        </w:rPr>
-        <w:t>D. Gestión Integral del Empleo Público</w:t>
-      </w:r>
-      <w:r>
-        <w:tab/>
-      </w:r>
-      <w:r>
-        <w:rPr>
-          <w:rFonts w:ascii="Arial" w:hAnsi="Arial"/>
-          <w:sz w:val="19"/>
-          <w:color w:val="4A5568"/>
-        </w:rPr>
-        <w:t>4</w:t>
-      </w:r>
-    </w:p>
-    <w:p xmlns:w="http://schemas.openxmlformats.org/wordprocessingml/2006/main">
-      <w:pPr>
-        <w:ind w:left="280"/>
-        <w:tabs>
-          <w:tab w:val="right" w:leader="dot" w:pos="9360"/>
-        </w:tabs>
-        <w:spacing w:before="30" w:after="30"/>
-      </w:pPr>
-      <w:r>
-        <w:rPr>
-          <w:rFonts w:ascii="Arial" w:hAnsi="Arial"/>
-          <w:sz w:val="20"/>
-          <w:color w:val="0E6873"/>
-        </w:rPr>
-        <w:t>2.2. Portal Subnacional: Secretaría de Modernización (Ciudad de Neuquén)</w:t>
-      </w:r>
-      <w:r>
-        <w:tab/>
-      </w:r>
-      <w:r>
-        <w:rPr>
-          <w:rFonts w:ascii="Arial" w:hAnsi="Arial"/>
-          <w:sz w:val="20"/>
-          <w:color w:val="4A5568"/>
-        </w:rPr>
-        <w:t>4</w:t>
-      </w:r>
-    </w:p>
-    <w:p xmlns:w="http://schemas.openxmlformats.org/wordprocessingml/2006/main">
-      <w:pPr>
-        <w:tabs>
-          <w:tab w:val="right" w:leader="dot" w:pos="9360"/>
-        </w:tabs>
-        <w:spacing w:before="80" w:after="40"/>
-      </w:pPr>
-      <w:r>
-        <w:rPr>
-          <w:rFonts w:ascii="Arial" w:hAnsi="Arial"/>
-          <w:sz w:val="21"/>
-          <w:b/>
-          <w:color w:val="1A365D"/>
-        </w:rPr>
-        <w:t>3. Análisis Comparativo Multidimensional: Nación vs. Neuquén</w:t>
-      </w:r>
-      <w:r>
-        <w:tab/>
-      </w:r>
-      <w:r>
-        <w:rPr>
-          <w:rFonts w:ascii="Arial" w:hAnsi="Arial"/>
-          <w:sz w:val="21"/>
-          <w:color w:val="4A5568"/>
-        </w:rPr>
-        <w:t>5</w:t>
-      </w:r>
-    </w:p>
-    <w:p xmlns:w="http://schemas.openxmlformats.org/wordprocessingml/2006/main">
-      <w:pPr>
-        <w:ind w:left="280"/>
-        <w:tabs>
-          <w:tab w:val="right" w:leader="dot" w:pos="9360"/>
-        </w:tabs>
-        <w:spacing w:before="30" w:after="30"/>
-      </w:pPr>
-      <w:r>
-        <w:rPr>
-          <w:rFonts w:ascii="Arial" w:hAnsi="Arial"/>
-          <w:sz w:val="20"/>
-          <w:color w:val="0E6873"/>
-        </w:rPr>
-        <w:t>3.1. Convergencias y Puntos de Encuentro</w:t>
-      </w:r>
-      <w:r>
-        <w:tab/>
-      </w:r>
-      <w:r>
-        <w:rPr>
-          <w:rFonts w:ascii="Arial" w:hAnsi="Arial"/>
-          <w:sz w:val="20"/>
-          <w:color w:val="4A5568"/>
-        </w:rPr>
-        <w:t>6</w:t>
-      </w:r>
-    </w:p>
-    <w:p xmlns:w="http://schemas.openxmlformats.org/wordprocessingml/2006/main">
-      <w:pPr>
-        <w:ind w:left="280"/>
-        <w:tabs>
-          <w:tab w:val="right" w:leader="dot" w:pos="9360"/>
-        </w:tabs>
-        <w:spacing w:before="30" w:after="30"/>
-      </w:pPr>
-      <w:r>
-        <w:rPr>
-          <w:rFonts w:ascii="Arial" w:hAnsi="Arial"/>
-          <w:sz w:val="20"/>
-          <w:color w:val="0E6873"/>
-        </w:rPr>
-        <w:t>3.2. Asimetrías y Desafíos de Integración Federal</w:t>
-      </w:r>
-      <w:r>
-        <w:tab/>
-      </w:r>
-      <w:r>
-        <w:rPr>
-          <w:rFonts w:ascii="Arial" w:hAnsi="Arial"/>
-          <w:sz w:val="20"/>
-          <w:color w:val="4A5568"/>
-        </w:rPr>
-        <w:t>6</w:t>
-      </w:r>
-    </w:p>
-    <w:p xmlns:w="http://schemas.openxmlformats.org/wordprocessingml/2006/main">
-      <w:pPr>
-        <w:tabs>
-          <w:tab w:val="right" w:leader="dot" w:pos="9360"/>
-        </w:tabs>
-        <w:spacing w:before="80" w:after="40"/>
-      </w:pPr>
-      <w:r>
-        <w:rPr>
-          <w:rFonts w:ascii="Arial" w:hAnsi="Arial"/>
-          <w:sz w:val="21"/>
-          <w:b/>
-          <w:color w:val="1A365D"/>
-        </w:rPr>
-        <w:t>4. Conclusiones y Recomendaciones de Política Pública</w:t>
-      </w:r>
-      <w:r>
-        <w:tab/>
-      </w:r>
-      <w:r>
-        <w:rPr>
-          <w:rFonts w:ascii="Arial" w:hAnsi="Arial"/>
-          <w:sz w:val="21"/>
-          <w:color w:val="4A5568"/>
-        </w:rPr>
-        <w:t>7</w:t>
-      </w:r>
-    </w:p>
-    <w:p xmlns:w="http://schemas.openxmlformats.org/wordprocessingml/2006/main">
-      <w:pPr>
-        <w:tabs>
-          <w:tab w:val="right" w:leader="dot" w:pos="9360"/>
-        </w:tabs>
-        <w:spacing w:before="80" w:after="40"/>
-      </w:pPr>
-      <w:r>
-        <w:rPr>
-          <w:rFonts w:ascii="Arial" w:hAnsi="Arial"/>
-          <w:sz w:val="21"/>
-          <w:b/>
-          <w:color w:val="1A365D"/>
-        </w:rPr>
-        <w:t>5. Referencias Bibliográficas y Fuentes Oficiales</w:t>
-      </w:r>
-      <w:r>
-        <w:tab/>
-      </w:r>
-      <w:r>
-        <w:rPr>
-          <w:rFonts w:ascii="Arial" w:hAnsi="Arial"/>
-          <w:sz w:val="21"/>
-          <w:color w:val="4A5568"/>
-        </w:rPr>
-        <w:t>8</w:t>
-      </w:r>
-    </w:p>
-    <w:p>
-      <w:r>
-        <w:br w:type="page"/>
-      </w:r>
-    </w:p>
-    <w:bookmarkEnd w:id="27"/>
-    <w:bookmarkStart w:id="31" w:name="introducción-y-enfoque-metodológico"/>
-    <w:p>
-      <w:pPr>
-        <w:pStyle w:val="Heading1"/>
-      </w:pPr>
-      <w:r>
-        <w:t xml:space="preserve">1. Introducción y Enfoque Metodológico</w:t>
-      </w:r>
-    </w:p>
-    <w:p>
-      <w:pPr>
-        <w:pStyle w:val="FirstParagraph"/>
-      </w:pPr>
-      <w:r>
-        <w:t xml:space="preserve">La transformación digital del sector público constituye uno de los procesos contemporáneos de mayor relevancia para el fortalecimiento de la gobernabilidad democrática, la transparencia institucional y la eficiencia en la asignación de recursos públicos. Lejos de reducirse a la simple digitalización de expedientes físicos o a la adquisición masiva de hardware, la modernización del Estado implica un cambio de paradigma organizacional y cultural en el cual las</w:t>
-      </w:r>
-      <w:r>
-        <w:t xml:space="preserve"> </w:t>
-      </w:r>
-      <w:r>
-        <w:rPr>
-          <w:b/>
-          <w:bCs/>
-        </w:rPr>
-        <w:t xml:space="preserve">Tecnologías de la Información y la Comunicación (TICs)</w:t>
-      </w:r>
-      <w:r>
-        <w:t xml:space="preserve"> </w:t>
-      </w:r>
-      <w:r>
-        <w:t xml:space="preserve">actúan como habilitadores estratégicos orientados a resolver las demandas ciudadanas con mayor agilidad, cercanía y trazabilidad.</w:t>
-      </w:r>
-    </w:p>
-    <w:p>
-      <w:pPr>
-        <w:pStyle w:val="BodyText"/>
-      </w:pPr>
-      <w:r>
-        <w:t xml:space="preserve">En el marco de la cátedra</w:t>
-      </w:r>
-      <w:r>
-        <w:t xml:space="preserve"> </w:t>
-      </w:r>
-      <w:r>
-        <w:rPr>
-          <w:i/>
-          <w:iCs/>
-        </w:rPr>
-        <w:t xml:space="preserve">Tecnología de la Información para la Gestión (TIG)</w:t>
-      </w:r>
-      <w:r>
-        <w:t xml:space="preserve"> </w:t>
-      </w:r>
-      <w:r>
-        <w:t xml:space="preserve">del CURZAS (Universidad Nacional del Comahue), el presente informe aborda el</w:t>
-      </w:r>
-      <w:r>
-        <w:t xml:space="preserve"> </w:t>
-      </w:r>
-      <w:r>
-        <w:rPr>
-          <w:b/>
-          <w:bCs/>
-        </w:rPr>
-        <w:t xml:space="preserve">Tema 2</w:t>
-      </w:r>
-      <w:r>
-        <w:t xml:space="preserve"> </w:t>
-      </w:r>
-      <w:r>
-        <w:t xml:space="preserve">propuesto en las consignas de la Actividad Práctica 4:</w:t>
-      </w:r>
-      <w:r>
-        <w:t xml:space="preserve"> </w:t>
-      </w:r>
-      <w:r>
-        <w:rPr>
-          <w:b/>
-          <w:bCs/>
-        </w:rPr>
-        <w:t xml:space="preserve">Nación - Neuquén</w:t>
-      </w:r>
-      <w:r>
-        <w:t xml:space="preserve">.</w:t>
-      </w:r>
-    </w:p>
-    <w:tbl>
-      <w:tblPr>
-        <w:tblStyle w:val="Table"/>
-        <w:tblLook w:firstRow="0" w:lastRow="0" w:firstColumn="0" w:lastColumn="0" w:noHBand="0" w:noVBand="0" w:val="0000"/>
-        <w:tblBorders>
-          <w:top w:val="single" w:sz="4" w:space="0" w:color="00A047"/>
-          <w:left w:val="single" w:sz="24" w:space="0" w:color="00A047"/>
-          <w:bottom w:val="single" w:sz="4" w:space="0" w:color="00A047"/>
-          <w:right w:val="single" w:sz="4" w:space="0" w:color="00A047"/>
-        </w:tblBorders>
-        <w:tblCellMar>
-          <w:left w:w="144" w:type="dxa"/>
-          <w:right w:w="144" w:type="dxa"/>
-        </w:tblCellMar>
-        <w:tblLook w:firstRow="0" w:lastRow="0" w:firstColumn="0" w:lastColumn="0" w:noHBand="0" w:noVBand="0" w:val="0000"/>
-      </w:tblPr>
-      <w:tr>
-        <w:trPr>
-          <w:cantSplit/>
-        </w:trPr>
-        <w:tc>
-          <w:tcPr>
-            <w:shd w:color="auto" w:fill="ccf1e3" w:val="clear"/>
-            <w:tcMar>
-              <w:top w:w="92" w:type="dxa"/>
-              <w:bottom w:w="92" w:type="dxa"/>
-            </w:tcMar>
-          </w:tcPr>
-          <w:p>
-            <w:pPr>
-              <w:pStyle w:val="BodyText"/>
-            </w:pPr>
-            <w:pPr>
-              <w:spacing w:before="0" w:after="0"/>
-              <w:textAlignment w:val="center"/>
-            </w:pPr>
-            <w:r>
-              <w:drawing>
-                <wp:inline>
-                  <wp:extent cx="152400" cy="152400"/>
-                  <wp:effectExtent b="0" l="0" r="0" t="0"/>
-                  <wp:docPr descr="" title="" id="29" name="Picture"/>
-                  <a:graphic>
-                    <a:graphicData uri="http://schemas.openxmlformats.org/drawingml/2006/picture">
-                      <pic:pic>
-                        <pic:nvPicPr>
-                          <pic:cNvPr descr="C:\Users\Ramoncito\AppData\Local\Programs\Quarto\share\formats\docx\tip.png" id="30" name="Picture"/>
-                          <pic:cNvPicPr>
-                            <a:picLocks noChangeArrowheads="1" noChangeAspect="1"/>
-                          </pic:cNvPicPr>
-                        </pic:nvPicPr>
-                        <pic:blipFill>
-                          <a:blip r:embed="rId28"/>
-                          <a:stretch>
-                            <a:fillRect/>
-                          </a:stretch>
-                        </pic:blipFill>
-                        <pic:spPr bwMode="auto">
-                          <a:xfrm>
-                            <a:off x="0" y="0"/>
-                            <a:ext cx="152400" cy="152400"/>
-                          </a:xfrm>
-                          <a:prstGeom prst="rect">
-                            <a:avLst/>
-                          </a:prstGeom>
-                          <a:noFill/>
-                          <a:ln w="9525">
-                            <a:noFill/>
-                            <a:headEnd/>
-                            <a:tailEnd/>
-                          </a:ln>
-                        </pic:spPr>
-                      </pic:pic>
-                    </a:graphicData>
-                  </a:graphic>
-                </wp:inline>
-              </w:drawing>
-            </w:r>
-            <w:r>
-              <w:t xml:space="preserve"> </w:t>
-            </w:r>
-            <w:r>
-              <w:t xml:space="preserve"> </w:t>
-            </w:r>
-            <w:r>
-              <w:t xml:space="preserve">Objetivo Académico</w:t>
+              <w:t>Tecnología de la Información para la Gestión (TIG)</w:t>
             </w:r>
           </w:p>
         </w:tc>
@@ -929,23 +265,670 @@
         </w:trPr>
         <w:tc>
           <w:tcPr>
-            <w:tcMar>
-              <w:top w:w="108" w:type="dxa"/>
-              <w:bottom w:w="108" w:type="dxa"/>
-            </w:tcMar>
+            <w:tcW w:w="3200" w:type="dxa"/>
+            <w:shd w:val="clear" w:color="auto" w:fill="F2F7F7"/>
           </w:tcPr>
           <w:p>
             <w:pPr>
-              <w:pStyle w:val="BodyText"/>
-            </w:pPr>
-            <w:pPr>
-              <w:spacing w:before="16" w:after="16"/>
+              <w:pStyle w:val="Compact"/>
+              <w:spacing w:before="40" w:after="40"/>
             </w:pPr>
             <w:r>
-              <w:t xml:space="preserve">Investigar, describir y analizar críticamente los portales gubernamentales de referencia (INAP Nación y Secretaría de Modernización de Neuquén Capital), estructurando una matriz comparativa multidimensional rigurosa entre las directrices estratégicas de la Administración Pública Nacional y las iniciativas subnacionales de proximidad ciudadana implementadas en la capital neuquina.</w:t>
+              <w:rPr>
+                <w:rFonts w:ascii="Arial" w:hAnsi="Arial"/>
+                <w:b/>
+                <w:color w:val="0E6873"/>
+                <w:sz w:val="18"/>
+              </w:rPr>
+              <w:t>ACTIVIDAD / TEMA:</w:t>
             </w:r>
           </w:p>
-          <w:p/>
+        </w:tc>
+        <w:tc>
+          <w:tcPr>
+            <w:tcW w:w="6160" w:type="dxa"/>
+            <w:shd w:val="clear" w:color="auto" w:fill="F2F7F7"/>
+          </w:tcPr>
+          <w:p>
+            <w:pPr>
+              <w:pStyle w:val="Compact"/>
+              <w:spacing w:before="40" w:after="40"/>
+            </w:pPr>
+            <w:r>
+              <w:rPr>
+                <w:rFonts w:ascii="Arial" w:hAnsi="Arial"/>
+                <w:color w:val="2D3748"/>
+                <w:sz w:val="18"/>
+              </w:rPr>
+              <w:t>Actividad Práctica 4 · Tema 2: Nación - Neuquén</w:t>
+            </w:r>
+          </w:p>
+        </w:tc>
+      </w:tr>
+      <w:tr>
+        <w:trPr>
+          <w:cantSplit/>
+        </w:trPr>
+        <w:tc>
+          <w:tcPr>
+            <w:tcW w:w="3200" w:type="dxa"/>
+            <w:shd w:val="clear" w:color="auto" w:fill="F2F7F7"/>
+          </w:tcPr>
+          <w:p>
+            <w:pPr>
+              <w:pStyle w:val="Compact"/>
+              <w:spacing w:before="40" w:after="40"/>
+            </w:pPr>
+            <w:r>
+              <w:rPr>
+                <w:rFonts w:ascii="Arial" w:hAnsi="Arial"/>
+                <w:b/>
+                <w:color w:val="0E6873"/>
+                <w:sz w:val="18"/>
+              </w:rPr>
+              <w:t>ESTUDIANTE / AUTOR:</w:t>
+            </w:r>
+          </w:p>
+        </w:tc>
+        <w:tc>
+          <w:tcPr>
+            <w:tcW w:w="6160" w:type="dxa"/>
+            <w:shd w:val="clear" w:color="auto" w:fill="F2F7F7"/>
+          </w:tcPr>
+          <w:p>
+            <w:pPr>
+              <w:pStyle w:val="Compact"/>
+              <w:spacing w:before="40" w:after="40"/>
+            </w:pPr>
+            <w:r>
+              <w:rPr>
+                <w:rFonts w:ascii="Arial" w:hAnsi="Arial"/>
+                <w:b/>
+                <w:color w:val="153E5C"/>
+                <w:sz w:val="18"/>
+              </w:rPr>
+              <w:t>Hector Daniel Ayarachi Fuentes</w:t>
+            </w:r>
+          </w:p>
+        </w:tc>
+      </w:tr>
+      <w:tr>
+        <w:trPr>
+          <w:cantSplit/>
+        </w:trPr>
+        <w:tc>
+          <w:tcPr>
+            <w:tcW w:w="3200" w:type="dxa"/>
+            <w:shd w:val="clear" w:color="auto" w:fill="F2F7F7"/>
+          </w:tcPr>
+          <w:p>
+            <w:pPr>
+              <w:pStyle w:val="Compact"/>
+              <w:spacing w:before="40" w:after="40"/>
+            </w:pPr>
+            <w:r>
+              <w:rPr>
+                <w:rFonts w:ascii="Arial" w:hAnsi="Arial"/>
+                <w:b/>
+                <w:color w:val="0E6873"/>
+                <w:sz w:val="18"/>
+              </w:rPr>
+              <w:t>FECHA DE PRESENTACIÓN:</w:t>
+            </w:r>
+          </w:p>
+        </w:tc>
+        <w:tc>
+          <w:tcPr>
+            <w:tcW w:w="6160" w:type="dxa"/>
+            <w:shd w:val="clear" w:color="auto" w:fill="F2F7F7"/>
+          </w:tcPr>
+          <w:p>
+            <w:pPr>
+              <w:pStyle w:val="Compact"/>
+              <w:spacing w:before="40" w:after="40"/>
+            </w:pPr>
+            <w:r>
+              <w:rPr>
+                <w:rFonts w:ascii="Arial" w:hAnsi="Arial"/>
+                <w:color w:val="2D3748"/>
+                <w:sz w:val="18"/>
+              </w:rPr>
+              <w:t>2 de Septiembre de 2026</w:t>
+            </w:r>
+          </w:p>
+        </w:tc>
+      </w:tr>
+    </w:tbl>
+    <w:p>
+      <w:r>
+        <w:br w:type="page"/>
+      </w:r>
+    </w:p>
+    <w:bookmarkStart w:id="24" w:name="índice-general"/>
+    <w:p>
+      <w:pPr>
+        <w:pStyle w:val="Heading1"/>
+      </w:pPr>
+      <w:r>
+        <w:t xml:space="preserve">Índice General</w:t>
+      </w:r>
+    </w:p>
+    <w:p xmlns:w="http://schemas.openxmlformats.org/wordprocessingml/2006/main">
+      <w:pPr>
+        <w:tabs>
+          <w:tab w:val="right" w:leader="dot" w:pos="9360"/>
+        </w:tabs>
+        <w:spacing w:before="80" w:after="40"/>
+      </w:pPr>
+      <w:r>
+        <w:rPr>
+          <w:rFonts w:ascii="Arial" w:hAnsi="Arial"/>
+          <w:sz w:val="21"/>
+          <w:b/>
+          <w:color w:val="1A365D"/>
+        </w:rPr>
+        <w:t>1. Introducción y Enfoque Metodológico</w:t>
+      </w:r>
+      <w:r>
+        <w:tab/>
+      </w:r>
+      <w:r>
+        <w:rPr>
+          <w:rFonts w:ascii="Arial" w:hAnsi="Arial"/>
+          <w:sz w:val="21"/>
+          <w:color w:val="4A5568"/>
+        </w:rPr>
+        <w:t>2</w:t>
+      </w:r>
+    </w:p>
+    <w:p xmlns:w="http://schemas.openxmlformats.org/wordprocessingml/2006/main">
+      <w:pPr>
+        <w:tabs>
+          <w:tab w:val="right" w:leader="dot" w:pos="9360"/>
+        </w:tabs>
+        <w:spacing w:before="80" w:after="40"/>
+      </w:pPr>
+      <w:r>
+        <w:rPr>
+          <w:rFonts w:ascii="Arial" w:hAnsi="Arial"/>
+          <w:sz w:val="21"/>
+          <w:b/>
+          <w:color w:val="1A365D"/>
+        </w:rPr>
+        <w:t>2. Descripción Analítica de los Portales Base</w:t>
+      </w:r>
+      <w:r>
+        <w:tab/>
+      </w:r>
+      <w:r>
+        <w:rPr>
+          <w:rFonts w:ascii="Arial" w:hAnsi="Arial"/>
+          <w:sz w:val="21"/>
+          <w:color w:val="4A5568"/>
+        </w:rPr>
+        <w:t>2</w:t>
+      </w:r>
+    </w:p>
+    <w:p xmlns:w="http://schemas.openxmlformats.org/wordprocessingml/2006/main">
+      <w:pPr>
+        <w:ind w:left="280"/>
+        <w:tabs>
+          <w:tab w:val="right" w:leader="dot" w:pos="9360"/>
+        </w:tabs>
+        <w:spacing w:before="30" w:after="30"/>
+      </w:pPr>
+      <w:r>
+        <w:rPr>
+          <w:rFonts w:ascii="Arial" w:hAnsi="Arial"/>
+          <w:sz w:val="20"/>
+          <w:color w:val="0E6873"/>
+        </w:rPr>
+        <w:t>2.1. Portal Nacional: Observatorio de la Administración Pública (INAP)</w:t>
+      </w:r>
+      <w:r>
+        <w:tab/>
+      </w:r>
+      <w:r>
+        <w:rPr>
+          <w:rFonts w:ascii="Arial" w:hAnsi="Arial"/>
+          <w:sz w:val="20"/>
+          <w:color w:val="4A5568"/>
+        </w:rPr>
+        <w:t>3</w:t>
+      </w:r>
+    </w:p>
+    <w:p xmlns:w="http://schemas.openxmlformats.org/wordprocessingml/2006/main">
+      <w:pPr>
+        <w:ind w:left="560"/>
+        <w:tabs>
+          <w:tab w:val="right" w:leader="dot" w:pos="9360"/>
+        </w:tabs>
+        <w:spacing w:before="20" w:after="20"/>
+      </w:pPr>
+      <w:r>
+        <w:rPr>
+          <w:rFonts w:ascii="Arial" w:hAnsi="Arial"/>
+          <w:sz w:val="19"/>
+          <w:color w:val="2D3748"/>
+        </w:rPr>
+        <w:t>A. Gobierno Digital</w:t>
+      </w:r>
+      <w:r>
+        <w:tab/>
+      </w:r>
+      <w:r>
+        <w:rPr>
+          <w:rFonts w:ascii="Arial" w:hAnsi="Arial"/>
+          <w:sz w:val="19"/>
+          <w:color w:val="4A5568"/>
+        </w:rPr>
+        <w:t>3</w:t>
+      </w:r>
+    </w:p>
+    <w:p xmlns:w="http://schemas.openxmlformats.org/wordprocessingml/2006/main">
+      <w:pPr>
+        <w:ind w:left="560"/>
+        <w:tabs>
+          <w:tab w:val="right" w:leader="dot" w:pos="9360"/>
+        </w:tabs>
+        <w:spacing w:before="20" w:after="20"/>
+      </w:pPr>
+      <w:r>
+        <w:rPr>
+          <w:rFonts w:ascii="Arial" w:hAnsi="Arial"/>
+          <w:sz w:val="19"/>
+          <w:color w:val="2D3748"/>
+        </w:rPr>
+        <w:t>B. País Digital</w:t>
+      </w:r>
+      <w:r>
+        <w:tab/>
+      </w:r>
+      <w:r>
+        <w:rPr>
+          <w:rFonts w:ascii="Arial" w:hAnsi="Arial"/>
+          <w:sz w:val="19"/>
+          <w:color w:val="4A5568"/>
+        </w:rPr>
+        <w:t>3</w:t>
+      </w:r>
+    </w:p>
+    <w:p xmlns:w="http://schemas.openxmlformats.org/wordprocessingml/2006/main">
+      <w:pPr>
+        <w:ind w:left="560"/>
+        <w:tabs>
+          <w:tab w:val="right" w:leader="dot" w:pos="9360"/>
+        </w:tabs>
+        <w:spacing w:before="20" w:after="20"/>
+      </w:pPr>
+      <w:r>
+        <w:rPr>
+          <w:rFonts w:ascii="Arial" w:hAnsi="Arial"/>
+          <w:sz w:val="19"/>
+          <w:color w:val="2D3748"/>
+        </w:rPr>
+        <w:t>C. Gobierno Abierto</w:t>
+      </w:r>
+      <w:r>
+        <w:tab/>
+      </w:r>
+      <w:r>
+        <w:rPr>
+          <w:rFonts w:ascii="Arial" w:hAnsi="Arial"/>
+          <w:sz w:val="19"/>
+          <w:color w:val="4A5568"/>
+        </w:rPr>
+        <w:t>3</w:t>
+      </w:r>
+    </w:p>
+    <w:p xmlns:w="http://schemas.openxmlformats.org/wordprocessingml/2006/main">
+      <w:pPr>
+        <w:ind w:left="560"/>
+        <w:tabs>
+          <w:tab w:val="right" w:leader="dot" w:pos="9360"/>
+        </w:tabs>
+        <w:spacing w:before="20" w:after="20"/>
+      </w:pPr>
+      <w:r>
+        <w:rPr>
+          <w:rFonts w:ascii="Arial" w:hAnsi="Arial"/>
+          <w:sz w:val="19"/>
+          <w:color w:val="2D3748"/>
+        </w:rPr>
+        <w:t>D. Gestión Integral del Empleo Público</w:t>
+      </w:r>
+      <w:r>
+        <w:tab/>
+      </w:r>
+      <w:r>
+        <w:rPr>
+          <w:rFonts w:ascii="Arial" w:hAnsi="Arial"/>
+          <w:sz w:val="19"/>
+          <w:color w:val="4A5568"/>
+        </w:rPr>
+        <w:t>4</w:t>
+      </w:r>
+    </w:p>
+    <w:p xmlns:w="http://schemas.openxmlformats.org/wordprocessingml/2006/main">
+      <w:pPr>
+        <w:ind w:left="280"/>
+        <w:tabs>
+          <w:tab w:val="right" w:leader="dot" w:pos="9360"/>
+        </w:tabs>
+        <w:spacing w:before="30" w:after="30"/>
+      </w:pPr>
+      <w:r>
+        <w:rPr>
+          <w:rFonts w:ascii="Arial" w:hAnsi="Arial"/>
+          <w:sz w:val="20"/>
+          <w:color w:val="0E6873"/>
+        </w:rPr>
+        <w:t>2.2. Portal Subnacional: Secretaría de Modernización (Ciudad de Neuquén)</w:t>
+      </w:r>
+      <w:r>
+        <w:tab/>
+      </w:r>
+      <w:r>
+        <w:rPr>
+          <w:rFonts w:ascii="Arial" w:hAnsi="Arial"/>
+          <w:sz w:val="20"/>
+          <w:color w:val="4A5568"/>
+        </w:rPr>
+        <w:t>4</w:t>
+      </w:r>
+    </w:p>
+    <w:p xmlns:w="http://schemas.openxmlformats.org/wordprocessingml/2006/main">
+      <w:pPr>
+        <w:tabs>
+          <w:tab w:val="right" w:leader="dot" w:pos="9360"/>
+        </w:tabs>
+        <w:spacing w:before="80" w:after="40"/>
+      </w:pPr>
+      <w:r>
+        <w:rPr>
+          <w:rFonts w:ascii="Arial" w:hAnsi="Arial"/>
+          <w:sz w:val="21"/>
+          <w:b/>
+          <w:color w:val="1A365D"/>
+        </w:rPr>
+        <w:t>3. Análisis Comparativo Multidimensional: Nación vs. Neuquén</w:t>
+      </w:r>
+      <w:r>
+        <w:tab/>
+      </w:r>
+      <w:r>
+        <w:rPr>
+          <w:rFonts w:ascii="Arial" w:hAnsi="Arial"/>
+          <w:sz w:val="21"/>
+          <w:color w:val="4A5568"/>
+        </w:rPr>
+        <w:t>5</w:t>
+      </w:r>
+    </w:p>
+    <w:p xmlns:w="http://schemas.openxmlformats.org/wordprocessingml/2006/main">
+      <w:pPr>
+        <w:ind w:left="280"/>
+        <w:tabs>
+          <w:tab w:val="right" w:leader="dot" w:pos="9360"/>
+        </w:tabs>
+        <w:spacing w:before="30" w:after="30"/>
+      </w:pPr>
+      <w:r>
+        <w:rPr>
+          <w:rFonts w:ascii="Arial" w:hAnsi="Arial"/>
+          <w:sz w:val="20"/>
+          <w:color w:val="0E6873"/>
+        </w:rPr>
+        <w:t>3.1. Convergencias y Puntos de Encuentro</w:t>
+      </w:r>
+      <w:r>
+        <w:tab/>
+      </w:r>
+      <w:r>
+        <w:rPr>
+          <w:rFonts w:ascii="Arial" w:hAnsi="Arial"/>
+          <w:sz w:val="20"/>
+          <w:color w:val="4A5568"/>
+        </w:rPr>
+        <w:t>6</w:t>
+      </w:r>
+    </w:p>
+    <w:p xmlns:w="http://schemas.openxmlformats.org/wordprocessingml/2006/main">
+      <w:pPr>
+        <w:ind w:left="280"/>
+        <w:tabs>
+          <w:tab w:val="right" w:leader="dot" w:pos="9360"/>
+        </w:tabs>
+        <w:spacing w:before="30" w:after="30"/>
+      </w:pPr>
+      <w:r>
+        <w:rPr>
+          <w:rFonts w:ascii="Arial" w:hAnsi="Arial"/>
+          <w:sz w:val="20"/>
+          <w:color w:val="0E6873"/>
+        </w:rPr>
+        <w:t>3.2. Asimetrías y Desafíos de Integración Federal</w:t>
+      </w:r>
+      <w:r>
+        <w:tab/>
+      </w:r>
+      <w:r>
+        <w:rPr>
+          <w:rFonts w:ascii="Arial" w:hAnsi="Arial"/>
+          <w:sz w:val="20"/>
+          <w:color w:val="4A5568"/>
+        </w:rPr>
+        <w:t>6</w:t>
+      </w:r>
+    </w:p>
+    <w:p xmlns:w="http://schemas.openxmlformats.org/wordprocessingml/2006/main">
+      <w:pPr>
+        <w:tabs>
+          <w:tab w:val="right" w:leader="dot" w:pos="9360"/>
+        </w:tabs>
+        <w:spacing w:before="80" w:after="40"/>
+      </w:pPr>
+      <w:r>
+        <w:rPr>
+          <w:rFonts w:ascii="Arial" w:hAnsi="Arial"/>
+          <w:sz w:val="21"/>
+          <w:b/>
+          <w:color w:val="1A365D"/>
+        </w:rPr>
+        <w:t>4. Conclusiones y Recomendaciones de Política Pública</w:t>
+      </w:r>
+      <w:r>
+        <w:tab/>
+      </w:r>
+      <w:r>
+        <w:rPr>
+          <w:rFonts w:ascii="Arial" w:hAnsi="Arial"/>
+          <w:sz w:val="21"/>
+          <w:color w:val="4A5568"/>
+        </w:rPr>
+        <w:t>7</w:t>
+      </w:r>
+    </w:p>
+    <w:p xmlns:w="http://schemas.openxmlformats.org/wordprocessingml/2006/main">
+      <w:pPr>
+        <w:tabs>
+          <w:tab w:val="right" w:leader="dot" w:pos="9360"/>
+        </w:tabs>
+        <w:spacing w:before="80" w:after="40"/>
+      </w:pPr>
+      <w:r>
+        <w:rPr>
+          <w:rFonts w:ascii="Arial" w:hAnsi="Arial"/>
+          <w:sz w:val="21"/>
+          <w:b/>
+          <w:color w:val="1A365D"/>
+        </w:rPr>
+        <w:t>5. Referencias Bibliográficas y Fuentes Oficiales</w:t>
+      </w:r>
+      <w:r>
+        <w:tab/>
+      </w:r>
+      <w:r>
+        <w:rPr>
+          <w:rFonts w:ascii="Arial" w:hAnsi="Arial"/>
+          <w:sz w:val="21"/>
+          <w:color w:val="4A5568"/>
+        </w:rPr>
+        <w:t>8</w:t>
+      </w:r>
+    </w:p>
+    <w:p>
+      <w:r>
+        <w:br w:type="page"/>
+      </w:r>
+    </w:p>
+    <w:bookmarkEnd w:id="24"/>
+    <w:bookmarkStart w:id="25" w:name="introducción-y-enfoque-metodológico"/>
+    <w:p>
+      <w:pPr>
+        <w:pStyle w:val="Heading1"/>
+      </w:pPr>
+      <w:r>
+        <w:t xml:space="preserve">1. Introducción y Enfoque Metodológico</w:t>
+      </w:r>
+    </w:p>
+    <w:p>
+      <w:pPr>
+        <w:pStyle w:val="FirstParagraph"/>
+      </w:pPr>
+      <w:r>
+        <w:t xml:space="preserve">La transformación digital del sector público constituye uno de los procesos contemporáneos de mayor relevancia para el fortalecimiento de la gobernabilidad democrática, la transparencia institucional y la eficiencia en la asignación de recursos públicos. Lejos de reducirse a la simple digitalización de expedientes físicos o a la adquisición masiva de hardware, la modernización del Estado implica un cambio de paradigma organizacional y cultural en el cual las</w:t>
+      </w:r>
+      <w:r>
+        <w:t xml:space="preserve"> </w:t>
+      </w:r>
+      <w:r>
+        <w:rPr>
+          <w:b/>
+          <w:bCs/>
+        </w:rPr>
+        <w:t xml:space="preserve">Tecnologías de la Información y la Comunicación (TICs)</w:t>
+      </w:r>
+      <w:r>
+        <w:t xml:space="preserve"> </w:t>
+      </w:r>
+      <w:r>
+        <w:t xml:space="preserve">actúan como habilitadores estratégicos orientados a resolver las demandas ciudadanas con mayor agilidad, cercanía y trazabilidad.</w:t>
+      </w:r>
+    </w:p>
+    <w:p>
+      <w:pPr>
+        <w:pStyle w:val="BodyText"/>
+      </w:pPr>
+      <w:r>
+        <w:t xml:space="preserve">En el marco de la cátedra</w:t>
+      </w:r>
+      <w:r>
+        <w:t xml:space="preserve"> </w:t>
+      </w:r>
+      <w:r>
+        <w:rPr>
+          <w:i/>
+          <w:iCs/>
+        </w:rPr>
+        <w:t xml:space="preserve">Tecnología de la Información para la Gestión (TIG)</w:t>
+      </w:r>
+      <w:r>
+        <w:t xml:space="preserve"> </w:t>
+      </w:r>
+      <w:r>
+        <w:t xml:space="preserve">del CURZAS (Universidad Nacional del Comahue), el presente informe aborda el</w:t>
+      </w:r>
+      <w:r>
+        <w:t xml:space="preserve"> </w:t>
+      </w:r>
+      <w:r>
+        <w:rPr>
+          <w:b/>
+          <w:bCs/>
+        </w:rPr>
+        <w:t xml:space="preserve">Tema 2</w:t>
+      </w:r>
+      <w:r>
+        <w:t xml:space="preserve"> </w:t>
+      </w:r>
+      <w:r>
+        <w:t xml:space="preserve">propuesto en las consignas de la Actividad Práctica 4:</w:t>
+      </w:r>
+      <w:r>
+        <w:t xml:space="preserve"> </w:t>
+      </w:r>
+      <w:r>
+        <w:rPr>
+          <w:b/>
+          <w:bCs/>
+        </w:rPr>
+        <w:t xml:space="preserve">Nación - Neuquén</w:t>
+      </w:r>
+      <w:r>
+        <w:t xml:space="preserve">.</w:t>
+      </w:r>
+    </w:p>
+    <w:tbl xmlns:w="http://schemas.openxmlformats.org/wordprocessingml/2006/main">
+      <w:tblPr>
+        <w:tblW w:w="5000" w:type="pct"/>
+        <w:tblLayout w:type="fixed"/>
+        <w:tblBorders>
+          <w:top w:val="single" w:sz="4" w:space="0" w:color="CBD5E1"/>
+          <w:left w:val="single" w:sz="24" w:space="0" w:color="0E6873"/>
+          <w:bottom w:val="single" w:sz="4" w:space="0" w:color="CBD5E1"/>
+          <w:right w:val="single" w:sz="4" w:space="0" w:color="CBD5E1"/>
+          <w:insideH w:val="none"/>
+          <w:insideV w:val="none"/>
+        </w:tblBorders>
+        <w:tblCellMar>
+          <w:top w:w="140" w:type="dxa"/>
+          <w:left w:w="200" w:type="dxa"/>
+          <w:bottom w:w="140" w:type="dxa"/>
+          <w:right w:w="200" w:type="dxa"/>
+        </w:tblCellMar>
+      </w:tblPr>
+      <w:tblGrid>
+        <w:gridCol w:w="9360"/>
+      </w:tblGrid>
+      <w:tr>
+        <w:trPr>
+          <w:cantSplit/>
+        </w:trPr>
+        <w:tc>
+          <w:tcPr>
+            <w:tcW w:w="9360" w:type="dxa"/>
+            <w:shd w:val="clear" w:color="auto" w:fill="F2F7F7"/>
+          </w:tcPr>
+          <w:p>
+            <w:pPr>
+              <w:pStyle w:val="Compact"/>
+              <w:spacing w:before="40" w:after="80"/>
+            </w:pPr>
+            <w:r>
+              <w:rPr>
+                <w:rFonts w:ascii="Arial" w:hAnsi="Arial"/>
+                <w:b/>
+                <w:color w:val="0E6873"/>
+                <w:sz w:val="20"/>
+              </w:rPr>
+              <w:t>OBJETIVO ACADÉMICO</w:t>
+            </w:r>
+          </w:p>
+          <w:p>
+            <w:pPr>
+              <w:pStyle w:val="Compact"/>
+              <w:spacing w:before="40" w:after="40" w:line="276" w:lineRule="auto"/>
+            </w:pPr>
+            <w:r>
+              <w:rPr>
+                <w:rFonts w:ascii="Arial" w:hAnsi="Arial"/>
+                <w:color w:val="2D3748"/>
+                <w:sz w:val="19"/>
+              </w:rPr>
+              <w:t>Investigar, describir y analizar críticamente los portales gubernamentales de referencia (INAP Nación y Secretaría de Modernización de Neuquén Capital), estructurando una matriz comparativa multidimensional rigurosa entre las directrices estratégicas de la Administración Pública Nacional y las iniciativas subnacionales de proximidad ciudadana implementadas en la capital neuquina.</w:t>
+            </w:r>
+          </w:p>
         </w:tc>
       </w:tr>
     </w:tbl>
@@ -1027,8 +1010,8 @@
         <w:t xml:space="preserve">Neuquén conforma el epicentro socioeconómico de la cuenca neuquina y la región del Comahue, donde el crecimiento demográfico acelerado demanda una administración municipal capaz de responder con infraestructura digital, agilidad en trámites comerciales y simplificación tributaria.</w:t>
       </w:r>
     </w:p>
-    <w:bookmarkEnd w:id="31"/>
-    <w:bookmarkStart w:id="43" w:name="Xa49fc4bd288921ae91dbbf9eb9972d02dab9c0f"/>
+    <w:bookmarkEnd w:id="25"/>
+    <w:bookmarkStart w:id="37" w:name="Xa49fc4bd288921ae91dbbf9eb9972d02dab9c0f"/>
     <w:p>
       <w:pPr>
         <w:pStyle w:val="Heading1"/>
@@ -1045,7 +1028,7 @@
         <w:t xml:space="preserve">A partir de los enlaces oficiales provistos en la consigna docente, se procedió a relevar, inspeccionar y categorizar los componentes estructurales, funcionales e informacionales de ambos sitios web.</w:t>
       </w:r>
     </w:p>
-    <w:bookmarkStart w:id="38" w:name="Xa5c82427a9ddb599581c4c3b7cfcf01ab3140fe"/>
+    <w:bookmarkStart w:id="32" w:name="Xa5c82427a9ddb599581c4c3b7cfcf01ab3140fe"/>
     <w:p>
       <w:pPr>
         <w:pStyle w:val="Heading2"/>
@@ -1084,7 +1067,7 @@
       <w:r>
         <w:t xml:space="preserve"> </w:t>
       </w:r>
-      <w:hyperlink r:id="rId32">
+      <w:hyperlink r:id="rId26">
         <w:r>
           <w:rPr>
             <w:rStyle w:val="Hyperlink"/>
@@ -1133,7 +1116,7 @@
         <w:rPr>
           <w:rStyle w:val="FootnoteReference"/>
         </w:rPr>
-        <w:footnoteReference w:id="33"/>
+        <w:footnoteReference w:id="27"/>
       </w:r>
       <w:r>
         <w:t xml:space="preserve">, actualmente bajo la órbita de la Secretaría de Transformación del Estado y Función Pública (Ministerio de Desregulación y Transformación del Estado).</w:t>
@@ -1147,7 +1130,7 @@
         <w:t xml:space="preserve">A diferencia de un portal transaccional de trámites, este espacio cumple una función eminentemente analítica, conceptual y de monitoreo de políticas públicas. Su propósito medular es brindar una propuesta metodológica de dimensiones e indicadores empíricos que permitan evaluar el avance de la modernización estatal en Argentina. El portal organiza su esquema de trabajo en cuatro dimensiones fundamentales:</w:t>
       </w:r>
     </w:p>
-    <w:bookmarkStart w:id="34" w:name="a.-gobierno-digital"/>
+    <w:bookmarkStart w:id="28" w:name="a.-gobierno-digital"/>
     <w:p>
       <w:pPr>
         <w:pStyle w:val="Heading3"/>
@@ -1230,8 +1213,8 @@
         <w:t xml:space="preserve">Mapeo de transacciones, cobertura geográfica y volumen de trámites digitales.</w:t>
       </w:r>
     </w:p>
-    <w:bookmarkEnd w:id="34"/>
-    <w:bookmarkStart w:id="35" w:name="b.-país-digital"/>
+    <w:bookmarkEnd w:id="28"/>
+    <w:bookmarkStart w:id="29" w:name="b.-país-digital"/>
     <w:p>
       <w:pPr>
         <w:pStyle w:val="Heading3"/>
@@ -1314,8 +1297,8 @@
         <w:t xml:space="preserve">Apropiación comunitaria de las tecnologías.</w:t>
       </w:r>
     </w:p>
-    <w:bookmarkEnd w:id="35"/>
-    <w:bookmarkStart w:id="36" w:name="c.-gobierno-abierto"/>
+    <w:bookmarkEnd w:id="29"/>
+    <w:bookmarkStart w:id="30" w:name="c.-gobierno-abierto"/>
     <w:p>
       <w:pPr>
         <w:pStyle w:val="Heading3"/>
@@ -1398,8 +1381,8 @@
         <w:t xml:space="preserve">Alianza para el Gobierno Abierto (OGP) y estándares de la OCDE.</w:t>
       </w:r>
     </w:p>
-    <w:bookmarkEnd w:id="36"/>
-    <w:bookmarkStart w:id="37" w:name="d.-modernización-administrativa"/>
+    <w:bookmarkEnd w:id="30"/>
+    <w:bookmarkStart w:id="31" w:name="d.-modernización-administrativa"/>
     <w:p>
       <w:pPr>
         <w:pStyle w:val="Heading3"/>
@@ -1482,9 +1465,9 @@
         <w:t xml:space="preserve">Reducción de plazos en expedientes y simplificación regulatoria.</w:t>
       </w:r>
     </w:p>
-    <w:bookmarkEnd w:id="37"/>
-    <w:bookmarkEnd w:id="38"/>
-    <w:bookmarkStart w:id="42" w:name="X013c73fae7f3aa0602c2e491ca5006f1744f568"/>
+    <w:bookmarkEnd w:id="31"/>
+    <w:bookmarkEnd w:id="32"/>
+    <w:bookmarkStart w:id="36" w:name="X013c73fae7f3aa0602c2e491ca5006f1744f568"/>
     <w:p>
       <w:pPr>
         <w:pStyle w:val="Heading2"/>
@@ -1523,7 +1506,7 @@
       <w:r>
         <w:t xml:space="preserve"> </w:t>
       </w:r>
-      <w:hyperlink r:id="rId39">
+      <w:hyperlink r:id="rId33">
         <w:r>
           <w:rPr>
             <w:rStyle w:val="Hyperlink"/>
@@ -1716,7 +1699,7 @@
         <w:rPr>
           <w:rStyle w:val="FootnoteReference"/>
         </w:rPr>
-        <w:footnoteReference w:id="40"/>
+        <w:footnoteReference w:id="34"/>
       </w:r>
       <w:r>
         <w:t xml:space="preserve"> </w:t>
@@ -1782,7 +1765,7 @@
         <w:rPr>
           <w:rStyle w:val="FootnoteReference"/>
         </w:rPr>
-        <w:footnoteReference w:id="41"/>
+        <w:footnoteReference w:id="35"/>
       </w:r>
       <w:r>
         <w:t xml:space="preserve">, concebido como motor de articulación público-privada para la industria del conocimiento.</w:t>
@@ -1810,9 +1793,9 @@
         <w:t xml:space="preserve">Acceso directo al Boletín Oficial Municipal digital y al Digesto de ordenanzas municipales, facilitando la auditoría ciudadana.</w:t>
       </w:r>
     </w:p>
-    <w:bookmarkEnd w:id="42"/>
-    <w:bookmarkEnd w:id="43"/>
-    <w:bookmarkStart w:id="47" w:name="X4fb8b93d7239b0f402b4ecf260f9e41569f533d"/>
+    <w:bookmarkEnd w:id="36"/>
+    <w:bookmarkEnd w:id="37"/>
+    <w:bookmarkStart w:id="41" w:name="X4fb8b93d7239b0f402b4ecf260f9e41569f533d"/>
     <w:p>
       <w:pPr>
         <w:pStyle w:val="Heading1"/>
@@ -1835,56 +1818,58 @@
         <w:tblW w:type="pct" w:w="5000"/>
         <w:tblLayout w:type="fixed"/>
         <w:tblLook w:firstRow="1" w:lastRow="0" w:firstColumn="0" w:lastColumn="0" w:noHBand="0" w:noVBand="0" w:val="0020"/>
+        <w:tblBorders>
+          <w:top w:val="single" w:sz="12" w:space="0" w:color="153E5C"/>
+          <w:left w:val="none"/>
+          <w:bottom w:val="single" w:sz="12" w:space="0" w:color="153E5C"/>
+          <w:right w:val="none"/>
+          <w:insideH w:val="single" w:sz="4" w:space="0" w:color="E2E8F0"/>
+          <w:insideV w:val="none"/>
+        </w:tblBorders>
+        <w:tblCellMar>
+          <w:top w:w="120" w:type="dxa"/>
+          <w:left w:w="140" w:type="dxa"/>
+          <w:bottom w:w="120" w:type="dxa"/>
+          <w:right w:w="140" w:type="dxa"/>
+        </w:tblCellMar>
       </w:tblPr>
       <w:tblGrid>
-        <w:gridCol w:w="2640"/>
-        <w:gridCol w:w="2640"/>
-        <w:gridCol w:w="2640"/>
+        <w:gridCol w:w="2400"/>
+        <w:gridCol w:w="3480"/>
+        <w:gridCol w:w="3480"/>
       </w:tblGrid>
       <w:tr>
         <w:trPr>
           <w:tblHeader w:val="on"/>
+          <w:cantSplit/>
+          <w:tblHeader/>
         </w:trPr>
         <w:tc>
-          <w:tcPr/>
+          <w:tcPr>
+            <w:tcW w:w="2400" w:type="dxa"/>
+            <w:shd w:val="clear" w:color="auto" w:fill="153E5C"/>
+          </w:tcPr>
           <w:p>
             <w:pPr>
               <w:pStyle w:val="Compact"/>
-              <w:jc w:val="left"/>
+              <w:jc w:val="center"/>
             </w:pPr>
             <w:r>
+              <w:rPr>
+                <w:rFonts w:ascii="Arial" w:hAnsi="Arial"/>
+                <w:b/>
+                <w:color w:val="FFFFFF"/>
+                <w:sz w:val="19"/>
+              </w:rPr>
               <w:t xml:space="preserve">Dimensión de Análisis</w:t>
             </w:r>
           </w:p>
         </w:tc>
         <w:tc>
-          <w:tcPr/>
-          <w:p>
-            <w:pPr>
-              <w:pStyle w:val="Compact"/>
-              <w:jc w:val="left"/>
-            </w:pPr>
-            <w:r>
-              <w:t xml:space="preserve">Nivel Nacional (INAP · Nación)</w:t>
-            </w:r>
-          </w:p>
-        </w:tc>
-        <w:tc>
-          <w:tcPr/>
-          <w:p>
-            <w:pPr>
-              <w:pStyle w:val="Compact"/>
-              <w:jc w:val="left"/>
-            </w:pPr>
-            <w:r>
-              <w:t xml:space="preserve">Jurisdicción Local (Neuquén Capital)</w:t>
-            </w:r>
-          </w:p>
-        </w:tc>
-      </w:tr>
-      <w:tr>
-        <w:tc>
-          <w:tcPr/>
+          <w:tcPr>
+            <w:tcW w:w="3480" w:type="dxa"/>
+            <w:shd w:val="clear" w:color="auto" w:fill="153E5C"/>
+          </w:tcPr>
           <w:p>
             <w:pPr>
               <w:pStyle w:val="Compact"/>
@@ -1892,41 +1877,20 @@
             </w:pPr>
             <w:r>
               <w:rPr>
+                <w:rFonts w:ascii="Arial" w:hAnsi="Arial"/>
                 <w:b/>
-                <w:bCs/>
+                <w:color w:val="FFFFFF"/>
+                <w:sz w:val="19"/>
               </w:rPr>
-              <w:t xml:space="preserve">Nivel de Gobierno y Misión</w:t>
+              <w:t xml:space="preserve">Nivel Nacional (INAP · Nación)</w:t>
             </w:r>
           </w:p>
         </w:tc>
         <w:tc>
-          <w:tcPr/>
-          <w:p>
-            <w:pPr>
-              <w:pStyle w:val="Compact"/>
-              <w:jc w:val="left"/>
-            </w:pPr>
-            <w:r>
-              <w:t xml:space="preserve">Nivel federal. Diseña lineamientos, marcos rectores, indicadores estadísticos e investigación de políticas públicas para la Administración Pública Nacional (APN).</w:t>
-            </w:r>
-          </w:p>
-        </w:tc>
-        <w:tc>
-          <w:tcPr/>
-          <w:p>
-            <w:pPr>
-              <w:pStyle w:val="Compact"/>
-              <w:jc w:val="left"/>
-            </w:pPr>
-            <w:r>
-              <w:t xml:space="preserve">Nivel municipal / subnacional. Ejecución directa, prestación de servicios de cercanía, infraestructura urbana y resolución de problemas cotidianos de la ciudadanía.</w:t>
-            </w:r>
-          </w:p>
-        </w:tc>
-      </w:tr>
-      <w:tr>
-        <w:tc>
-          <w:tcPr/>
+          <w:tcPr>
+            <w:tcW w:w="3480" w:type="dxa"/>
+            <w:shd w:val="clear" w:color="auto" w:fill="153E5C"/>
+          </w:tcPr>
           <w:p>
             <w:pPr>
               <w:pStyle w:val="Compact"/>
@@ -1934,272 +1898,531 @@
             </w:pPr>
             <w:r>
               <w:rPr>
+                <w:rFonts w:ascii="Arial" w:hAnsi="Arial"/>
+                <w:b/>
+                <w:color w:val="FFFFFF"/>
+                <w:sz w:val="19"/>
+              </w:rPr>
+              <w:t xml:space="preserve">Jurisdicción Local (Neuquén Capital)</w:t>
+            </w:r>
+          </w:p>
+        </w:tc>
+      </w:tr>
+      <w:tr>
+        <w:trPr>
+          <w:cantSplit/>
+        </w:trPr>
+        <w:tc>
+          <w:tcPr>
+            <w:tcW w:w="2400" w:type="dxa"/>
+          </w:tcPr>
+          <w:p>
+            <w:pPr>
+              <w:pStyle w:val="Compact"/>
+              <w:spacing w:line="276" w:lineRule="auto" w:after="40" w:before="40"/>
+              <w:jc w:val="left"/>
+            </w:pPr>
+            <w:r>
+              <w:rPr>
+                <w:rFonts w:ascii="Arial" w:hAnsi="Arial"/>
                 <w:b/>
                 <w:bCs/>
+                <w:color w:val="153E5C"/>
+                <w:sz w:val="18"/>
+              </w:rPr>
+              <w:t xml:space="preserve">Nivel de Gobierno y Misión</w:t>
+            </w:r>
+          </w:p>
+        </w:tc>
+        <w:tc>
+          <w:tcPr>
+            <w:tcW w:w="3480" w:type="dxa"/>
+          </w:tcPr>
+          <w:p>
+            <w:pPr>
+              <w:pStyle w:val="Compact"/>
+              <w:spacing w:line="276" w:lineRule="auto" w:after="40" w:before="40"/>
+              <w:jc w:val="left"/>
+            </w:pPr>
+            <w:r>
+              <w:rPr>
+                <w:rFonts w:ascii="Arial" w:hAnsi="Arial"/>
+                <w:color w:val="2D3748"/>
+                <w:sz w:val="17"/>
+              </w:rPr>
+              <w:t xml:space="preserve">Nivel federal. Diseña lineamientos, marcos rectores, indicadores estadísticos e investigación de políticas públicas para la Administración Pública Nacional (APN).</w:t>
+            </w:r>
+          </w:p>
+        </w:tc>
+        <w:tc>
+          <w:tcPr>
+            <w:tcW w:w="3480" w:type="dxa"/>
+          </w:tcPr>
+          <w:p>
+            <w:pPr>
+              <w:pStyle w:val="Compact"/>
+              <w:spacing w:line="276" w:lineRule="auto" w:after="40" w:before="40"/>
+              <w:jc w:val="left"/>
+            </w:pPr>
+            <w:r>
+              <w:rPr>
+                <w:rFonts w:ascii="Arial" w:hAnsi="Arial"/>
+                <w:color w:val="2D3748"/>
+                <w:sz w:val="17"/>
+              </w:rPr>
+              <w:t xml:space="preserve">Nivel municipal / subnacional. Ejecución directa, prestación de servicios de cercanía, infraestructura urbana y resolución de problemas cotidianos de la ciudadanía.</w:t>
+            </w:r>
+          </w:p>
+        </w:tc>
+      </w:tr>
+      <w:tr>
+        <w:trPr>
+          <w:cantSplit/>
+        </w:trPr>
+        <w:tc>
+          <w:tcPr>
+            <w:tcW w:w="2400" w:type="dxa"/>
+            <w:shd w:val="clear" w:color="auto" w:fill="F8FAFC"/>
+          </w:tcPr>
+          <w:p>
+            <w:pPr>
+              <w:pStyle w:val="Compact"/>
+              <w:spacing w:line="276" w:lineRule="auto" w:after="40" w:before="40"/>
+              <w:jc w:val="left"/>
+            </w:pPr>
+            <w:r>
+              <w:rPr>
+                <w:rFonts w:ascii="Arial" w:hAnsi="Arial"/>
+                <w:b/>
+                <w:bCs/>
+                <w:color w:val="153E5C"/>
+                <w:sz w:val="18"/>
               </w:rPr>
               <w:t xml:space="preserve">Enfoque del Portal Web</w:t>
             </w:r>
           </w:p>
         </w:tc>
         <w:tc>
-          <w:tcPr/>
+          <w:tcPr>
+            <w:tcW w:w="3480" w:type="dxa"/>
+            <w:shd w:val="clear" w:color="auto" w:fill="F8FAFC"/>
+          </w:tcPr>
           <w:p>
             <w:pPr>
               <w:pStyle w:val="Compact"/>
+              <w:spacing w:line="276" w:lineRule="auto" w:after="40" w:before="40"/>
               <w:jc w:val="left"/>
             </w:pPr>
             <w:r>
+              <w:rPr>
+                <w:rFonts w:ascii="Arial" w:hAnsi="Arial"/>
+                <w:color w:val="2D3748"/>
+                <w:sz w:val="17"/>
+              </w:rPr>
               <w:t xml:space="preserve">Observatorio analítico y conceptual. Centrado en la generación de conocimiento, publicaciones académicas y propuestas de medición institucional.</w:t>
             </w:r>
           </w:p>
         </w:tc>
         <w:tc>
-          <w:tcPr/>
+          <w:tcPr>
+            <w:tcW w:w="3480" w:type="dxa"/>
+            <w:shd w:val="clear" w:color="auto" w:fill="F8FAFC"/>
+          </w:tcPr>
           <w:p>
             <w:pPr>
               <w:pStyle w:val="Compact"/>
+              <w:spacing w:line="276" w:lineRule="auto" w:after="40" w:before="40"/>
               <w:jc w:val="left"/>
             </w:pPr>
             <w:r>
+              <w:rPr>
+                <w:rFonts w:ascii="Arial" w:hAnsi="Arial"/>
+                <w:color w:val="2D3748"/>
+                <w:sz w:val="17"/>
+              </w:rPr>
               <w:t xml:space="preserve">Portal operativo y transaccional. Centrado en la ventanilla única virtual (</w:t>
             </w:r>
             <w:r>
               <w:rPr>
                 <w:rStyle w:val="VerbatimChar"/>
+                <w:rFonts w:ascii="Arial" w:hAnsi="Arial"/>
+                <w:color w:val="2D3748"/>
+                <w:sz w:val="17"/>
               </w:rPr>
               <w:t xml:space="preserve">WebLogin</w:t>
             </w:r>
             <w:r>
+              <w:rPr>
+                <w:rFonts w:ascii="Arial" w:hAnsi="Arial"/>
+                <w:color w:val="2D3748"/>
+                <w:sz w:val="17"/>
+              </w:rPr>
               <w:t xml:space="preserve">), turnero digital y mapa de servicios en territorio.</w:t>
             </w:r>
           </w:p>
         </w:tc>
       </w:tr>
       <w:tr>
+        <w:trPr>
+          <w:cantSplit/>
+        </w:trPr>
         <w:tc>
-          <w:tcPr/>
+          <w:tcPr>
+            <w:tcW w:w="2400" w:type="dxa"/>
+          </w:tcPr>
           <w:p>
             <w:pPr>
               <w:pStyle w:val="Compact"/>
+              <w:spacing w:line="276" w:lineRule="auto" w:after="40" w:before="40"/>
               <w:jc w:val="left"/>
             </w:pPr>
             <w:r>
               <w:rPr>
+                <w:rFonts w:ascii="Arial" w:hAnsi="Arial"/>
                 <w:b/>
                 <w:bCs/>
+                <w:color w:val="153E5C"/>
+                <w:sz w:val="18"/>
               </w:rPr>
               <w:t xml:space="preserve">Gobierno Digital e Interoperabilidad</w:t>
             </w:r>
           </w:p>
         </w:tc>
         <w:tc>
-          <w:tcPr/>
+          <w:tcPr>
+            <w:tcW w:w="3480" w:type="dxa"/>
+          </w:tcPr>
           <w:p>
             <w:pPr>
               <w:pStyle w:val="Compact"/>
+              <w:spacing w:line="276" w:lineRule="auto" w:after="40" w:before="40"/>
               <w:jc w:val="left"/>
             </w:pPr>
             <w:r>
+              <w:rPr>
+                <w:rFonts w:ascii="Arial" w:hAnsi="Arial"/>
+                <w:color w:val="2D3748"/>
+                <w:sz w:val="17"/>
+              </w:rPr>
               <w:t xml:space="preserve">Impulsa la interoperabilidad federal, estándares de intercambio de datos, firma digital y plataformas transversales como TAD y Mi Argentina.</w:t>
             </w:r>
           </w:p>
         </w:tc>
         <w:tc>
-          <w:tcPr/>
+          <w:tcPr>
+            <w:tcW w:w="3480" w:type="dxa"/>
+          </w:tcPr>
           <w:p>
             <w:pPr>
               <w:pStyle w:val="Compact"/>
+              <w:spacing w:line="276" w:lineRule="auto" w:after="40" w:before="40"/>
               <w:jc w:val="left"/>
             </w:pPr>
             <w:r>
+              <w:rPr>
+                <w:rFonts w:ascii="Arial" w:hAnsi="Arial"/>
+                <w:color w:val="2D3748"/>
+                <w:sz w:val="17"/>
+              </w:rPr>
               <w:t xml:space="preserve">Implementa plataformas de gestión local interoperadas internamente: Catastro SITUN, Tribunal de Faltas, Cobranzas y Trámites Web.</w:t>
             </w:r>
           </w:p>
         </w:tc>
       </w:tr>
       <w:tr>
+        <w:trPr>
+          <w:cantSplit/>
+        </w:trPr>
         <w:tc>
-          <w:tcPr/>
+          <w:tcPr>
+            <w:tcW w:w="2400" w:type="dxa"/>
+            <w:shd w:val="clear" w:color="auto" w:fill="F8FAFC"/>
+          </w:tcPr>
           <w:p>
             <w:pPr>
               <w:pStyle w:val="Compact"/>
+              <w:spacing w:line="276" w:lineRule="auto" w:after="40" w:before="40"/>
               <w:jc w:val="left"/>
             </w:pPr>
             <w:r>
               <w:rPr>
+                <w:rFonts w:ascii="Arial" w:hAnsi="Arial"/>
                 <w:b/>
                 <w:bCs/>
+                <w:color w:val="153E5C"/>
+                <w:sz w:val="18"/>
               </w:rPr>
-              <w:t xml:space="preserve">País Digital vs. Smart City</w:t>
+              <w:t xml:space="preserve">País Digital vs. Smart City</w:t>
             </w:r>
           </w:p>
         </w:tc>
         <w:tc>
-          <w:tcPr/>
+          <w:tcPr>
+            <w:tcW w:w="3480" w:type="dxa"/>
+            <w:shd w:val="clear" w:color="auto" w:fill="F8FAFC"/>
+          </w:tcPr>
           <w:p>
             <w:pPr>
               <w:pStyle w:val="Compact"/>
+              <w:spacing w:line="276" w:lineRule="auto" w:after="40" w:before="40"/>
               <w:jc w:val="left"/>
             </w:pPr>
             <w:r>
+              <w:rPr>
+                <w:rFonts w:ascii="Arial" w:hAnsi="Arial"/>
+                <w:color w:val="2D3748"/>
+                <w:sz w:val="17"/>
+              </w:rPr>
               <w:t xml:space="preserve">Aborda la brecha digital macro: conectividad geográfica federal, tendido troncal, puntos Wi-Fi nacionales y métricas de computadoras por habitante.</w:t>
             </w:r>
           </w:p>
         </w:tc>
         <w:tc>
-          <w:tcPr/>
+          <w:tcPr>
+            <w:tcW w:w="3480" w:type="dxa"/>
+            <w:shd w:val="clear" w:color="auto" w:fill="F8FAFC"/>
+          </w:tcPr>
           <w:p>
             <w:pPr>
               <w:pStyle w:val="Compact"/>
+              <w:spacing w:line="276" w:lineRule="auto" w:after="40" w:before="40"/>
               <w:jc w:val="left"/>
             </w:pPr>
             <w:r>
-              <w:t xml:space="preserve">Aplica el concepto de</w:t>
-            </w:r>
-            <w:r>
-              <w:t xml:space="preserve"> </w:t>
+              <w:rPr>
+                <w:rFonts w:ascii="Arial" w:hAnsi="Arial"/>
+                <w:color w:val="2D3748"/>
+                <w:sz w:val="17"/>
+              </w:rPr>
+              <w:t xml:space="preserve">Aplica el concepto de </w:t>
             </w:r>
             <w:r>
               <w:rPr>
+                <w:rFonts w:ascii="Arial" w:hAnsi="Arial"/>
                 <w:i/>
                 <w:iCs/>
+                <w:color w:val="2D3748"/>
+                <w:sz w:val="17"/>
               </w:rPr>
               <w:t xml:space="preserve">Ciudad Inteligente</w:t>
             </w:r>
             <w:r>
+              <w:rPr>
+                <w:rFonts w:ascii="Arial" w:hAnsi="Arial"/>
+                <w:color w:val="2D3748"/>
+                <w:sz w:val="17"/>
+              </w:rPr>
               <w:t xml:space="preserve">: cámaras en vivo, Zonas Wi-Fi municipales en espacios verdes, gestión de tráfico inteligente y Polo Tecnológico.</w:t>
             </w:r>
           </w:p>
         </w:tc>
       </w:tr>
       <w:tr>
+        <w:trPr>
+          <w:cantSplit/>
+        </w:trPr>
         <w:tc>
-          <w:tcPr/>
+          <w:tcPr>
+            <w:tcW w:w="2400" w:type="dxa"/>
+          </w:tcPr>
           <w:p>
             <w:pPr>
               <w:pStyle w:val="Compact"/>
+              <w:spacing w:line="276" w:lineRule="auto" w:after="40" w:before="40"/>
               <w:jc w:val="left"/>
             </w:pPr>
             <w:r>
               <w:rPr>
+                <w:rFonts w:ascii="Arial" w:hAnsi="Arial"/>
                 <w:b/>
                 <w:bCs/>
+                <w:color w:val="153E5C"/>
+                <w:sz w:val="18"/>
               </w:rPr>
               <w:t xml:space="preserve">Modernización Administrativa</w:t>
             </w:r>
           </w:p>
         </w:tc>
         <w:tc>
-          <w:tcPr/>
+          <w:tcPr>
+            <w:tcW w:w="3480" w:type="dxa"/>
+          </w:tcPr>
           <w:p>
             <w:pPr>
               <w:pStyle w:val="Compact"/>
+              <w:spacing w:line="276" w:lineRule="auto" w:after="40" w:before="40"/>
               <w:jc w:val="left"/>
             </w:pPr>
             <w:r>
+              <w:rPr>
+                <w:rFonts w:ascii="Arial" w:hAnsi="Arial"/>
+                <w:color w:val="2D3748"/>
+                <w:sz w:val="17"/>
+              </w:rPr>
               <w:t xml:space="preserve">Focalizado en el Sistema de Gestión Documental Electrónica (GDE), expediente electrónico de compras públicas y reducción de tiempos ministeriales.</w:t>
             </w:r>
           </w:p>
         </w:tc>
         <w:tc>
-          <w:tcPr/>
+          <w:tcPr>
+            <w:tcW w:w="3480" w:type="dxa"/>
+          </w:tcPr>
           <w:p>
             <w:pPr>
               <w:pStyle w:val="Compact"/>
+              <w:spacing w:line="276" w:lineRule="auto" w:after="40" w:before="40"/>
               <w:jc w:val="left"/>
             </w:pPr>
             <w:r>
+              <w:rPr>
+                <w:rFonts w:ascii="Arial" w:hAnsi="Arial"/>
+                <w:color w:val="2D3748"/>
+                <w:sz w:val="17"/>
+              </w:rPr>
               <w:t xml:space="preserve">Focalizado en la ventanilla única de trámites municipales, despapelización de licencias, agrimensura, habilitaciones comerciales y digesto digital.</w:t>
             </w:r>
           </w:p>
         </w:tc>
       </w:tr>
       <w:tr>
+        <w:trPr>
+          <w:cantSplit/>
+        </w:trPr>
         <w:tc>
-          <w:tcPr/>
+          <w:tcPr>
+            <w:tcW w:w="2400" w:type="dxa"/>
+            <w:shd w:val="clear" w:color="auto" w:fill="F8FAFC"/>
+          </w:tcPr>
           <w:p>
             <w:pPr>
               <w:pStyle w:val="Compact"/>
+              <w:spacing w:line="276" w:lineRule="auto" w:after="40" w:before="40"/>
               <w:jc w:val="left"/>
             </w:pPr>
             <w:r>
               <w:rPr>
+                <w:rFonts w:ascii="Arial" w:hAnsi="Arial"/>
                 <w:b/>
                 <w:bCs/>
+                <w:color w:val="153E5C"/>
+                <w:sz w:val="18"/>
               </w:rPr>
               <w:t xml:space="preserve">Gobierno Abierto y Participación</w:t>
             </w:r>
           </w:p>
         </w:tc>
         <w:tc>
-          <w:tcPr/>
+          <w:tcPr>
+            <w:tcW w:w="3480" w:type="dxa"/>
+            <w:shd w:val="clear" w:color="auto" w:fill="F8FAFC"/>
+          </w:tcPr>
           <w:p>
             <w:pPr>
               <w:pStyle w:val="Compact"/>
+              <w:spacing w:line="276" w:lineRule="auto" w:after="40" w:before="40"/>
               <w:jc w:val="left"/>
             </w:pPr>
             <w:r>
+              <w:rPr>
+                <w:rFonts w:ascii="Arial" w:hAnsi="Arial"/>
+                <w:color w:val="2D3748"/>
+                <w:sz w:val="17"/>
+              </w:rPr>
               <w:t xml:space="preserve">Alineado con compromisos internacionales: Alianza para el Gobierno Abierto (OGP), Carta Iberoamericana y estándares de transparencia de la OCDE.</w:t>
             </w:r>
           </w:p>
         </w:tc>
         <w:tc>
-          <w:tcPr/>
+          <w:tcPr>
+            <w:tcW w:w="3480" w:type="dxa"/>
+            <w:shd w:val="clear" w:color="auto" w:fill="F8FAFC"/>
+          </w:tcPr>
           <w:p>
             <w:pPr>
               <w:pStyle w:val="Compact"/>
+              <w:spacing w:line="276" w:lineRule="auto" w:after="40" w:before="40"/>
               <w:jc w:val="left"/>
             </w:pPr>
             <w:r>
+              <w:rPr>
+                <w:rFonts w:ascii="Arial" w:hAnsi="Arial"/>
+                <w:color w:val="2D3748"/>
+                <w:sz w:val="17"/>
+              </w:rPr>
               <w:t xml:space="preserve">Enfocado en la transparencia de proximidad: Boletín Oficial digital, portal tributario abierto, participación comunitaria en ferias y empleo local.</w:t>
             </w:r>
           </w:p>
         </w:tc>
       </w:tr>
       <w:tr>
+        <w:trPr>
+          <w:cantSplit/>
+        </w:trPr>
         <w:tc>
-          <w:tcPr/>
+          <w:tcPr>
+            <w:tcW w:w="2400" w:type="dxa"/>
+          </w:tcPr>
           <w:p>
             <w:pPr>
               <w:pStyle w:val="Compact"/>
+              <w:spacing w:line="276" w:lineRule="auto" w:after="40" w:before="40"/>
               <w:jc w:val="left"/>
             </w:pPr>
             <w:r>
               <w:rPr>
+                <w:rFonts w:ascii="Arial" w:hAnsi="Arial"/>
                 <w:b/>
                 <w:bCs/>
+                <w:color w:val="153E5C"/>
+                <w:sz w:val="18"/>
               </w:rPr>
               <w:t xml:space="preserve">Capacitación del Talento Humano</w:t>
             </w:r>
           </w:p>
         </w:tc>
         <w:tc>
-          <w:tcPr/>
+          <w:tcPr>
+            <w:tcW w:w="3480" w:type="dxa"/>
+          </w:tcPr>
           <w:p>
             <w:pPr>
               <w:pStyle w:val="Compact"/>
+              <w:spacing w:line="276" w:lineRule="auto" w:after="40" w:before="40"/>
               <w:jc w:val="left"/>
             </w:pPr>
             <w:r>
+              <w:rPr>
+                <w:rFonts w:ascii="Arial" w:hAnsi="Arial"/>
+                <w:color w:val="2D3748"/>
+                <w:sz w:val="17"/>
+              </w:rPr>
               <w:t xml:space="preserve">Formación masiva de funcionarios federales a través del INAP, carreras de administración pública y gestión por competencias.</w:t>
             </w:r>
           </w:p>
         </w:tc>
         <w:tc>
-          <w:tcPr/>
+          <w:tcPr>
+            <w:tcW w:w="3480" w:type="dxa"/>
+          </w:tcPr>
           <w:p>
             <w:pPr>
               <w:pStyle w:val="Compact"/>
+              <w:spacing w:line="276" w:lineRule="auto" w:after="40" w:before="40"/>
               <w:jc w:val="left"/>
             </w:pPr>
             <w:r>
+              <w:rPr>
+                <w:rFonts w:ascii="Arial" w:hAnsi="Arial"/>
+                <w:color w:val="2D3748"/>
+                <w:sz w:val="17"/>
+              </w:rPr>
               <w:t xml:space="preserve">Capacitación operativa de agentes municipales y formación directa a ciudadanos (cursos de seguridad vial, manipulación de alimentos).</w:t>
             </w:r>
           </w:p>
         </w:tc>
       </w:tr>
     </w:tbl>
-    <w:bookmarkStart w:id="44" w:name="convergencias-y-puntos-de-encuentro"/>
+    <w:bookmarkStart w:id="38" w:name="convergencias-y-puntos-de-encuentro"/>
     <w:p>
       <w:pPr>
         <w:pStyle w:val="Heading2"/>
@@ -2297,8 +2520,8 @@
         <w:t xml:space="preserve">para vincular catastro, zonificación y obras con geolocalización de precisión.</w:t>
       </w:r>
     </w:p>
-    <w:bookmarkEnd w:id="44"/>
-    <w:bookmarkStart w:id="46" w:name="Xbf2b7c3d798361941f720ca12d11dd982c6d6a4"/>
+    <w:bookmarkEnd w:id="38"/>
+    <w:bookmarkStart w:id="40" w:name="Xbf2b7c3d798361941f720ca12d11dd982c6d6a4"/>
     <w:p>
       <w:pPr>
         <w:pStyle w:val="Heading2"/>
@@ -2356,7 +2579,7 @@
         <w:rPr>
           <w:rStyle w:val="FootnoteReference"/>
         </w:rPr>
-        <w:footnoteReference w:id="45"/>
+        <w:footnoteReference w:id="39"/>
       </w:r>
       <w:r>
         <w:t xml:space="preserve"> </w:t>
@@ -2383,9 +2606,9 @@
         <w:t xml:space="preserve">, Registro Nacional de las Personas - RENAPER, Agencia Nacional de Seguridad Vial) requieren procesos de doble carga o validaciones manuales debido a la falta de APIs gubernamentales unificadas y acuerdos federales estables.</w:t>
       </w:r>
     </w:p>
-    <w:bookmarkEnd w:id="46"/>
-    <w:bookmarkEnd w:id="47"/>
-    <w:bookmarkStart w:id="48" w:name="Xce0272aac5929939a39680cf30301902fb7015f"/>
+    <w:bookmarkEnd w:id="40"/>
+    <w:bookmarkEnd w:id="41"/>
+    <w:bookmarkStart w:id="42" w:name="Xce0272aac5929939a39680cf30301902fb7015f"/>
     <w:p>
       <w:pPr>
         <w:pStyle w:val="Heading1"/>
@@ -2510,8 +2733,8 @@
         <w:br w:type="page"/>
       </w:r>
     </w:p>
-    <w:bookmarkEnd w:id="48"/>
-    <w:bookmarkStart w:id="52" w:name="Xec850b3d016b3f0d7255de5b4756a8e2ad7a98d"/>
+    <w:bookmarkEnd w:id="42"/>
+    <w:bookmarkStart w:id="46" w:name="Xec850b3d016b3f0d7255de5b4756a8e2ad7a98d"/>
     <w:p>
       <w:pPr>
         <w:pStyle w:val="Heading1"/>
@@ -2557,7 +2780,7 @@
       <w:r>
         <w:t xml:space="preserve"> </w:t>
       </w:r>
-      <w:hyperlink r:id="rId32">
+      <w:hyperlink r:id="rId26">
         <w:r>
           <w:rPr>
             <w:rStyle w:val="Hyperlink"/>
@@ -2609,7 +2832,7 @@
       <w:r>
         <w:t xml:space="preserve"> </w:t>
       </w:r>
-      <w:hyperlink r:id="rId39">
+      <w:hyperlink r:id="rId33">
         <w:r>
           <w:rPr>
             <w:rStyle w:val="Hyperlink"/>
@@ -2661,7 +2884,7 @@
       <w:r>
         <w:t xml:space="preserve"> </w:t>
       </w:r>
-      <w:hyperlink r:id="rId49">
+      <w:hyperlink r:id="rId43">
         <w:r>
           <w:rPr>
             <w:rStyle w:val="Hyperlink"/>
@@ -2713,7 +2936,7 @@
       <w:r>
         <w:t xml:space="preserve"> </w:t>
       </w:r>
-      <w:hyperlink r:id="rId50">
+      <w:hyperlink r:id="rId44">
         <w:r>
           <w:rPr>
             <w:rStyle w:val="Hyperlink"/>
@@ -2802,10 +3025,10 @@
       <w:pPr>
         <w:pStyle w:val="FirstParagraph"/>
       </w:pPr>
-      <w:bookmarkStart w:id="51" w:name="FinDocumento"/>
-      <w:bookmarkEnd w:id="51"/>
-    </w:p>
-    <w:bookmarkEnd w:id="52"/>
+      <w:bookmarkStart w:id="45" w:name="FinDocumento"/>
+      <w:bookmarkEnd w:id="45"/>
+    </w:p>
+    <w:bookmarkEnd w:id="46"/>
     <w:sectPr>
       <w:headerReference r:id="rId9" w:type="default"/>
       <w:footerReference r:id="rId10" w:type="default"/>
@@ -2996,7 +3219,7 @@
       </w:r>
     </w:p>
   </w:footnote>
-  <w:footnote w:id="33">
+  <w:footnote w:id="27">
     <w:p>
       <w:pPr>
         <w:pStyle w:val="FootnoteText"/>
@@ -3015,7 +3238,7 @@
       </w:r>
     </w:p>
   </w:footnote>
-  <w:footnote w:id="40">
+  <w:footnote w:id="34">
     <w:p>
       <w:pPr>
         <w:pStyle w:val="FootnoteText"/>
@@ -3034,7 +3257,7 @@
       </w:r>
     </w:p>
   </w:footnote>
-  <w:footnote w:id="41">
+  <w:footnote w:id="35">
     <w:p>
       <w:pPr>
         <w:pStyle w:val="FootnoteText"/>
@@ -3053,7 +3276,7 @@
       </w:r>
     </w:p>
   </w:footnote>
-  <w:footnote w:id="45">
+  <w:footnote w:id="39">
     <w:p>
       <w:pPr>
         <w:pStyle w:val="FootnoteText"/>

</xml_diff>

<commit_message>
feat: implement Quarto automation script and document structure for Actividad 4
</commit_message>
<xml_diff>
--- a/Entregables/Actividad 4/2_Word_Quarto/Actividad 4 - Investigacion Modernizacion Nacion Neuquen.docx
+++ b/Entregables/Actividad 4/2_Word_Quarto/Actividad 4 - Investigacion Modernizacion Nacion Neuquen.docx
@@ -326,7 +326,7 @@
                 <w:color w:val="0E6873"/>
                 <w:sz w:val="18"/>
               </w:rPr>
-              <w:t>ESTUDIANTE / AUTOR:</w:t>
+              <w:t>ESTUDIANTES / AUTORES:</w:t>
             </w:r>
           </w:p>
         </w:tc>
@@ -347,7 +347,7 @@
                 <w:color w:val="153E5C"/>
                 <w:sz w:val="18"/>
               </w:rPr>
-              <w:t>Hector Daniel Ayarachi Fuentes</w:t>
+              <w:t>Hector Daniel Ayarachi Fuentes · Andrea Alejandra Díaz</w:t>
             </w:r>
           </w:p>
         </w:tc>

</xml_diff>

<commit_message>
feat: add Quarto document and Word deliverable for Activity 4 state modernization research
</commit_message>
<xml_diff>
--- a/Entregables/Actividad 4/2_Word_Quarto/Actividad 4 - Investigacion Modernizacion Nacion Neuquen.docx
+++ b/Entregables/Actividad 4/2_Word_Quarto/Actividad 4 - Investigacion Modernizacion Nacion Neuquen.docx
@@ -1011,7 +1011,7 @@
       </w:r>
     </w:p>
     <w:bookmarkEnd w:id="25"/>
-    <w:bookmarkStart w:id="37" w:name="Xa49fc4bd288921ae91dbbf9eb9972d02dab9c0f"/>
+    <w:bookmarkStart w:id="35" w:name="Xa49fc4bd288921ae91dbbf9eb9972d02dab9c0f"/>
     <w:p>
       <w:pPr>
         <w:pStyle w:val="Heading1"/>
@@ -1028,7 +1028,7 @@
         <w:t xml:space="preserve">A partir de los enlaces oficiales provistos en la consigna docente, se procedió a relevar, inspeccionar y categorizar los componentes estructurales, funcionales e informacionales de ambos sitios web.</w:t>
       </w:r>
     </w:p>
-    <w:bookmarkStart w:id="32" w:name="Xa5c82427a9ddb599581c4c3b7cfcf01ab3140fe"/>
+    <w:bookmarkStart w:id="31" w:name="Xa5c82427a9ddb599581c4c3b7cfcf01ab3140fe"/>
     <w:p>
       <w:pPr>
         <w:pStyle w:val="Heading2"/>
@@ -1037,51 +1037,202 @@
         <w:t xml:space="preserve">2.1. Portal Nacional: Observatorio de la Administración Pública (INAP)</w:t>
       </w:r>
     </w:p>
+    <w:tbl xmlns:w="http://schemas.openxmlformats.org/wordprocessingml/2006/main">
+      <w:tblPr>
+        <w:tblW w:w="5000" w:type="pct"/>
+        <w:tblLayout w:type="fixed"/>
+        <w:tblBorders>
+          <w:top w:val="single" w:sz="4" w:space="0" w:color="CBD5E1"/>
+          <w:left w:val="single" w:sz="20" w:space="0" w:color="0E6873"/>
+          <w:bottom w:val="single" w:sz="4" w:space="0" w:color="CBD5E1"/>
+          <w:right w:val="single" w:sz="4" w:space="0" w:color="CBD5E1"/>
+          <w:insideH w:val="single" w:sz="4" w:space="0" w:color="E2E8F0"/>
+          <w:insideV w:val="none"/>
+        </w:tblBorders>
+        <w:tblCellMar>
+          <w:top w:w="100" w:type="dxa"/>
+          <w:left w:w="160" w:type="dxa"/>
+          <w:bottom w:w="100" w:type="dxa"/>
+          <w:right w:w="160" w:type="dxa"/>
+        </w:tblCellMar>
+      </w:tblPr>
+      <w:tblGrid>
+        <w:gridCol w:w="2200"/>
+        <w:gridCol w:w="7160"/>
+      </w:tblGrid>
+      <w:tr>
+        <w:trPr>
+          <w:cantSplit/>
+        </w:trPr>
+        <w:tc>
+          <w:tcPr>
+            <w:tcW w:w="2200" w:type="dxa"/>
+            <w:shd w:val="clear" w:color="auto" w:fill="F2F7F7"/>
+          </w:tcPr>
+          <w:p>
+            <w:pPr>
+              <w:pStyle w:val="Compact"/>
+              <w:jc w:val="left"/>
+              <w:spacing w:before="30" w:after="30"/>
+            </w:pPr>
+            <w:r>
+              <w:rPr>
+                <w:rFonts w:ascii="Arial" w:hAnsi="Arial"/>
+                <w:b/>
+                <w:color w:val="0E6873"/>
+                <w:sz w:val="18"/>
+              </w:rPr>
+              <w:t>Fuente Oficial:</w:t>
+            </w:r>
+          </w:p>
+        </w:tc>
+        <w:tc>
+          <w:tcPr>
+            <w:tcW w:w="7160" w:type="dxa"/>
+            <w:shd w:val="clear" w:color="auto" w:fill="F2F7F7"/>
+          </w:tcPr>
+          <w:p>
+            <w:pPr>
+              <w:pStyle w:val="Compact"/>
+              <w:jc w:val="left"/>
+              <w:spacing w:before="30" w:after="30"/>
+            </w:pPr>
+            <w:r>
+              <w:rPr>
+                <w:rFonts w:ascii="Arial" w:hAnsi="Arial"/>
+                <w:color w:val="2D3748"/>
+                <w:sz w:val="18"/>
+              </w:rPr>
+              <w:t>Ministerio de Desregulación y Transformación del Estado · Instituto Nacional de la Administración Pública (INAP)</w:t>
+            </w:r>
+          </w:p>
+        </w:tc>
+      </w:tr>
+      <w:tr>
+        <w:trPr>
+          <w:cantSplit/>
+        </w:trPr>
+        <w:tc>
+          <w:tcPr>
+            <w:tcW w:w="2200" w:type="dxa"/>
+            <w:shd w:val="clear" w:color="auto" w:fill="F2F7F7"/>
+          </w:tcPr>
+          <w:p>
+            <w:pPr>
+              <w:pStyle w:val="Compact"/>
+              <w:jc w:val="left"/>
+              <w:spacing w:before="30" w:after="30"/>
+            </w:pPr>
+            <w:r>
+              <w:rPr>
+                <w:rFonts w:ascii="Arial" w:hAnsi="Arial"/>
+                <w:b/>
+                <w:color w:val="0E6873"/>
+                <w:sz w:val="18"/>
+              </w:rPr>
+              <w:t>Enlace de acceso:</w:t>
+            </w:r>
+          </w:p>
+        </w:tc>
+        <w:tc>
+          <w:tcPr>
+            <w:tcW w:w="7160" w:type="dxa"/>
+            <w:shd w:val="clear" w:color="auto" w:fill="F2F7F7"/>
+          </w:tcPr>
+          <w:p>
+            <w:pPr>
+              <w:pStyle w:val="Compact"/>
+              <w:jc w:val="left"/>
+              <w:spacing w:before="30" w:after="30"/>
+            </w:pPr>
+            <w:r>
+              <w:rPr>
+                <w:rFonts w:ascii="Arial" w:hAnsi="Arial"/>
+                <w:u w:val="single"/>
+                <w:color w:val="0550AE"/>
+                <w:sz w:val="17"/>
+              </w:rPr>
+              <w:t>https://www.argentina.gob.ar/modernizacion/inap/observatorio/lineas-investigacion/modernizacion-del-estado</w:t>
+            </w:r>
+          </w:p>
+        </w:tc>
+      </w:tr>
+    </w:tbl>
     <w:p>
       <w:pPr>
         <w:pStyle w:val="FirstParagraph"/>
       </w:pPr>
+      <w:r>
+        <w:t xml:space="preserve">El portal nacional analizado corresponde a la sección de</w:t>
+      </w:r>
+      <w:r>
+        <w:t xml:space="preserve"> </w:t>
+      </w:r>
+      <w:r>
+        <w:rPr>
+          <w:b/>
+          <w:bCs/>
+        </w:rPr>
+        <w:t xml:space="preserve">Líneas de Investigación en Modernización del Estado</w:t>
+      </w:r>
+      <w:r>
+        <w:t xml:space="preserve"> </w:t>
+      </w:r>
+      <w:r>
+        <w:t xml:space="preserve">del</w:t>
+      </w:r>
+      <w:r>
+        <w:t xml:space="preserve"> </w:t>
+      </w:r>
       <w:r>
         <w:rPr>
           <w:i/>
           <w:iCs/>
         </w:rPr>
-        <w:t xml:space="preserve">Fuente Oficial:</w:t>
-      </w:r>
-      <w:r>
-        <w:t xml:space="preserve"> </w:t>
-      </w:r>
-      <w:r>
-        <w:t xml:space="preserve">Ministerio de Desregulación y Transformación del Estado · Instituto Nacional de la Administración Pública (INAP)</w:t>
-      </w:r>
-      <w:r>
-        <w:br/>
-      </w:r>
-      <w:r>
-        <w:rPr>
-          <w:i/>
-          <w:iCs/>
-        </w:rPr>
-        <w:t xml:space="preserve">Enlace de acceso:</w:t>
-      </w:r>
-      <w:r>
-        <w:t xml:space="preserve"> </w:t>
-      </w:r>
-      <w:hyperlink r:id="rId26">
-        <w:r>
-          <w:rPr>
-            <w:rStyle w:val="Hyperlink"/>
-          </w:rPr>
-          <w:t xml:space="preserve">https://www.argentina.gob.ar/modernizacion/inap/observatorio/lineas-investigacion/modernizacion-del-estado</w:t>
-        </w:r>
-      </w:hyperlink>
+        <w:t xml:space="preserve">Observatorio de la Administración Pública</w:t>
+      </w:r>
+      <w:r>
+        <w:t xml:space="preserve">, organismo dependiente del Instituto Nacional de la Administración Pública (INAP)</w:t>
+      </w:r>
+      <w:r>
+        <w:rPr>
+          <w:rStyle w:val="FootnoteReference"/>
+        </w:rPr>
+        <w:footnoteReference w:id="26"/>
+      </w:r>
+      <w:r>
+        <w:t xml:space="preserve">, actualmente bajo la órbita de la Secretaría de Transformación del Estado y Función Pública (Ministerio de Desregulación y Transformación del Estado).</w:t>
+      </w:r>
     </w:p>
     <w:p>
       <w:pPr>
         <w:pStyle w:val="BodyText"/>
       </w:pPr>
       <w:r>
-        <w:t xml:space="preserve">El portal nacional analizado corresponde a la sección de</w:t>
+        <w:t xml:space="preserve">A diferencia de un portal transaccional de trámites, este espacio cumple una función eminentemente analítica, conceptual y de monitoreo de políticas públicas. Su propósito medular es brindar una propuesta metodológica de dimensiones e indicadores empíricos que permitan evaluar el avance de la modernización estatal en Argentina. El portal organiza su esquema de trabajo en cuatro dimensiones fundamentales:</w:t>
+      </w:r>
+    </w:p>
+    <w:bookmarkStart w:id="27" w:name="a.-gobierno-digital"/>
+    <w:p>
+      <w:pPr>
+        <w:pStyle w:val="Heading3"/>
+      </w:pPr>
+      <w:r>
+        <w:t xml:space="preserve">A. Gobierno Digital</w:t>
+      </w:r>
+    </w:p>
+    <w:p>
+      <w:pPr>
+        <w:pStyle w:val="FirstParagraph"/>
+      </w:pPr>
+      <w:r>
+        <w:t xml:space="preserve">Enfocado en la capacidad del aparato estatal para operar en entornos digitales integrados:</w:t>
+      </w:r>
+      <w:r>
+        <w:t xml:space="preserve"> </w:t>
+      </w:r>
+      <w:r>
+        <w:t xml:space="preserve">1.</w:t>
       </w:r>
       <w:r>
         <w:t xml:space="preserve"> </w:t>
@@ -1091,52 +1242,67 @@
           <w:b/>
           <w:bCs/>
         </w:rPr>
-        <w:t xml:space="preserve">Líneas de Investigación en Modernización del Estado</w:t>
-      </w:r>
-      <w:r>
-        <w:t xml:space="preserve"> </w:t>
-      </w:r>
-      <w:r>
-        <w:t xml:space="preserve">del</w:t>
-      </w:r>
-      <w:r>
-        <w:t xml:space="preserve"> </w:t>
-      </w:r>
-      <w:r>
-        <w:rPr>
-          <w:i/>
-          <w:iCs/>
-        </w:rPr>
-        <w:t xml:space="preserve">Observatorio de la Administración Pública</w:t>
-      </w:r>
-      <w:r>
-        <w:t xml:space="preserve">, organismo dependiente del Instituto Nacional de la Administración Pública (INAP)</w:t>
-      </w:r>
-      <w:r>
-        <w:rPr>
-          <w:rStyle w:val="FootnoteReference"/>
-        </w:rPr>
-        <w:footnoteReference w:id="27"/>
-      </w:r>
-      <w:r>
-        <w:t xml:space="preserve">, actualmente bajo la órbita de la Secretaría de Transformación del Estado y Función Pública (Ministerio de Desregulación y Transformación del Estado).</w:t>
-      </w:r>
-    </w:p>
-    <w:p>
-      <w:pPr>
-        <w:pStyle w:val="BodyText"/>
-      </w:pPr>
-      <w:r>
-        <w:t xml:space="preserve">A diferencia de un portal transaccional de trámites, este espacio cumple una función eminentemente analítica, conceptual y de monitoreo de políticas públicas. Su propósito medular es brindar una propuesta metodológica de dimensiones e indicadores empíricos que permitan evaluar el avance de la modernización estatal en Argentina. El portal organiza su esquema de trabajo en cuatro dimensiones fundamentales:</w:t>
-      </w:r>
-    </w:p>
-    <w:bookmarkStart w:id="28" w:name="a.-gobierno-digital"/>
+        <w:t xml:space="preserve">Interoperabilidad:</w:t>
+      </w:r>
+      <w:r>
+        <w:t xml:space="preserve"> </w:t>
+      </w:r>
+      <w:r>
+        <w:t xml:space="preserve">Capacidad técnica y normativa para que diferentes organismos compartan información sin redundancias.</w:t>
+      </w:r>
+      <w:r>
+        <w:t xml:space="preserve"> </w:t>
+      </w:r>
+      <w:r>
+        <w:t xml:space="preserve">2.</w:t>
+      </w:r>
+      <w:r>
+        <w:t xml:space="preserve"> </w:t>
+      </w:r>
+      <w:r>
+        <w:rPr>
+          <w:b/>
+          <w:bCs/>
+        </w:rPr>
+        <w:t xml:space="preserve">Coordinación y Cooperación:</w:t>
+      </w:r>
+      <w:r>
+        <w:t xml:space="preserve"> </w:t>
+      </w:r>
+      <w:r>
+        <w:t xml:space="preserve">Redes interministeriales y federales de gestión pública.</w:t>
+      </w:r>
+      <w:r>
+        <w:t xml:space="preserve"> </w:t>
+      </w:r>
+      <w:r>
+        <w:t xml:space="preserve">3.</w:t>
+      </w:r>
+      <w:r>
+        <w:t xml:space="preserve"> </w:t>
+      </w:r>
+      <w:r>
+        <w:rPr>
+          <w:b/>
+          <w:bCs/>
+        </w:rPr>
+        <w:t xml:space="preserve">Diseño Institucional:</w:t>
+      </w:r>
+      <w:r>
+        <w:t xml:space="preserve"> </w:t>
+      </w:r>
+      <w:r>
+        <w:t xml:space="preserve">Mapeo de transacciones, cobertura geográfica y volumen de trámites digitales.</w:t>
+      </w:r>
+    </w:p>
+    <w:bookmarkEnd w:id="27"/>
+    <w:bookmarkStart w:id="28" w:name="b.-país-digital"/>
     <w:p>
       <w:pPr>
         <w:pStyle w:val="Heading3"/>
       </w:pPr>
       <w:r>
-        <w:t xml:space="preserve">A. Gobierno Digital</w:t>
+        <w:t xml:space="preserve">B. País Digital</w:t>
       </w:r>
     </w:p>
     <w:p>
@@ -1144,7 +1310,7 @@
         <w:pStyle w:val="FirstParagraph"/>
       </w:pPr>
       <w:r>
-        <w:t xml:space="preserve">Enfocado en la capacidad del aparato estatal para operar en entornos digitales integrados:</w:t>
+        <w:t xml:space="preserve">Orientado a reducir la brecha digital territorial y garantizar la equidad de acceso:</w:t>
       </w:r>
       <w:r>
         <w:t xml:space="preserve"> </w:t>
@@ -1160,13 +1326,13 @@
           <w:b/>
           <w:bCs/>
         </w:rPr>
-        <w:t xml:space="preserve">Interoperabilidad:</w:t>
-      </w:r>
-      <w:r>
-        <w:t xml:space="preserve"> </w:t>
-      </w:r>
-      <w:r>
-        <w:t xml:space="preserve">Capacidad técnica y normativa para que diferentes organismos compartan información sin redundancias.</w:t>
+        <w:t xml:space="preserve">Cobertura Geográfica:</w:t>
+      </w:r>
+      <w:r>
+        <w:t xml:space="preserve"> </w:t>
+      </w:r>
+      <w:r>
+        <w:t xml:space="preserve">Puntos de acceso Wi-Fi público y tendido de conectividad troncal.</w:t>
       </w:r>
       <w:r>
         <w:t xml:space="preserve"> </w:t>
@@ -1182,13 +1348,13 @@
           <w:b/>
           <w:bCs/>
         </w:rPr>
-        <w:t xml:space="preserve">Coordinación y Cooperación:</w:t>
-      </w:r>
-      <w:r>
-        <w:t xml:space="preserve"> </w:t>
-      </w:r>
-      <w:r>
-        <w:t xml:space="preserve">Redes interministeriales y federales de gestión pública.</w:t>
+        <w:t xml:space="preserve">Equipamiento e Inclusión:</w:t>
+      </w:r>
+      <w:r>
+        <w:t xml:space="preserve"> </w:t>
+      </w:r>
+      <w:r>
+        <w:t xml:space="preserve">Ratios de computadoras y teléfonos móviles por habitante.</w:t>
       </w:r>
       <w:r>
         <w:t xml:space="preserve"> </w:t>
@@ -1204,23 +1370,23 @@
           <w:b/>
           <w:bCs/>
         </w:rPr>
-        <w:t xml:space="preserve">Diseño Institucional:</w:t>
-      </w:r>
-      <w:r>
-        <w:t xml:space="preserve"> </w:t>
-      </w:r>
-      <w:r>
-        <w:t xml:space="preserve">Mapeo de transacciones, cobertura geográfica y volumen de trámites digitales.</w:t>
+        <w:t xml:space="preserve">Nivel de Uso y Digitalización:</w:t>
+      </w:r>
+      <w:r>
+        <w:t xml:space="preserve"> </w:t>
+      </w:r>
+      <w:r>
+        <w:t xml:space="preserve">Apropiación comunitaria de las tecnologías.</w:t>
       </w:r>
     </w:p>
     <w:bookmarkEnd w:id="28"/>
-    <w:bookmarkStart w:id="29" w:name="b.-país-digital"/>
+    <w:bookmarkStart w:id="29" w:name="c.-gobierno-abierto"/>
     <w:p>
       <w:pPr>
         <w:pStyle w:val="Heading3"/>
       </w:pPr>
       <w:r>
-        <w:t xml:space="preserve">B. País Digital</w:t>
+        <w:t xml:space="preserve">C. Gobierno Abierto</w:t>
       </w:r>
     </w:p>
     <w:p>
@@ -1228,7 +1394,7 @@
         <w:pStyle w:val="FirstParagraph"/>
       </w:pPr>
       <w:r>
-        <w:t xml:space="preserve">Orientado a reducir la brecha digital territorial y garantizar la equidad de acceso:</w:t>
+        <w:t xml:space="preserve">Centrado en la democratización del acceso a los asuntos públicos:</w:t>
       </w:r>
       <w:r>
         <w:t xml:space="preserve"> </w:t>
@@ -1244,13 +1410,13 @@
           <w:b/>
           <w:bCs/>
         </w:rPr>
-        <w:t xml:space="preserve">Cobertura Geográfica:</w:t>
-      </w:r>
-      <w:r>
-        <w:t xml:space="preserve"> </w:t>
-      </w:r>
-      <w:r>
-        <w:t xml:space="preserve">Puntos de acceso Wi-Fi público y tendido de conectividad troncal.</w:t>
+        <w:t xml:space="preserve">Relación Estado y Sociedad Civil:</w:t>
+      </w:r>
+      <w:r>
+        <w:t xml:space="preserve"> </w:t>
+      </w:r>
+      <w:r>
+        <w:t xml:space="preserve">Mecanismos de co-creación y participación ciudadana.</w:t>
       </w:r>
       <w:r>
         <w:t xml:space="preserve"> </w:t>
@@ -1266,13 +1432,13 @@
           <w:b/>
           <w:bCs/>
         </w:rPr>
-        <w:t xml:space="preserve">Equipamiento e Inclusión:</w:t>
-      </w:r>
-      <w:r>
-        <w:t xml:space="preserve"> </w:t>
-      </w:r>
-      <w:r>
-        <w:t xml:space="preserve">Ratios de computadoras y teléfonos móviles por habitante.</w:t>
+        <w:t xml:space="preserve">Marcos Normativos:</w:t>
+      </w:r>
+      <w:r>
+        <w:t xml:space="preserve"> </w:t>
+      </w:r>
+      <w:r>
+        <w:t xml:space="preserve">Cumplimiento de la Carta Iberoamericana de Gobierno Abierto.</w:t>
       </w:r>
       <w:r>
         <w:t xml:space="preserve"> </w:t>
@@ -1288,23 +1454,23 @@
           <w:b/>
           <w:bCs/>
         </w:rPr>
-        <w:t xml:space="preserve">Nivel de Uso y Digitalización:</w:t>
-      </w:r>
-      <w:r>
-        <w:t xml:space="preserve"> </w:t>
-      </w:r>
-      <w:r>
-        <w:t xml:space="preserve">Apropiación comunitaria de las tecnologías.</w:t>
+        <w:t xml:space="preserve">Compromisos Internacionales:</w:t>
+      </w:r>
+      <w:r>
+        <w:t xml:space="preserve"> </w:t>
+      </w:r>
+      <w:r>
+        <w:t xml:space="preserve">Alianza para el Gobierno Abierto (OGP) y estándares de la OCDE.</w:t>
       </w:r>
     </w:p>
     <w:bookmarkEnd w:id="29"/>
-    <w:bookmarkStart w:id="30" w:name="c.-gobierno-abierto"/>
+    <w:bookmarkStart w:id="30" w:name="d.-modernización-administrativa"/>
     <w:p>
       <w:pPr>
         <w:pStyle w:val="Heading3"/>
       </w:pPr>
       <w:r>
-        <w:t xml:space="preserve">C. Gobierno Abierto</w:t>
+        <w:t xml:space="preserve">D. Modernización Administrativa</w:t>
       </w:r>
     </w:p>
     <w:p>
@@ -1312,7 +1478,7 @@
         <w:pStyle w:val="FirstParagraph"/>
       </w:pPr>
       <w:r>
-        <w:t xml:space="preserve">Centrado en la democratización del acceso a los asuntos públicos:</w:t>
+        <w:t xml:space="preserve">Dirigido a la reingeniería interna y la eficiencia procedimental:</w:t>
       </w:r>
       <w:r>
         <w:t xml:space="preserve"> </w:t>
@@ -1328,13 +1494,13 @@
           <w:b/>
           <w:bCs/>
         </w:rPr>
-        <w:t xml:space="preserve">Relación Estado y Sociedad Civil:</w:t>
-      </w:r>
-      <w:r>
-        <w:t xml:space="preserve"> </w:t>
-      </w:r>
-      <w:r>
-        <w:t xml:space="preserve">Mecanismos de co-creación y participación ciudadana.</w:t>
+        <w:t xml:space="preserve">Gestión Documental Electrónica (GDE):</w:t>
+      </w:r>
+      <w:r>
+        <w:t xml:space="preserve"> </w:t>
+      </w:r>
+      <w:r>
+        <w:t xml:space="preserve">Despapelización de expedientes y actos administrativos.</w:t>
       </w:r>
       <w:r>
         <w:t xml:space="preserve"> </w:t>
@@ -1350,13 +1516,13 @@
           <w:b/>
           <w:bCs/>
         </w:rPr>
-        <w:t xml:space="preserve">Marcos Normativos:</w:t>
-      </w:r>
-      <w:r>
-        <w:t xml:space="preserve"> </w:t>
-      </w:r>
-      <w:r>
-        <w:t xml:space="preserve">Cumplimiento de la Carta Iberoamericana de Gobierno Abierto.</w:t>
+        <w:t xml:space="preserve">Trazabilidad Documental:</w:t>
+      </w:r>
+      <w:r>
+        <w:t xml:space="preserve"> </w:t>
+      </w:r>
+      <w:r>
+        <w:t xml:space="preserve">Métricas sobre cantidad de documentos y firmas electrónicas.</w:t>
       </w:r>
       <w:r>
         <w:t xml:space="preserve"> </w:t>
@@ -1372,152 +1538,150 @@
           <w:b/>
           <w:bCs/>
         </w:rPr>
-        <w:t xml:space="preserve">Compromisos Internacionales:</w:t>
-      </w:r>
-      <w:r>
-        <w:t xml:space="preserve"> </w:t>
-      </w:r>
-      <w:r>
-        <w:t xml:space="preserve">Alianza para el Gobierno Abierto (OGP) y estándares de la OCDE.</w:t>
+        <w:t xml:space="preserve">Tiempos de Resolución:</w:t>
+      </w:r>
+      <w:r>
+        <w:t xml:space="preserve"> </w:t>
+      </w:r>
+      <w:r>
+        <w:t xml:space="preserve">Reducción de plazos en expedientes y simplificación regulatoria.</w:t>
       </w:r>
     </w:p>
     <w:bookmarkEnd w:id="30"/>
-    <w:bookmarkStart w:id="31" w:name="d.-modernización-administrativa"/>
-    <w:p>
-      <w:pPr>
-        <w:pStyle w:val="Heading3"/>
-      </w:pPr>
-      <w:r>
-        <w:t xml:space="preserve">D. Modernización Administrativa</w:t>
-      </w:r>
-    </w:p>
+    <w:bookmarkEnd w:id="31"/>
+    <w:bookmarkStart w:id="34" w:name="X013c73fae7f3aa0602c2e491ca5006f1744f568"/>
+    <w:p>
+      <w:pPr>
+        <w:pStyle w:val="Heading2"/>
+      </w:pPr>
+      <w:r>
+        <w:t xml:space="preserve">2.2. Portal Subnacional: Secretaría de Modernización (Ciudad de Neuquén)</w:t>
+      </w:r>
+    </w:p>
+    <w:tbl xmlns:w="http://schemas.openxmlformats.org/wordprocessingml/2006/main">
+      <w:tblPr>
+        <w:tblW w:w="5000" w:type="pct"/>
+        <w:tblLayout w:type="fixed"/>
+        <w:tblBorders>
+          <w:top w:val="single" w:sz="4" w:space="0" w:color="CBD5E1"/>
+          <w:left w:val="single" w:sz="20" w:space="0" w:color="0E6873"/>
+          <w:bottom w:val="single" w:sz="4" w:space="0" w:color="CBD5E1"/>
+          <w:right w:val="single" w:sz="4" w:space="0" w:color="CBD5E1"/>
+          <w:insideH w:val="single" w:sz="4" w:space="0" w:color="E2E8F0"/>
+          <w:insideV w:val="none"/>
+        </w:tblBorders>
+        <w:tblCellMar>
+          <w:top w:w="100" w:type="dxa"/>
+          <w:left w:w="160" w:type="dxa"/>
+          <w:bottom w:w="100" w:type="dxa"/>
+          <w:right w:w="160" w:type="dxa"/>
+        </w:tblCellMar>
+      </w:tblPr>
+      <w:tblGrid>
+        <w:gridCol w:w="2200"/>
+        <w:gridCol w:w="7160"/>
+      </w:tblGrid>
+      <w:tr>
+        <w:trPr>
+          <w:cantSplit/>
+        </w:trPr>
+        <w:tc>
+          <w:tcPr>
+            <w:tcW w:w="2200" w:type="dxa"/>
+            <w:shd w:val="clear" w:color="auto" w:fill="F2F7F7"/>
+          </w:tcPr>
+          <w:p>
+            <w:pPr>
+              <w:pStyle w:val="Compact"/>
+              <w:jc w:val="left"/>
+              <w:spacing w:before="30" w:after="30"/>
+            </w:pPr>
+            <w:r>
+              <w:rPr>
+                <w:rFonts w:ascii="Arial" w:hAnsi="Arial"/>
+                <w:b/>
+                <w:color w:val="0E6873"/>
+                <w:sz w:val="18"/>
+              </w:rPr>
+              <w:t>Fuente Oficial:</w:t>
+            </w:r>
+          </w:p>
+        </w:tc>
+        <w:tc>
+          <w:tcPr>
+            <w:tcW w:w="7160" w:type="dxa"/>
+            <w:shd w:val="clear" w:color="auto" w:fill="F2F7F7"/>
+          </w:tcPr>
+          <w:p>
+            <w:pPr>
+              <w:pStyle w:val="Compact"/>
+              <w:jc w:val="left"/>
+              <w:spacing w:before="30" w:after="30"/>
+            </w:pPr>
+            <w:r>
+              <w:rPr>
+                <w:rFonts w:ascii="Arial" w:hAnsi="Arial"/>
+                <w:color w:val="2D3748"/>
+                <w:sz w:val="18"/>
+              </w:rPr>
+              <w:t>Municipalidad de Neuquén Capital · Secretaría de Modernización</w:t>
+            </w:r>
+          </w:p>
+        </w:tc>
+      </w:tr>
+      <w:tr>
+        <w:trPr>
+          <w:cantSplit/>
+        </w:trPr>
+        <w:tc>
+          <w:tcPr>
+            <w:tcW w:w="2200" w:type="dxa"/>
+            <w:shd w:val="clear" w:color="auto" w:fill="F2F7F7"/>
+          </w:tcPr>
+          <w:p>
+            <w:pPr>
+              <w:pStyle w:val="Compact"/>
+              <w:jc w:val="left"/>
+              <w:spacing w:before="30" w:after="30"/>
+            </w:pPr>
+            <w:r>
+              <w:rPr>
+                <w:rFonts w:ascii="Arial" w:hAnsi="Arial"/>
+                <w:b/>
+                <w:color w:val="0E6873"/>
+                <w:sz w:val="18"/>
+              </w:rPr>
+              <w:t>Enlace de acceso:</w:t>
+            </w:r>
+          </w:p>
+        </w:tc>
+        <w:tc>
+          <w:tcPr>
+            <w:tcW w:w="7160" w:type="dxa"/>
+            <w:shd w:val="clear" w:color="auto" w:fill="F2F7F7"/>
+          </w:tcPr>
+          <w:p>
+            <w:pPr>
+              <w:pStyle w:val="Compact"/>
+              <w:jc w:val="left"/>
+              <w:spacing w:before="30" w:after="30"/>
+            </w:pPr>
+            <w:r>
+              <w:rPr>
+                <w:rFonts w:ascii="Arial" w:hAnsi="Arial"/>
+                <w:u w:val="single"/>
+                <w:color w:val="0550AE"/>
+                <w:sz w:val="17"/>
+              </w:rPr>
+              <w:t>https://www.neuquencapital.gov.ar/secretaria-de-modernizacion/</w:t>
+            </w:r>
+          </w:p>
+        </w:tc>
+      </w:tr>
+    </w:tbl>
     <w:p>
       <w:pPr>
         <w:pStyle w:val="FirstParagraph"/>
-      </w:pPr>
-      <w:r>
-        <w:t xml:space="preserve">Dirigido a la reingeniería interna y la eficiencia procedimental:</w:t>
-      </w:r>
-      <w:r>
-        <w:t xml:space="preserve"> </w:t>
-      </w:r>
-      <w:r>
-        <w:t xml:space="preserve">1.</w:t>
-      </w:r>
-      <w:r>
-        <w:t xml:space="preserve"> </w:t>
-      </w:r>
-      <w:r>
-        <w:rPr>
-          <w:b/>
-          <w:bCs/>
-        </w:rPr>
-        <w:t xml:space="preserve">Gestión Documental Electrónica (GDE):</w:t>
-      </w:r>
-      <w:r>
-        <w:t xml:space="preserve"> </w:t>
-      </w:r>
-      <w:r>
-        <w:t xml:space="preserve">Despapelización de expedientes y actos administrativos.</w:t>
-      </w:r>
-      <w:r>
-        <w:t xml:space="preserve"> </w:t>
-      </w:r>
-      <w:r>
-        <w:t xml:space="preserve">2.</w:t>
-      </w:r>
-      <w:r>
-        <w:t xml:space="preserve"> </w:t>
-      </w:r>
-      <w:r>
-        <w:rPr>
-          <w:b/>
-          <w:bCs/>
-        </w:rPr>
-        <w:t xml:space="preserve">Trazabilidad Documental:</w:t>
-      </w:r>
-      <w:r>
-        <w:t xml:space="preserve"> </w:t>
-      </w:r>
-      <w:r>
-        <w:t xml:space="preserve">Métricas sobre cantidad de documentos y firmas electrónicas.</w:t>
-      </w:r>
-      <w:r>
-        <w:t xml:space="preserve"> </w:t>
-      </w:r>
-      <w:r>
-        <w:t xml:space="preserve">3.</w:t>
-      </w:r>
-      <w:r>
-        <w:t xml:space="preserve"> </w:t>
-      </w:r>
-      <w:r>
-        <w:rPr>
-          <w:b/>
-          <w:bCs/>
-        </w:rPr>
-        <w:t xml:space="preserve">Tiempos de Resolución:</w:t>
-      </w:r>
-      <w:r>
-        <w:t xml:space="preserve"> </w:t>
-      </w:r>
-      <w:r>
-        <w:t xml:space="preserve">Reducción de plazos en expedientes y simplificación regulatoria.</w:t>
-      </w:r>
-    </w:p>
-    <w:bookmarkEnd w:id="31"/>
-    <w:bookmarkEnd w:id="32"/>
-    <w:bookmarkStart w:id="36" w:name="X013c73fae7f3aa0602c2e491ca5006f1744f568"/>
-    <w:p>
-      <w:pPr>
-        <w:pStyle w:val="Heading2"/>
-      </w:pPr>
-      <w:r>
-        <w:t xml:space="preserve">2.2. Portal Subnacional: Secretaría de Modernización (Ciudad de Neuquén)</w:t>
-      </w:r>
-    </w:p>
-    <w:p>
-      <w:pPr>
-        <w:pStyle w:val="FirstParagraph"/>
-      </w:pPr>
-      <w:r>
-        <w:rPr>
-          <w:i/>
-          <w:iCs/>
-        </w:rPr>
-        <w:t xml:space="preserve">Fuente Oficial:</w:t>
-      </w:r>
-      <w:r>
-        <w:t xml:space="preserve"> </w:t>
-      </w:r>
-      <w:r>
-        <w:t xml:space="preserve">Municipalidad de Neuquén Capital · Secretaría de Modernización</w:t>
-      </w:r>
-      <w:r>
-        <w:br/>
-      </w:r>
-      <w:r>
-        <w:rPr>
-          <w:i/>
-          <w:iCs/>
-        </w:rPr>
-        <w:t xml:space="preserve">Enlace de acceso:</w:t>
-      </w:r>
-      <w:r>
-        <w:t xml:space="preserve"> </w:t>
-      </w:r>
-      <w:hyperlink r:id="rId33">
-        <w:r>
-          <w:rPr>
-            <w:rStyle w:val="Hyperlink"/>
-          </w:rPr>
-          <w:t xml:space="preserve">https://www.neuquencapital.gov.ar/secretaria-de-modernizacion/</w:t>
-        </w:r>
-      </w:hyperlink>
-    </w:p>
-    <w:p>
-      <w:pPr>
-        <w:pStyle w:val="BodyText"/>
       </w:pPr>
       <w:r>
         <w:t xml:space="preserve">El portal analizado corresponde al área ejecutiva de modernización de la Municipalidad de Neuquén Capital, encabezada por el Secretario Lic. Javier Labrín. A diferencia de la página nacional de investigación del INAP, este portal posee una arquitectura orientada a la</w:t>
@@ -1699,7 +1863,7 @@
         <w:rPr>
           <w:rStyle w:val="FootnoteReference"/>
         </w:rPr>
-        <w:footnoteReference w:id="34"/>
+        <w:footnoteReference w:id="32"/>
       </w:r>
       <w:r>
         <w:t xml:space="preserve"> </w:t>
@@ -1765,7 +1929,7 @@
         <w:rPr>
           <w:rStyle w:val="FootnoteReference"/>
         </w:rPr>
-        <w:footnoteReference w:id="35"/>
+        <w:footnoteReference w:id="33"/>
       </w:r>
       <w:r>
         <w:t xml:space="preserve">, concebido como motor de articulación público-privada para la industria del conocimiento.</w:t>
@@ -1793,9 +1957,9 @@
         <w:t xml:space="preserve">Acceso directo al Boletín Oficial Municipal digital y al Digesto de ordenanzas municipales, facilitando la auditoría ciudadana.</w:t>
       </w:r>
     </w:p>
-    <w:bookmarkEnd w:id="36"/>
-    <w:bookmarkEnd w:id="37"/>
-    <w:bookmarkStart w:id="41" w:name="X4fb8b93d7239b0f402b4ecf260f9e41569f533d"/>
+    <w:bookmarkEnd w:id="34"/>
+    <w:bookmarkEnd w:id="35"/>
+    <w:bookmarkStart w:id="39" w:name="X4fb8b93d7239b0f402b4ecf260f9e41569f533d"/>
     <w:p>
       <w:pPr>
         <w:pStyle w:val="Heading1"/>
@@ -2422,7 +2586,7 @@
         </w:tc>
       </w:tr>
     </w:tbl>
-    <w:bookmarkStart w:id="38" w:name="convergencias-y-puntos-de-encuentro"/>
+    <w:bookmarkStart w:id="36" w:name="convergencias-y-puntos-de-encuentro"/>
     <w:p>
       <w:pPr>
         <w:pStyle w:val="Heading2"/>
@@ -2520,95 +2684,95 @@
         <w:t xml:space="preserve">para vincular catastro, zonificación y obras con geolocalización de precisión.</w:t>
       </w:r>
     </w:p>
+    <w:bookmarkEnd w:id="36"/>
+    <w:bookmarkStart w:id="38" w:name="Xbf2b7c3d798361941f720ca12d11dd982c6d6a4"/>
+    <w:p>
+      <w:pPr>
+        <w:pStyle w:val="Heading2"/>
+      </w:pPr>
+      <w:r>
+        <w:t xml:space="preserve">3.2. Asimetrías y Desafíos de Integración Federal</w:t>
+      </w:r>
+    </w:p>
+    <w:p>
+      <w:pPr>
+        <w:pStyle w:val="FirstParagraph"/>
+      </w:pPr>
+      <w:r>
+        <w:t xml:space="preserve">El análisis comparativo también devela tensiones y asimetrías estructurales:</w:t>
+      </w:r>
+      <w:r>
+        <w:t xml:space="preserve"> </w:t>
+      </w:r>
+      <w:r>
+        <w:t xml:space="preserve">-</w:t>
+      </w:r>
+      <w:r>
+        <w:t xml:space="preserve"> </w:t>
+      </w:r>
+      <w:r>
+        <w:rPr>
+          <w:b/>
+          <w:bCs/>
+        </w:rPr>
+        <w:t xml:space="preserve">Desconexión entre Marcos Conceptuales y Aplicación Práctica:</w:t>
+      </w:r>
+      <w:r>
+        <w:t xml:space="preserve"> </w:t>
+      </w:r>
+      <w:r>
+        <w:t xml:space="preserve">Mientras el portal del INAP presenta una taxonomía refinada de indicadores, los municipios frecuentemente operan bajo urgencias presupuestarias que dificultan la medición científica de sus tiempos de respuesta.</w:t>
+      </w:r>
+      <w:r>
+        <w:t xml:space="preserve"> </w:t>
+      </w:r>
+      <w:r>
+        <w:t xml:space="preserve">-</w:t>
+      </w:r>
+      <w:r>
+        <w:t xml:space="preserve"> </w:t>
+      </w:r>
+      <w:r>
+        <w:rPr>
+          <w:b/>
+          <w:bCs/>
+        </w:rPr>
+        <w:t xml:space="preserve">Interoperabilidad Federal-Municipal Incompleta:</w:t>
+      </w:r>
+      <w:r>
+        <w:rPr>
+          <w:rStyle w:val="FootnoteReference"/>
+        </w:rPr>
+        <w:footnoteReference w:id="37"/>
+      </w:r>
+      <w:r>
+        <w:t xml:space="preserve"> </w:t>
+      </w:r>
+      <w:r>
+        <w:t xml:space="preserve">Con frecuencia, los sistemas locales (</w:t>
+      </w:r>
+      <w:r>
+        <w:rPr>
+          <w:rStyle w:val="VerbatimChar"/>
+        </w:rPr>
+        <w:t xml:space="preserve">WebLogin Neuquén</w:t>
+      </w:r>
+      <w:r>
+        <w:t xml:space="preserve">) y los sistemas nacionales (</w:t>
+      </w:r>
+      <w:r>
+        <w:rPr>
+          <w:rStyle w:val="VerbatimChar"/>
+        </w:rPr>
+        <w:t xml:space="preserve">Mi Argentina</w:t>
+      </w:r>
+      <w:r>
+        <w:t xml:space="preserve">, Registro Nacional de las Personas - RENAPER, Agencia Nacional de Seguridad Vial) requieren procesos de doble carga o validaciones manuales debido a la falta de APIs gubernamentales unificadas y acuerdos federales estables.</w:t>
+      </w:r>
+    </w:p>
     <w:bookmarkEnd w:id="38"/>
-    <w:bookmarkStart w:id="40" w:name="Xbf2b7c3d798361941f720ca12d11dd982c6d6a4"/>
-    <w:p>
-      <w:pPr>
-        <w:pStyle w:val="Heading2"/>
-      </w:pPr>
-      <w:r>
-        <w:t xml:space="preserve">3.2. Asimetrías y Desafíos de Integración Federal</w:t>
-      </w:r>
-    </w:p>
-    <w:p>
-      <w:pPr>
-        <w:pStyle w:val="FirstParagraph"/>
-      </w:pPr>
-      <w:r>
-        <w:t xml:space="preserve">El análisis comparativo también devela tensiones y asimetrías estructurales:</w:t>
-      </w:r>
-      <w:r>
-        <w:t xml:space="preserve"> </w:t>
-      </w:r>
-      <w:r>
-        <w:t xml:space="preserve">-</w:t>
-      </w:r>
-      <w:r>
-        <w:t xml:space="preserve"> </w:t>
-      </w:r>
-      <w:r>
-        <w:rPr>
-          <w:b/>
-          <w:bCs/>
-        </w:rPr>
-        <w:t xml:space="preserve">Desconexión entre Marcos Conceptuales y Aplicación Práctica:</w:t>
-      </w:r>
-      <w:r>
-        <w:t xml:space="preserve"> </w:t>
-      </w:r>
-      <w:r>
-        <w:t xml:space="preserve">Mientras el portal del INAP presenta una taxonomía refinada de indicadores, los municipios frecuentemente operan bajo urgencias presupuestarias que dificultan la medición científica de sus tiempos de respuesta.</w:t>
-      </w:r>
-      <w:r>
-        <w:t xml:space="preserve"> </w:t>
-      </w:r>
-      <w:r>
-        <w:t xml:space="preserve">-</w:t>
-      </w:r>
-      <w:r>
-        <w:t xml:space="preserve"> </w:t>
-      </w:r>
-      <w:r>
-        <w:rPr>
-          <w:b/>
-          <w:bCs/>
-        </w:rPr>
-        <w:t xml:space="preserve">Interoperabilidad Federal-Municipal Incompleta:</w:t>
-      </w:r>
-      <w:r>
-        <w:rPr>
-          <w:rStyle w:val="FootnoteReference"/>
-        </w:rPr>
-        <w:footnoteReference w:id="39"/>
-      </w:r>
-      <w:r>
-        <w:t xml:space="preserve"> </w:t>
-      </w:r>
-      <w:r>
-        <w:t xml:space="preserve">Con frecuencia, los sistemas locales (</w:t>
-      </w:r>
-      <w:r>
-        <w:rPr>
-          <w:rStyle w:val="VerbatimChar"/>
-        </w:rPr>
-        <w:t xml:space="preserve">WebLogin Neuquén</w:t>
-      </w:r>
-      <w:r>
-        <w:t xml:space="preserve">) y los sistemas nacionales (</w:t>
-      </w:r>
-      <w:r>
-        <w:rPr>
-          <w:rStyle w:val="VerbatimChar"/>
-        </w:rPr>
-        <w:t xml:space="preserve">Mi Argentina</w:t>
-      </w:r>
-      <w:r>
-        <w:t xml:space="preserve">, Registro Nacional de las Personas - RENAPER, Agencia Nacional de Seguridad Vial) requieren procesos de doble carga o validaciones manuales debido a la falta de APIs gubernamentales unificadas y acuerdos federales estables.</w:t>
-      </w:r>
-    </w:p>
-    <w:bookmarkEnd w:id="40"/>
-    <w:bookmarkEnd w:id="41"/>
-    <w:bookmarkStart w:id="42" w:name="Xce0272aac5929939a39680cf30301902fb7015f"/>
+    <w:bookmarkEnd w:id="39"/>
+    <w:bookmarkStart w:id="40" w:name="Xce0272aac5929939a39680cf30301902fb7015f"/>
     <w:p>
       <w:pPr>
         <w:pStyle w:val="Heading1"/>
@@ -2733,7 +2897,7 @@
         <w:br w:type="page"/>
       </w:r>
     </w:p>
-    <w:bookmarkEnd w:id="42"/>
+    <w:bookmarkEnd w:id="40"/>
     <w:bookmarkStart w:id="46" w:name="Xec850b3d016b3f0d7255de5b4756a8e2ad7a98d"/>
     <w:p>
       <w:pPr>
@@ -2780,7 +2944,7 @@
       <w:r>
         <w:t xml:space="preserve"> </w:t>
       </w:r>
-      <w:hyperlink r:id="rId26">
+      <w:hyperlink r:id="rId41">
         <w:r>
           <w:rPr>
             <w:rStyle w:val="Hyperlink"/>
@@ -2832,7 +2996,7 @@
       <w:r>
         <w:t xml:space="preserve"> </w:t>
       </w:r>
-      <w:hyperlink r:id="rId33">
+      <w:hyperlink r:id="rId42">
         <w:r>
           <w:rPr>
             <w:rStyle w:val="Hyperlink"/>
@@ -3219,7 +3383,7 @@
       </w:r>
     </w:p>
   </w:footnote>
-  <w:footnote w:id="27">
+  <w:footnote w:id="26">
     <w:p>
       <w:pPr>
         <w:pStyle w:val="FootnoteText"/>
@@ -3238,7 +3402,7 @@
       </w:r>
     </w:p>
   </w:footnote>
-  <w:footnote w:id="34">
+  <w:footnote w:id="32">
     <w:p>
       <w:pPr>
         <w:pStyle w:val="FootnoteText"/>
@@ -3257,7 +3421,7 @@
       </w:r>
     </w:p>
   </w:footnote>
-  <w:footnote w:id="35">
+  <w:footnote w:id="33">
     <w:p>
       <w:pPr>
         <w:pStyle w:val="FootnoteText"/>
@@ -3276,7 +3440,7 @@
       </w:r>
     </w:p>
   </w:footnote>
-  <w:footnote w:id="39">
+  <w:footnote w:id="37">
     <w:p>
       <w:pPr>
         <w:pStyle w:val="FootnoteText"/>

</xml_diff>

<commit_message>
feat: add academic template and research document for Activity 4
</commit_message>
<xml_diff>
--- a/Entregables/Actividad 4/2_Word_Quarto/Actividad 4 - Investigacion Modernizacion Nacion Neuquen.docx
+++ b/Entregables/Actividad 4/2_Word_Quarto/Actividad 4 - Investigacion Modernizacion Nacion Neuquen.docx
@@ -3214,7 +3214,7 @@
 </file>
 
 <file path=word/footer1.xml><?xml version="1.0" encoding="utf-8"?>
-<w:ftr xmlns:m="http://schemas.openxmlformats.org/officeDocument/2006/math" xmlns:mc="http://schemas.openxmlformats.org/markup-compatibility/2006" xmlns:mo="http://schemas.microsoft.com/office/mac/office/2008/main" xmlns:mv="urn:schemas-microsoft-com:mac:vml" xmlns:o="urn:schemas-microsoft-com:office:office" xmlns:r="http://schemas.openxmlformats.org/officeDocument/2006/relationships" xmlns:v="urn:schemas-microsoft-com:vml" xmlns:w10="urn:schemas-microsoft-com:office:word" xmlns:w14="http://schemas.microsoft.com/office/word/2010/wordml" xmlns:w="http://schemas.openxmlformats.org/wordprocessingml/2006/main" xmlns:wne="http://schemas.microsoft.com/office/word/2006/wordml" xmlns:wp14="http://schemas.microsoft.com/office/word/2010/wordprocessingDrawing" xmlns:wp="http://schemas.openxmlformats.org/drawingml/2006/wordprocessingDrawing" xmlns:wpc="http://schemas.microsoft.com/office/word/2010/wordprocessingCanvas" xmlns:wpg="http://schemas.microsoft.com/office/word/2010/wordprocessingGroup" xmlns:wpi="http://schemas.microsoft.com/office/word/2010/wordprocessingInk" xmlns:wps="http://schemas.microsoft.com/office/word/2010/wordprocessingShape" mc:Ignorable="w14 wp14">
+<w:ftr xmlns:ns1="http://schemas.openxmlformats.org/markup-compatibility/2006" xmlns:ns2="http://schemas.openxmlformats.org/drawingml/2006/wordprocessingDrawing" xmlns:ns3="http://schemas.openxmlformats.org/drawingml/2006/main" xmlns:ns4="http://schemas.openxmlformats.org/drawingml/2006/picture" xmlns:ns5="http://schemas.openxmlformats.org/officeDocument/2006/relationships" xmlns:w="http://schemas.openxmlformats.org/wordprocessingml/2006/main" ns1:Ignorable="w14 wp14">
   <w:tbl>
     <w:tblPr>
       <w:tblW w:w="9360" w:type="dxa"/>
@@ -3270,36 +3270,36 @@
           </w:pPr>
           <w:r>
             <w:drawing>
-              <wp:inline xmlns:a="http://schemas.openxmlformats.org/drawingml/2006/main" xmlns:pic="http://schemas.openxmlformats.org/drawingml/2006/picture">
-                <wp:extent cx="130744" cy="133350"/>
-                <wp:docPr id="1" name="Picture 1"/>
-                <wp:cNvGraphicFramePr>
-                  <a:graphicFrameLocks noChangeAspect="1"/>
-                </wp:cNvGraphicFramePr>
-                <a:graphic>
-                  <a:graphicData uri="http://schemas.openxmlformats.org/drawingml/2006/picture">
-                    <pic:pic>
-                      <pic:nvPicPr>
-                        <pic:cNvPr id="0" name="image.png"/>
-                        <pic:cNvPicPr/>
-                      </pic:nvPicPr>
-                      <pic:blipFill>
-                        <a:blip r:embed="rId1"/>
-                        <a:stretch>
-                          <a:fillRect/>
-                        </a:stretch>
-                      </pic:blipFill>
-                      <pic:spPr>
-                        <a:xfrm>
-                          <a:off x="0" y="0"/>
-                          <a:ext cx="130744" cy="133350"/>
-                        </a:xfrm>
-                        <a:prstGeom prst="rect"/>
-                      </pic:spPr>
-                    </pic:pic>
-                  </a:graphicData>
-                </a:graphic>
-              </wp:inline>
+              <ns2:inline>
+                <ns2:extent cx="130744" cy="133350"/>
+                <ns2:docPr id="1" name="Picture 1"/>
+                <ns2:cNvGraphicFramePr>
+                  <ns3:graphicFrameLocks noChangeAspect="1"/>
+                </ns2:cNvGraphicFramePr>
+                <ns3:graphic>
+                  <ns3:graphicData uri="http://schemas.openxmlformats.org/drawingml/2006/picture">
+                    <ns4:pic>
+                      <ns4:nvPicPr>
+                        <ns4:cNvPr id="0" name="image.png"/>
+                        <ns4:cNvPicPr/>
+                      </ns4:nvPicPr>
+                      <ns4:blipFill>
+                        <ns3:blip ns5:embed="rId1"/>
+                        <ns3:stretch>
+                          <ns3:fillRect/>
+                        </ns3:stretch>
+                      </ns4:blipFill>
+                      <ns4:spPr>
+                        <ns3:xfrm>
+                          <ns3:off x="0" y="0"/>
+                          <ns3:ext cx="130744" cy="133350"/>
+                        </ns3:xfrm>
+                        <ns3:prstGeom prst="rect"/>
+                      </ns4:spPr>
+                    </ns4:pic>
+                  </ns3:graphicData>
+                </ns3:graphic>
+              </ns2:inline>
             </w:drawing>
           </w:r>
         </w:p>
@@ -3329,24 +3329,6 @@
                 <w:sz w:val="17"/>
               </w:rPr>
               <w:t>1</w:t>
-            </w:r>
-          </w:fldSimple>
-          <w:r>
-            <w:rPr>
-              <w:rFonts w:ascii="Arial" w:hAnsi="Arial"/>
-              <w:color w:val="718096"/>
-              <w:sz w:val="17"/>
-            </w:rPr>
-            <w:t xml:space="preserve"> de </w:t>
-          </w:r>
-          <w:fldSimple w:instr="PAGEREF FinDocumento \h">
-            <w:r>
-              <w:rPr>
-                <w:rFonts w:ascii="Arial" w:hAnsi="Arial"/>
-                <w:color w:val="718096"/>
-                <w:sz w:val="17"/>
-              </w:rPr>
-              <w:t>8</w:t>
             </w:r>
           </w:fldSimple>
         </w:p>

</xml_diff>